<commit_message>
feat(ai): intelligent diagram generation and security RAG analyzer
</commit_message>
<xml_diff>
--- a/Code/backend/templates/phieu_khao_sat_template.docx
+++ b/Code/backend/templates/phieu_khao_sat_template.docx
@@ -5637,6 +5637,11 @@
             <w:shd w:val="clear" w:color="auto" w:fill="F1F5F9"/>
           </w:tcPr>
           <w:p>
+            <w:r>
+              <w:t>{% tr for d in D1_duong_truyen %}</w:t>
+            </w:r>
+          </w:p>
+          <w:p>
             <w:pPr>
               <w:jc w:val="center"/>
               <w:rPr>
@@ -5881,6 +5886,11 @@
                 <w:szCs w:val="24"/>
               </w:rPr>
             </w:pPr>
+          </w:p>
+          <w:p>
+            <w:r>
+              <w:t>{% tr endfor %}</w:t>
+            </w:r>
           </w:p>
         </w:tc>
       </w:tr>
@@ -6937,6 +6947,11 @@
             <w:shd w:val="clear" w:color="auto" w:fill="F1F5F9"/>
           </w:tcPr>
           <w:p>
+            <w:r>
+              <w:t>{% tr for d in thiet_bi_mang %}</w:t>
+            </w:r>
+          </w:p>
+          <w:p>
             <w:pPr>
               <w:jc w:val="center"/>
               <w:rPr>
@@ -7100,6 +7115,11 @@
                 <w:szCs w:val="24"/>
               </w:rPr>
             </w:pPr>
+          </w:p>
+          <w:p>
+            <w:r>
+              <w:t>{% tr endfor %}</w:t>
+            </w:r>
           </w:p>
         </w:tc>
       </w:tr>
@@ -8704,6 +8724,11 @@
             <w:shd w:val="clear" w:color="auto" w:fill="F1F5F9"/>
           </w:tcPr>
           <w:p>
+            <w:r>
+              <w:t>{% tr for d in thiet_bi_mang %}</w:t>
+            </w:r>
+          </w:p>
+          <w:p>
             <w:pPr>
               <w:jc w:val="center"/>
               <w:rPr>
@@ -8820,6 +8845,11 @@
                 <w:szCs w:val="24"/>
               </w:rPr>
             </w:pPr>
+          </w:p>
+          <w:p>
+            <w:r>
+              <w:t>{% tr endfor %}</w:t>
+            </w:r>
           </w:p>
         </w:tc>
       </w:tr>
@@ -10963,6 +10993,11 @@
             <w:shd w:val="clear" w:color="auto" w:fill="F1F5F9"/>
           </w:tcPr>
           <w:p>
+            <w:r>
+              <w:t>{% tr for c in camera %}</w:t>
+            </w:r>
+          </w:p>
+          <w:p>
             <w:pPr>
               <w:jc w:val="center"/>
               <w:rPr>
@@ -11105,6 +11140,11 @@
                 <w:szCs w:val="24"/>
               </w:rPr>
             </w:pPr>
+          </w:p>
+          <w:p>
+            <w:r>
+              <w:t>{% tr endfor %}</w:t>
+            </w:r>
           </w:p>
         </w:tc>
       </w:tr>
@@ -12648,6 +12688,11 @@
             <w:shd w:val="clear" w:color="auto" w:fill="F1F5F9"/>
           </w:tcPr>
           <w:p>
+            <w:r>
+              <w:t>{% tr for ip in ip_tinh %}</w:t>
+            </w:r>
+          </w:p>
+          <w:p>
             <w:pPr>
               <w:jc w:val="center"/>
               <w:rPr>
@@ -12727,6 +12772,11 @@
                 <w:szCs w:val="24"/>
               </w:rPr>
             </w:pPr>
+          </w:p>
+          <w:p>
+            <w:r>
+              <w:t>{% tr endfor %}</w:t>
+            </w:r>
           </w:p>
         </w:tc>
       </w:tr>
@@ -20034,6 +20084,11 @@
             <w:shd w:val="clear" w:color="auto" w:fill="F1F5F9"/>
           </w:tcPr>
           <w:p>
+            <w:r>
+              <w:t>{% tr for d in dao_tao %}</w:t>
+            </w:r>
+          </w:p>
+          <w:p>
             <w:pPr>
               <w:jc w:val="center"/>
               <w:rPr>
@@ -20155,6 +20210,11 @@
                 <w:szCs w:val="24"/>
               </w:rPr>
             </w:pPr>
+          </w:p>
+          <w:p>
+            <w:r>
+              <w:t>{% tr endfor %}</w:t>
+            </w:r>
           </w:p>
         </w:tc>
       </w:tr>
@@ -20879,6 +20939,11 @@
             <w:shd w:val="clear" w:color="auto" w:fill="F1F5F9"/>
           </w:tcPr>
           <w:p>
+            <w:r>
+              <w:t>{% tr for k in kiem_tra %}</w:t>
+            </w:r>
+          </w:p>
+          <w:p>
             <w:pPr>
               <w:jc w:val="center"/>
               <w:rPr>
@@ -20979,6 +21044,11 @@
                 <w:szCs w:val="24"/>
               </w:rPr>
             </w:pPr>
+          </w:p>
+          <w:p>
+            <w:r>
+              <w:t>{% tr endfor %}</w:t>
+            </w:r>
           </w:p>
         </w:tc>
       </w:tr>
@@ -22130,6 +22200,11 @@
             <w:shd w:val="clear" w:color="auto" w:fill="F1F5F9"/>
           </w:tcPr>
           <w:p>
+            <w:r>
+              <w:t>{% tr for p in T2_port_mapping %}</w:t>
+            </w:r>
+          </w:p>
+          <w:p>
             <w:pPr>
               <w:rPr>
                 <w:rFonts w:ascii="Times New Roman" w:hAnsi="Times New Roman" w:cs="Times New Roman"/>
@@ -22200,6 +22275,11 @@
                 <w:szCs w:val="24"/>
               </w:rPr>
             </w:pPr>
+          </w:p>
+          <w:p>
+            <w:r>
+              <w:t>{% tr endfor %}</w:t>
+            </w:r>
           </w:p>
         </w:tc>
       </w:tr>

</xml_diff>

<commit_message>
Fix 'unknown tag tr' by replacing with standard Jinja tags in docx templates and enhance exporter logging
</commit_message>
<xml_diff>
--- a/Code/backend/templates/phieu_khao_sat_template.docx
+++ b/Code/backend/templates/phieu_khao_sat_template.docx
@@ -5638,7 +5638,7 @@
           </w:tcPr>
           <w:p>
             <w:r>
-              <w:t>{% tr for d in D1_duong_truyen %}</w:t>
+              <w:t>{% for d in D1_duong_truyen %}</w:t>
             </w:r>
           </w:p>
           <w:p>
@@ -5889,7 +5889,7 @@
           </w:p>
           <w:p>
             <w:r>
-              <w:t>{% tr endfor %}</w:t>
+              <w:t>{% endfor %}</w:t>
             </w:r>
           </w:p>
         </w:tc>
@@ -6948,7 +6948,7 @@
           </w:tcPr>
           <w:p>
             <w:r>
-              <w:t>{% tr for d in thiet_bi_mang %}</w:t>
+              <w:t>{% for d in thiet_bi_mang %}</w:t>
             </w:r>
           </w:p>
           <w:p>
@@ -7118,7 +7118,7 @@
           </w:p>
           <w:p>
             <w:r>
-              <w:t>{% tr endfor %}</w:t>
+              <w:t>{% endfor %}</w:t>
             </w:r>
           </w:p>
         </w:tc>
@@ -8725,7 +8725,7 @@
           </w:tcPr>
           <w:p>
             <w:r>
-              <w:t>{% tr for d in thiet_bi_mang %}</w:t>
+              <w:t>{% for d in thiet_bi_mang %}</w:t>
             </w:r>
           </w:p>
           <w:p>
@@ -8848,7 +8848,7 @@
           </w:p>
           <w:p>
             <w:r>
-              <w:t>{% tr endfor %}</w:t>
+              <w:t>{% endfor %}</w:t>
             </w:r>
           </w:p>
         </w:tc>
@@ -10994,7 +10994,7 @@
           </w:tcPr>
           <w:p>
             <w:r>
-              <w:t>{% tr for c in camera %}</w:t>
+              <w:t>{% for c in camera %}</w:t>
             </w:r>
           </w:p>
           <w:p>
@@ -11143,7 +11143,7 @@
           </w:p>
           <w:p>
             <w:r>
-              <w:t>{% tr endfor %}</w:t>
+              <w:t>{% endfor %}</w:t>
             </w:r>
           </w:p>
         </w:tc>
@@ -12689,7 +12689,7 @@
           </w:tcPr>
           <w:p>
             <w:r>
-              <w:t>{% tr for ip in ip_tinh %}</w:t>
+              <w:t>{% for ip in ip_tinh %}</w:t>
             </w:r>
           </w:p>
           <w:p>
@@ -12775,7 +12775,7 @@
           </w:p>
           <w:p>
             <w:r>
-              <w:t>{% tr endfor %}</w:t>
+              <w:t>{% endfor %}</w:t>
             </w:r>
           </w:p>
         </w:tc>
@@ -20085,7 +20085,7 @@
           </w:tcPr>
           <w:p>
             <w:r>
-              <w:t>{% tr for d in dao_tao %}</w:t>
+              <w:t>{% for d in dao_tao %}</w:t>
             </w:r>
           </w:p>
           <w:p>
@@ -20213,7 +20213,7 @@
           </w:p>
           <w:p>
             <w:r>
-              <w:t>{% tr endfor %}</w:t>
+              <w:t>{% endfor %}</w:t>
             </w:r>
           </w:p>
         </w:tc>
@@ -20940,7 +20940,7 @@
           </w:tcPr>
           <w:p>
             <w:r>
-              <w:t>{% tr for k in kiem_tra %}</w:t>
+              <w:t>{% for k in kiem_tra %}</w:t>
             </w:r>
           </w:p>
           <w:p>
@@ -21047,7 +21047,7 @@
           </w:p>
           <w:p>
             <w:r>
-              <w:t>{% tr endfor %}</w:t>
+              <w:t>{% endfor %}</w:t>
             </w:r>
           </w:p>
         </w:tc>
@@ -22201,7 +22201,7 @@
           </w:tcPr>
           <w:p>
             <w:r>
-              <w:t>{% tr for p in T2_port_mapping %}</w:t>
+              <w:t>{% for p in T2_port_mapping %}</w:t>
             </w:r>
           </w:p>
           <w:p>
@@ -22278,7 +22278,7 @@
           </w:p>
           <w:p>
             <w:r>
-              <w:t>{% tr endfor %}</w:t>
+              <w:t>{% endfor %}</w:t>
             </w:r>
           </w:p>
         </w:tc>

</xml_diff>

<commit_message>
fix: Word export syntax (reverted {% tr %} to standard {% for %} loops)
</commit_message>
<xml_diff>
--- a/Code/backend/templates/phieu_khao_sat_template.docx
+++ b/Code/backend/templates/phieu_khao_sat_template.docx
@@ -2321,7 +2321,7 @@
               </w:rPr>
             </w:pPr>
             <w:r>
-              <w:t>{% tr for item in can_bo_phu_trach %}{{item.idx}}</w:t>
+              <w:t>{% for item in can_bo_phu_trach %}{{item.idx}}</w:t>
             </w:r>
           </w:p>
         </w:tc>
@@ -2475,7 +2475,7 @@
               </w:rPr>
             </w:pPr>
             <w:r>
-              <w:t>{{item.chung_chi_attt}}{% tr endfor %}</w:t>
+              <w:t>{{item.chung_chi_attt}}{% endfor %}</w:t>
             </w:r>
           </w:p>
         </w:tc>
@@ -6311,7 +6311,7 @@
               </w:rPr>
             </w:pPr>
             <w:r>
-              <w:t>{% tr for item in ket_noi_internet %}{{item.idx}}</w:t>
+              <w:t>{% for item in ket_noi_internet %}{{item.idx}}</w:t>
             </w:r>
           </w:p>
         </w:tc>
@@ -6455,7 +6455,7 @@
               </w:rPr>
             </w:pPr>
             <w:r>
-              <w:t>{{item.ghi_chu}}{% tr endfor %}</w:t>
+              <w:t>{{item.ghi_chu}}{% endfor %}</w:t>
             </w:r>
           </w:p>
         </w:tc>
@@ -8044,7 +8044,7 @@
               </w:rPr>
             </w:pPr>
             <w:r>
-              <w:t>{% tr for item in thiet_bi_mang %}{{item.idx}}</w:t>
+              <w:t>{% for item in thiet_bi_mang %}{{item.idx}}</w:t>
             </w:r>
           </w:p>
         </w:tc>
@@ -8214,7 +8214,7 @@
               </w:rPr>
             </w:pPr>
             <w:r>
-              <w:t>{{item.ghi_chu}}{% tr endfor %}</w:t>
+              <w:t>{{item.ghi_chu}}{% endfor %}</w:t>
             </w:r>
           </w:p>
         </w:tc>
@@ -12033,7 +12033,7 @@
               </w:rPr>
             </w:pPr>
             <w:r>
-              <w:t>{% tr for item in may_chu %}{{item.idx}}</w:t>
+              <w:t>{% for item in may_chu %}{{item.idx}}</w:t>
             </w:r>
           </w:p>
         </w:tc>
@@ -12203,7 +12203,7 @@
               </w:rPr>
             </w:pPr>
             <w:r>
-              <w:t>{{item.vi_tri}}{% tr endfor %}</w:t>
+              <w:t>{{item.vi_tri}}{% endfor %}</w:t>
             </w:r>
           </w:p>
           <w:p>
@@ -13415,7 +13415,7 @@
               </w:rPr>
             </w:pPr>
             <w:r>
-              <w:t>{% tr for item in camera %}{{item.idx}}</w:t>
+              <w:t>{% for item in camera %}{{item.idx}}</w:t>
             </w:r>
           </w:p>
         </w:tc>
@@ -13561,7 +13561,7 @@
               </w:rPr>
             </w:pPr>
             <w:r>
-              <w:t>{{item.ghi_chu}}{% tr endfor %}</w:t>
+              <w:t>{{item.ghi_chu}}{% endfor %}</w:t>
             </w:r>
           </w:p>
         </w:tc>
@@ -15278,7 +15278,7 @@
               </w:rPr>
             </w:pPr>
             <w:r>
-              <w:t>{% tr for item in ip_tinh %}{{item.idx}}</w:t>
+              <w:t>{% for item in ip_tinh %}{{item.idx}}</w:t>
             </w:r>
           </w:p>
         </w:tc>
@@ -15352,7 +15352,7 @@
               </w:rPr>
             </w:pPr>
             <w:r>
-              <w:t>{{item.ghi_chu}}{% tr endfor %}</w:t>
+              <w:t>{{item.ghi_chu}}{% endfor %}</w:t>
             </w:r>
           </w:p>
           <w:p>
@@ -16383,7 +16383,7 @@
               </w:rPr>
             </w:pPr>
             <w:r>
-              <w:t>{% tr for item in ung_dung %}{{item.idx}}</w:t>
+              <w:t>{% for item in ung_dung %}{{item.idx}}</w:t>
             </w:r>
           </w:p>
         </w:tc>
@@ -16529,7 +16529,7 @@
               </w:rPr>
             </w:pPr>
             <w:r>
-              <w:t>{{item.ghi_chu}}{% tr endfor %}</w:t>
+              <w:t>{{item.ghi_chu}}{% endfor %}</w:t>
             </w:r>
           </w:p>
         </w:tc>
@@ -18743,7 +18743,7 @@
               </w:rPr>
             </w:pPr>
             <w:r>
-              <w:t>{% tr for item in K_van_ban %}{{item.idx}}</w:t>
+              <w:t>{% for item in K_van_ban %}{{item.idx}}</w:t>
             </w:r>
           </w:p>
         </w:tc>
@@ -18815,7 +18815,7 @@
               </w:rPr>
             </w:pPr>
             <w:r>
-              <w:t>{{item.ghi_chu}}{% tr endfor %}</w:t>
+              <w:t>{{item.ghi_chu}}{% endfor %}</w:t>
             </w:r>
           </w:p>
         </w:tc>
@@ -24778,7 +24778,7 @@
               </w:rPr>
             </w:pPr>
             <w:r>
-              <w:t>{% tr for item in dao_tao %}{{item.idx}}</w:t>
+              <w:t>{% for item in dao_tao %}{{item.idx}}</w:t>
             </w:r>
           </w:p>
         </w:tc>
@@ -24898,7 +24898,7 @@
               </w:rPr>
             </w:pPr>
             <w:r>
-              <w:t>{{item.chung_chi_so_vb}}{% tr endfor %}</w:t>
+              <w:t>{{item.chung_chi_so_vb}}{% endfor %}</w:t>
             </w:r>
           </w:p>
         </w:tc>
@@ -25709,7 +25709,7 @@
               </w:rPr>
             </w:pPr>
             <w:r>
-              <w:t>{% tr for item in kiem_tra_attt %}{{item.idx}}</w:t>
+              <w:t>{% for item in kiem_tra_attt %}{{item.idx}}</w:t>
             </w:r>
           </w:p>
         </w:tc>
@@ -25807,7 +25807,7 @@
               </w:rPr>
             </w:pPr>
             <w:r>
-              <w:t>{{item.ket_qua_so_vb}}{% tr endfor %}</w:t>
+              <w:t>{{item.ket_qua_so_vb}}{% endfor %}</w:t>
             </w:r>
           </w:p>
         </w:tc>
@@ -27176,7 +27176,7 @@
               </w:rPr>
             </w:pPr>
             <w:r>
-              <w:t>{% tr for item in port_switch %}{{item.ten_switch}}</w:t>
+              <w:t>{% for item in port_switch %}{{item.ten_switch}}</w:t>
             </w:r>
           </w:p>
         </w:tc>
@@ -27248,7 +27248,7 @@
               </w:rPr>
             </w:pPr>
             <w:r>
-              <w:t>{{item.ghi_chu}}{% tr endfor %}</w:t>
+              <w:t>{{item.ghi_chu}}{% endfor %}</w:t>
             </w:r>
           </w:p>
         </w:tc>
@@ -29062,7 +29062,7 @@
               </w:rPr>
             </w:pPr>
             <w:r>
-              <w:t>{% tr for item in T5_vi_tri %}{{item.idx}}</w:t>
+              <w:t>{% for item in T5_vi_tri %}{{item.idx}}</w:t>
             </w:r>
           </w:p>
         </w:tc>
@@ -29135,7 +29135,7 @@
               </w:rPr>
             </w:pPr>
             <w:r>
-              <w:t>{{item.phong}}{% tr endfor %}</w:t>
+              <w:t>{{item.phong}}{% endfor %}</w:t>
             </w:r>
           </w:p>
         </w:tc>

</xml_diff>

<commit_message>
fix: Word table layout (resolved squishing/corruption with isolated row loops)
</commit_message>
<xml_diff>
--- a/Code/backend/templates/phieu_khao_sat_template.docx
+++ b/Code/backend/templates/phieu_khao_sat_template.docx
@@ -2062,6 +2062,7 @@
       <w:tblPr>
         <w:tblStyle w:val="TableGrid"/>
         <w:tblW w:w="0" w:type="auto"/>
+        <w:tblLayout w:type="autofit"/>
         <w:tblLook w:val="04A0" w:firstRow="1" w:lastRow="0" w:firstColumn="1" w:lastColumn="0" w:noHBand="0" w:noVBand="1"/>
       </w:tblPr>
       <w:tblGrid>
@@ -2321,7 +2322,17 @@
               </w:rPr>
             </w:pPr>
             <w:r>
-              <w:t>{% for item in can_bo_phu_trach %}{{item.idx}}</w:t>
+              <w:rPr>
+                <w:rFonts w:ascii="Times New Roman" w:hAnsi="Times New Roman" w:cs="Times New Roman"/>
+                <w:sz w:val="24"/>
+                <w:szCs w:val="24"/>
+              </w:rPr>
+            </w:r>
+            <w:r>
+              <w:t>{% for item in can_bo_phu_trach %}</w:t>
+            </w:r>
+            <w:r>
+              <w:t>{{item.idx}}</w:t>
             </w:r>
           </w:p>
         </w:tc>
@@ -2344,6 +2355,31 @@
                 <w:szCs w:val="24"/>
               </w:rPr>
             </w:pPr>
+            <w:proofErr w:type="spellStart"/>
+            <w:r>
+              <w:rPr>
+                <w:rFonts w:ascii="Times New Roman" w:hAnsi="Times New Roman" w:cs="Times New Roman"/>
+                <w:sz w:val="24"/>
+                <w:szCs w:val="24"/>
+              </w:rPr>
+            </w:r>
+            <w:proofErr w:type="spellEnd"/>
+            <w:r>
+              <w:rPr>
+                <w:rFonts w:ascii="Times New Roman" w:hAnsi="Times New Roman" w:cs="Times New Roman"/>
+                <w:sz w:val="24"/>
+                <w:szCs w:val="24"/>
+              </w:rPr>
+            </w:r>
+            <w:proofErr w:type="spellStart"/>
+            <w:r>
+              <w:rPr>
+                <w:rFonts w:ascii="Times New Roman" w:hAnsi="Times New Roman" w:cs="Times New Roman"/>
+                <w:sz w:val="24"/>
+                <w:szCs w:val="24"/>
+              </w:rPr>
+            </w:r>
+            <w:proofErr w:type="spellEnd"/>
             <w:r>
               <w:t>{{item.ho_ten}}</w:t>
             </w:r>
@@ -2369,6 +2405,22 @@
               </w:rPr>
             </w:pPr>
             <w:r>
+              <w:rPr>
+                <w:rFonts w:ascii="Times New Roman" w:hAnsi="Times New Roman" w:cs="Times New Roman"/>
+                <w:sz w:val="24"/>
+                <w:szCs w:val="24"/>
+              </w:rPr>
+            </w:r>
+            <w:proofErr w:type="spellStart"/>
+            <w:r>
+              <w:rPr>
+                <w:rFonts w:ascii="Times New Roman" w:hAnsi="Times New Roman" w:cs="Times New Roman"/>
+                <w:sz w:val="24"/>
+                <w:szCs w:val="24"/>
+              </w:rPr>
+            </w:r>
+            <w:proofErr w:type="spellEnd"/>
+            <w:r>
               <w:t>{{item.chuc_vu}}</w:t>
             </w:r>
           </w:p>
@@ -2392,6 +2444,13 @@
                 <w:szCs w:val="24"/>
               </w:rPr>
             </w:pPr>
+            <w:r>
+              <w:rPr>
+                <w:rFonts w:ascii="Times New Roman" w:hAnsi="Times New Roman" w:cs="Times New Roman"/>
+                <w:sz w:val="24"/>
+                <w:szCs w:val="24"/>
+              </w:rPr>
+            </w:r>
             <w:r>
               <w:t>{{item.so_dt}}</w:t>
             </w:r>
@@ -2417,19 +2476,16 @@
               </w:rPr>
             </w:pPr>
             <w:r>
+              <w:rPr>
+                <w:color w:val="000000"/>
+                <w:sz w:val="26"/>
+                <w:szCs w:val="26"/>
+              </w:rPr>
+            </w:r>
+            <w:r>
               <w:t>{{item.email}}</w:t>
             </w:r>
           </w:p>
-          <w:p>
-            <w:pPr>
-              <w:rPr>
-                <w:rFonts w:ascii="Times New Roman" w:hAnsi="Times New Roman" w:cs="Times New Roman"/>
-                <w:sz w:val="24"/>
-                <w:szCs w:val="24"/>
-              </w:rPr>
-            </w:pPr>
-            <w:r/>
-          </w:p>
         </w:tc>
         <w:tc>
           <w:tcPr>
@@ -2451,6 +2507,22 @@
               </w:rPr>
             </w:pPr>
             <w:r>
+              <w:rPr>
+                <w:rFonts w:ascii="Times New Roman" w:hAnsi="Times New Roman" w:cs="Times New Roman"/>
+                <w:sz w:val="24"/>
+                <w:szCs w:val="24"/>
+              </w:rPr>
+            </w:r>
+            <w:proofErr w:type="spellStart"/>
+            <w:r>
+              <w:rPr>
+                <w:rFonts w:ascii="Times New Roman" w:hAnsi="Times New Roman" w:cs="Times New Roman"/>
+                <w:sz w:val="24"/>
+                <w:szCs w:val="24"/>
+              </w:rPr>
+            </w:r>
+            <w:proofErr w:type="spellEnd"/>
+            <w:r>
               <w:t>{{item.trinh_do}}</w:t>
             </w:r>
           </w:p>
@@ -2475,7 +2547,10 @@
               </w:rPr>
             </w:pPr>
             <w:r>
-              <w:t>{{item.chung_chi_attt}}{% endfor %}</w:t>
+              <w:t>{{item.chung_chi_attt}}</w:t>
+            </w:r>
+            <w:r>
+              <w:t>{% endfor %}</w:t>
             </w:r>
           </w:p>
         </w:tc>
@@ -6030,6 +6105,7 @@
       <w:tblPr>
         <w:tblStyle w:val="TableGrid"/>
         <w:tblW w:w="0" w:type="auto"/>
+        <w:tblLayout w:type="autofit"/>
         <w:tblLook w:val="04A0" w:firstRow="1" w:lastRow="0" w:firstColumn="1" w:lastColumn="0" w:noHBand="0" w:noVBand="1"/>
       </w:tblPr>
       <w:tblGrid>
@@ -6311,7 +6387,17 @@
               </w:rPr>
             </w:pPr>
             <w:r>
-              <w:t>{% for item in ket_noi_internet %}{{item.idx}}</w:t>
+              <w:rPr>
+                <w:rFonts w:ascii="Times New Roman" w:hAnsi="Times New Roman" w:cs="Times New Roman"/>
+                <w:sz w:val="24"/>
+                <w:szCs w:val="24"/>
+              </w:rPr>
+            </w:r>
+            <w:r>
+              <w:t>{% for item in ket_noi_internet %}</w:t>
+            </w:r>
+            <w:r>
+              <w:t>{{item.idx}}</w:t>
             </w:r>
           </w:p>
         </w:tc>
@@ -6335,6 +6421,13 @@
               </w:rPr>
             </w:pPr>
             <w:r>
+              <w:rPr>
+                <w:rFonts w:ascii="Times New Roman" w:hAnsi="Times New Roman" w:cs="Times New Roman"/>
+                <w:sz w:val="24"/>
+                <w:szCs w:val="24"/>
+              </w:rPr>
+            </w:r>
+            <w:r>
               <w:t>{{item.isp}}</w:t>
             </w:r>
           </w:p>
@@ -6358,6 +6451,31 @@
                 <w:szCs w:val="24"/>
               </w:rPr>
             </w:pPr>
+            <w:proofErr w:type="spellStart"/>
+            <w:r>
+              <w:rPr>
+                <w:rFonts w:ascii="Times New Roman" w:hAnsi="Times New Roman" w:cs="Times New Roman"/>
+                <w:sz w:val="24"/>
+                <w:szCs w:val="24"/>
+              </w:rPr>
+            </w:r>
+            <w:proofErr w:type="spellEnd"/>
+            <w:r>
+              <w:rPr>
+                <w:rFonts w:ascii="Times New Roman" w:hAnsi="Times New Roman" w:cs="Times New Roman"/>
+                <w:sz w:val="24"/>
+                <w:szCs w:val="24"/>
+              </w:rPr>
+            </w:r>
+            <w:proofErr w:type="spellStart"/>
+            <w:r>
+              <w:rPr>
+                <w:rFonts w:ascii="Times New Roman" w:hAnsi="Times New Roman" w:cs="Times New Roman"/>
+                <w:sz w:val="24"/>
+                <w:szCs w:val="24"/>
+              </w:rPr>
+            </w:r>
+            <w:proofErr w:type="spellEnd"/>
             <w:r>
               <w:t>{{item.loai_ket_noi}}</w:t>
             </w:r>
@@ -6382,6 +6500,47 @@
                 <w:szCs w:val="24"/>
               </w:rPr>
             </w:pPr>
+            <w:proofErr w:type="spellStart"/>
+            <w:r>
+              <w:rPr>
+                <w:rFonts w:ascii="Times New Roman" w:hAnsi="Times New Roman" w:cs="Times New Roman"/>
+                <w:sz w:val="24"/>
+                <w:szCs w:val="24"/>
+              </w:rPr>
+            </w:r>
+            <w:proofErr w:type="spellEnd"/>
+            <w:r>
+              <w:rPr>
+                <w:rFonts w:ascii="Times New Roman" w:hAnsi="Times New Roman" w:cs="Times New Roman"/>
+                <w:sz w:val="24"/>
+                <w:szCs w:val="24"/>
+              </w:rPr>
+            </w:r>
+            <w:proofErr w:type="spellStart"/>
+            <w:r>
+              <w:rPr>
+                <w:rFonts w:ascii="Times New Roman" w:hAnsi="Times New Roman" w:cs="Times New Roman"/>
+                <w:sz w:val="24"/>
+                <w:szCs w:val="24"/>
+              </w:rPr>
+            </w:r>
+            <w:proofErr w:type="spellEnd"/>
+            <w:r>
+              <w:rPr>
+                <w:rFonts w:ascii="Times New Roman" w:hAnsi="Times New Roman" w:cs="Times New Roman"/>
+                <w:sz w:val="24"/>
+                <w:szCs w:val="24"/>
+              </w:rPr>
+            </w:r>
+            <w:proofErr w:type="spellStart"/>
+            <w:r>
+              <w:rPr>
+                <w:rFonts w:ascii="Times New Roman" w:hAnsi="Times New Roman" w:cs="Times New Roman"/>
+                <w:sz w:val="24"/>
+                <w:szCs w:val="24"/>
+              </w:rPr>
+            </w:r>
+            <w:proofErr w:type="spellEnd"/>
             <w:r>
               <w:t>{{item.bang_thong}}</w:t>
             </w:r>
@@ -6406,6 +6565,15 @@
                 <w:szCs w:val="24"/>
               </w:rPr>
             </w:pPr>
+            <w:proofErr w:type="spellStart"/>
+            <w:r>
+              <w:rPr>
+                <w:rFonts w:ascii="Times New Roman" w:hAnsi="Times New Roman" w:cs="Times New Roman"/>
+                <w:sz w:val="24"/>
+                <w:szCs w:val="24"/>
+              </w:rPr>
+            </w:r>
+            <w:proofErr w:type="spellEnd"/>
             <w:r>
               <w:t>{{item.vai_tro}}</w:t>
             </w:r>
@@ -6430,6 +6598,15 @@
                 <w:szCs w:val="24"/>
               </w:rPr>
             </w:pPr>
+            <w:proofErr w:type="spellStart"/>
+            <w:r>
+              <w:rPr>
+                <w:rFonts w:ascii="Times New Roman" w:hAnsi="Times New Roman" w:cs="Times New Roman"/>
+                <w:sz w:val="24"/>
+                <w:szCs w:val="24"/>
+              </w:rPr>
+            </w:r>
+            <w:proofErr w:type="spellEnd"/>
             <w:r>
               <w:t>{{item.ip_wan}}</w:t>
             </w:r>
@@ -6455,7 +6632,10 @@
               </w:rPr>
             </w:pPr>
             <w:r>
-              <w:t>{{item.ghi_chu}}{% endfor %}</w:t>
+              <w:t>{{item.ghi_chu}}</w:t>
+            </w:r>
+            <w:r>
+              <w:t>{% endfor %}</w:t>
             </w:r>
           </w:p>
         </w:tc>
@@ -7741,6 +7921,7 @@
       <w:tblPr>
         <w:tblStyle w:val="TableGrid"/>
         <w:tblW w:w="0" w:type="auto"/>
+        <w:tblLayout w:type="autofit"/>
         <w:tblLook w:val="04A0" w:firstRow="1" w:lastRow="0" w:firstColumn="1" w:lastColumn="0" w:noHBand="0" w:noVBand="1"/>
       </w:tblPr>
       <w:tblGrid>
@@ -8044,7 +8225,17 @@
               </w:rPr>
             </w:pPr>
             <w:r>
-              <w:t>{% for item in thiet_bi_mang %}{{item.idx}}</w:t>
+              <w:rPr>
+                <w:rFonts w:ascii="Times New Roman" w:hAnsi="Times New Roman" w:cs="Times New Roman"/>
+                <w:sz w:val="24"/>
+                <w:szCs w:val="24"/>
+              </w:rPr>
+            </w:r>
+            <w:r>
+              <w:t>{% for item in thiet_bi_mang %}</w:t>
+            </w:r>
+            <w:r>
+              <w:t>{{item.idx}}</w:t>
             </w:r>
           </w:p>
         </w:tc>
@@ -8068,6 +8259,15 @@
               </w:rPr>
             </w:pPr>
             <w:r>
+              <w:rPr>
+                <w:rFonts w:ascii="Times New Roman" w:hAnsi="Times New Roman" w:cs="Times New Roman"/>
+                <w:i/>
+                <w:color w:val="065F46"/>
+                <w:sz w:val="24"/>
+                <w:szCs w:val="24"/>
+              </w:rPr>
+            </w:r>
+            <w:r>
               <w:t>{{item.loai_thiet_bi}}</w:t>
             </w:r>
           </w:p>
@@ -8092,6 +8292,15 @@
               </w:rPr>
             </w:pPr>
             <w:r>
+              <w:rPr>
+                <w:rFonts w:ascii="Times New Roman" w:hAnsi="Times New Roman" w:cs="Times New Roman"/>
+                <w:i/>
+                <w:color w:val="065F46"/>
+                <w:sz w:val="24"/>
+                <w:szCs w:val="24"/>
+              </w:rPr>
+            </w:r>
+            <w:r>
               <w:t>{{item.hang_san_xuat}}</w:t>
             </w:r>
           </w:p>
@@ -8116,6 +8325,15 @@
               </w:rPr>
             </w:pPr>
             <w:r>
+              <w:rPr>
+                <w:rFonts w:ascii="Times New Roman" w:hAnsi="Times New Roman" w:cs="Times New Roman"/>
+                <w:i/>
+                <w:color w:val="065F46"/>
+                <w:sz w:val="24"/>
+                <w:szCs w:val="24"/>
+              </w:rPr>
+            </w:r>
+            <w:r>
               <w:t>{{item.model}}</w:t>
             </w:r>
           </w:p>
@@ -8140,6 +8358,15 @@
               </w:rPr>
             </w:pPr>
             <w:r>
+              <w:rPr>
+                <w:rFonts w:ascii="Times New Roman" w:hAnsi="Times New Roman" w:cs="Times New Roman"/>
+                <w:i/>
+                <w:color w:val="065F46"/>
+                <w:sz w:val="24"/>
+                <w:szCs w:val="24"/>
+              </w:rPr>
+            </w:r>
+            <w:r>
               <w:t>{{item.so_serial}}</w:t>
             </w:r>
           </w:p>
@@ -8163,6 +8390,66 @@
                 <w:szCs w:val="24"/>
               </w:rPr>
             </w:pPr>
+            <w:proofErr w:type="spellStart"/>
+            <w:r>
+              <w:rPr>
+                <w:rFonts w:ascii="Times New Roman" w:hAnsi="Times New Roman" w:cs="Times New Roman"/>
+                <w:i/>
+                <w:color w:val="065F46"/>
+                <w:sz w:val="24"/>
+                <w:szCs w:val="24"/>
+              </w:rPr>
+            </w:r>
+            <w:proofErr w:type="spellEnd"/>
+            <w:r>
+              <w:rPr>
+                <w:rFonts w:ascii="Times New Roman" w:hAnsi="Times New Roman" w:cs="Times New Roman"/>
+                <w:i/>
+                <w:color w:val="065F46"/>
+                <w:sz w:val="24"/>
+                <w:szCs w:val="24"/>
+              </w:rPr>
+            </w:r>
+            <w:proofErr w:type="spellStart"/>
+            <w:r>
+              <w:rPr>
+                <w:rFonts w:ascii="Times New Roman" w:hAnsi="Times New Roman" w:cs="Times New Roman"/>
+                <w:i/>
+                <w:color w:val="065F46"/>
+                <w:sz w:val="24"/>
+                <w:szCs w:val="24"/>
+              </w:rPr>
+            </w:r>
+            <w:proofErr w:type="spellEnd"/>
+            <w:r>
+              <w:rPr>
+                <w:rFonts w:ascii="Times New Roman" w:hAnsi="Times New Roman" w:cs="Times New Roman"/>
+                <w:i/>
+                <w:color w:val="065F46"/>
+                <w:sz w:val="24"/>
+                <w:szCs w:val="24"/>
+              </w:rPr>
+            </w:r>
+            <w:proofErr w:type="spellStart"/>
+            <w:r>
+              <w:rPr>
+                <w:rFonts w:ascii="Times New Roman" w:hAnsi="Times New Roman" w:cs="Times New Roman"/>
+                <w:i/>
+                <w:color w:val="065F46"/>
+                <w:sz w:val="24"/>
+                <w:szCs w:val="24"/>
+              </w:rPr>
+            </w:r>
+            <w:proofErr w:type="spellEnd"/>
+            <w:r>
+              <w:rPr>
+                <w:rFonts w:ascii="Times New Roman" w:hAnsi="Times New Roman" w:cs="Times New Roman"/>
+                <w:i/>
+                <w:color w:val="065F46"/>
+                <w:sz w:val="24"/>
+                <w:szCs w:val="24"/>
+              </w:rPr>
+            </w:r>
             <w:r>
               <w:t>{{item.vi_tri}}</w:t>
             </w:r>
@@ -8187,6 +8474,15 @@
                 <w:szCs w:val="24"/>
               </w:rPr>
             </w:pPr>
+            <w:r>
+              <w:rPr>
+                <w:rFonts w:ascii="Times New Roman" w:hAnsi="Times New Roman" w:cs="Times New Roman"/>
+                <w:i/>
+                <w:color w:val="065F46"/>
+                <w:sz w:val="24"/>
+                <w:szCs w:val="24"/>
+              </w:rPr>
+            </w:r>
             <w:r>
               <w:t>{{item.nam_mua}}</w:t>
             </w:r>
@@ -8214,7 +8510,50 @@
               </w:rPr>
             </w:pPr>
             <w:r>
-              <w:t>{{item.ghi_chu}}{% endfor %}</w:t>
+              <w:rPr>
+                <w:rFonts w:ascii="Times New Roman" w:hAnsi="Times New Roman" w:cs="Times New Roman"/>
+                <w:i/>
+                <w:color w:val="065F46"/>
+                <w:sz w:val="24"/>
+                <w:szCs w:val="24"/>
+              </w:rPr>
+            </w:r>
+            <w:proofErr w:type="spellStart"/>
+            <w:r>
+              <w:rPr>
+                <w:rFonts w:ascii="Times New Roman" w:hAnsi="Times New Roman" w:cs="Times New Roman"/>
+                <w:i/>
+                <w:color w:val="065F46"/>
+                <w:sz w:val="24"/>
+                <w:szCs w:val="24"/>
+              </w:rPr>
+            </w:r>
+            <w:proofErr w:type="spellEnd"/>
+            <w:r>
+              <w:rPr>
+                <w:rFonts w:ascii="Times New Roman" w:hAnsi="Times New Roman" w:cs="Times New Roman"/>
+                <w:i/>
+                <w:color w:val="065F46"/>
+                <w:sz w:val="24"/>
+                <w:szCs w:val="24"/>
+              </w:rPr>
+            </w:r>
+            <w:proofErr w:type="spellStart"/>
+            <w:r>
+              <w:rPr>
+                <w:rFonts w:ascii="Times New Roman" w:hAnsi="Times New Roman" w:cs="Times New Roman"/>
+                <w:i/>
+                <w:color w:val="065F46"/>
+                <w:sz w:val="24"/>
+                <w:szCs w:val="24"/>
+              </w:rPr>
+            </w:r>
+            <w:proofErr w:type="spellEnd"/>
+            <w:r>
+              <w:t>{{item.ghi_chu}}</w:t>
+            </w:r>
+            <w:r>
+              <w:t>{% endfor %}</w:t>
             </w:r>
           </w:p>
         </w:tc>
@@ -11719,6 +12058,7 @@
       <w:tblPr>
         <w:tblStyle w:val="TableGrid"/>
         <w:tblW w:w="0" w:type="auto"/>
+        <w:tblLayout w:type="autofit"/>
         <w:tblLook w:val="04A0" w:firstRow="1" w:lastRow="0" w:firstColumn="1" w:lastColumn="0" w:noHBand="0" w:noVBand="1"/>
       </w:tblPr>
       <w:tblGrid>
@@ -12033,7 +12373,17 @@
               </w:rPr>
             </w:pPr>
             <w:r>
-              <w:t>{% for item in may_chu %}{{item.idx}}</w:t>
+              <w:rPr>
+                <w:rFonts w:ascii="Times New Roman" w:hAnsi="Times New Roman" w:cs="Times New Roman"/>
+                <w:sz w:val="24"/>
+                <w:szCs w:val="24"/>
+              </w:rPr>
+            </w:r>
+            <w:r>
+              <w:t>{% for item in may_chu %}</w:t>
+            </w:r>
+            <w:r>
+              <w:t>{{item.idx}}</w:t>
             </w:r>
           </w:p>
         </w:tc>
@@ -12057,6 +12407,46 @@
               </w:rPr>
             </w:pPr>
             <w:r>
+              <w:rPr>
+                <w:rFonts w:ascii="Times New Roman" w:hAnsi="Times New Roman" w:cs="Times New Roman"/>
+                <w:i/>
+                <w:color w:val="065F46"/>
+                <w:sz w:val="24"/>
+                <w:szCs w:val="24"/>
+              </w:rPr>
+            </w:r>
+            <w:proofErr w:type="spellStart"/>
+            <w:r>
+              <w:rPr>
+                <w:rFonts w:ascii="Times New Roman" w:hAnsi="Times New Roman" w:cs="Times New Roman"/>
+                <w:i/>
+                <w:color w:val="065F46"/>
+                <w:sz w:val="24"/>
+                <w:szCs w:val="24"/>
+              </w:rPr>
+            </w:r>
+            <w:proofErr w:type="spellEnd"/>
+            <w:r>
+              <w:rPr>
+                <w:rFonts w:ascii="Times New Roman" w:hAnsi="Times New Roman" w:cs="Times New Roman"/>
+                <w:i/>
+                <w:color w:val="065F46"/>
+                <w:sz w:val="24"/>
+                <w:szCs w:val="24"/>
+              </w:rPr>
+            </w:r>
+            <w:proofErr w:type="spellStart"/>
+            <w:r>
+              <w:rPr>
+                <w:rFonts w:ascii="Times New Roman" w:hAnsi="Times New Roman" w:cs="Times New Roman"/>
+                <w:i/>
+                <w:color w:val="065F46"/>
+                <w:sz w:val="24"/>
+                <w:szCs w:val="24"/>
+              </w:rPr>
+            </w:r>
+            <w:proofErr w:type="spellEnd"/>
+            <w:r>
               <w:t>{{item.vai_tro}}</w:t>
             </w:r>
           </w:p>
@@ -12081,6 +12471,15 @@
               </w:rPr>
             </w:pPr>
             <w:r>
+              <w:rPr>
+                <w:rFonts w:ascii="Times New Roman" w:hAnsi="Times New Roman" w:cs="Times New Roman"/>
+                <w:i/>
+                <w:color w:val="065F46"/>
+                <w:sz w:val="24"/>
+                <w:szCs w:val="24"/>
+              </w:rPr>
+            </w:r>
+            <w:r>
               <w:t>{{item.hang_model}}</w:t>
             </w:r>
           </w:p>
@@ -12105,6 +12504,13 @@
               </w:rPr>
             </w:pPr>
             <w:r>
+              <w:rPr>
+                <w:rFonts w:ascii="Times New Roman" w:hAnsi="Times New Roman" w:cs="Times New Roman"/>
+                <w:sz w:val="24"/>
+                <w:szCs w:val="24"/>
+              </w:rPr>
+            </w:r>
+            <w:r>
               <w:t>{{item.so_serial}}</w:t>
             </w:r>
           </w:p>
@@ -12129,6 +12535,13 @@
               </w:rPr>
             </w:pPr>
             <w:r>
+              <w:rPr>
+                <w:rFonts w:ascii="Times New Roman" w:hAnsi="Times New Roman" w:cs="Times New Roman"/>
+                <w:sz w:val="24"/>
+                <w:szCs w:val="24"/>
+              </w:rPr>
+            </w:r>
+            <w:r>
               <w:t>{{item.ram_gb}}</w:t>
             </w:r>
           </w:p>
@@ -12153,6 +12566,13 @@
               </w:rPr>
             </w:pPr>
             <w:r>
+              <w:rPr>
+                <w:rFonts w:ascii="Times New Roman" w:hAnsi="Times New Roman" w:cs="Times New Roman"/>
+                <w:sz w:val="24"/>
+                <w:szCs w:val="24"/>
+              </w:rPr>
+            </w:r>
+            <w:r>
               <w:t>{{item.o_cung_tb}}</w:t>
             </w:r>
           </w:p>
@@ -12176,6 +12596,15 @@
                 <w:szCs w:val="24"/>
               </w:rPr>
             </w:pPr>
+            <w:r>
+              <w:rPr>
+                <w:rFonts w:ascii="Times New Roman" w:hAnsi="Times New Roman" w:cs="Times New Roman"/>
+                <w:i/>
+                <w:color w:val="065F46"/>
+                <w:sz w:val="24"/>
+                <w:szCs w:val="24"/>
+              </w:rPr>
+            </w:r>
             <w:r>
               <w:t>{{item.he_dieu_hanh}}</w:t>
             </w:r>
@@ -12202,19 +12631,52 @@
                 <w:szCs w:val="24"/>
               </w:rPr>
             </w:pPr>
-            <w:r>
-              <w:t>{{item.vi_tri}}{% endfor %}</w:t>
-            </w:r>
-          </w:p>
-          <w:p>
-            <w:pPr>
-              <w:rPr>
-                <w:rFonts w:ascii="Times New Roman" w:hAnsi="Times New Roman" w:cs="Times New Roman"/>
-                <w:sz w:val="24"/>
-                <w:szCs w:val="24"/>
-              </w:rPr>
-            </w:pPr>
-            <w:r/>
+            <w:proofErr w:type="spellStart"/>
+            <w:r>
+              <w:rPr>
+                <w:rFonts w:ascii="Times New Roman" w:hAnsi="Times New Roman" w:cs="Times New Roman"/>
+                <w:i/>
+                <w:color w:val="065F46"/>
+                <w:sz w:val="24"/>
+                <w:szCs w:val="24"/>
+              </w:rPr>
+            </w:r>
+            <w:proofErr w:type="spellEnd"/>
+            <w:r>
+              <w:rPr>
+                <w:rFonts w:ascii="Times New Roman" w:hAnsi="Times New Roman" w:cs="Times New Roman"/>
+                <w:i/>
+                <w:color w:val="065F46"/>
+                <w:sz w:val="24"/>
+                <w:szCs w:val="24"/>
+              </w:rPr>
+            </w:r>
+            <w:proofErr w:type="spellStart"/>
+            <w:r>
+              <w:rPr>
+                <w:rFonts w:ascii="Times New Roman" w:hAnsi="Times New Roman" w:cs="Times New Roman"/>
+                <w:i/>
+                <w:color w:val="065F46"/>
+                <w:sz w:val="24"/>
+                <w:szCs w:val="24"/>
+              </w:rPr>
+            </w:r>
+            <w:proofErr w:type="spellEnd"/>
+            <w:r>
+              <w:rPr>
+                <w:rFonts w:ascii="Times New Roman" w:hAnsi="Times New Roman" w:cs="Times New Roman"/>
+                <w:i/>
+                <w:color w:val="065F46"/>
+                <w:sz w:val="24"/>
+                <w:szCs w:val="24"/>
+              </w:rPr>
+            </w:r>
+            <w:r>
+              <w:t>{{item.vi_tri}}</w:t>
+            </w:r>
+            <w:r>
+              <w:t>{% endfor %}</w:t>
+            </w:r>
           </w:p>
         </w:tc>
       </w:tr>
@@ -13156,6 +13618,7 @@
       <w:tblPr>
         <w:tblStyle w:val="TableGrid"/>
         <w:tblW w:w="0" w:type="auto"/>
+        <w:tblLayout w:type="autofit"/>
         <w:tblLook w:val="04A0" w:firstRow="1" w:lastRow="0" w:firstColumn="1" w:lastColumn="0" w:noHBand="0" w:noVBand="1"/>
       </w:tblPr>
       <w:tblGrid>
@@ -13415,7 +13878,17 @@
               </w:rPr>
             </w:pPr>
             <w:r>
-              <w:t>{% for item in camera %}{{item.idx}}</w:t>
+              <w:rPr>
+                <w:rFonts w:ascii="Times New Roman" w:hAnsi="Times New Roman" w:cs="Times New Roman"/>
+                <w:sz w:val="24"/>
+                <w:szCs w:val="24"/>
+              </w:rPr>
+            </w:r>
+            <w:r>
+              <w:t>{% for item in camera %}</w:t>
+            </w:r>
+            <w:r>
+              <w:t>{{item.idx}}</w:t>
             </w:r>
           </w:p>
         </w:tc>
@@ -13439,6 +13912,15 @@
               </w:rPr>
             </w:pPr>
             <w:r>
+              <w:rPr>
+                <w:rFonts w:ascii="Times New Roman" w:hAnsi="Times New Roman" w:cs="Times New Roman"/>
+                <w:i/>
+                <w:color w:val="065F46"/>
+                <w:sz w:val="24"/>
+                <w:szCs w:val="24"/>
+              </w:rPr>
+            </w:r>
+            <w:r>
               <w:t>{{item.hang_san_xuat}}</w:t>
             </w:r>
           </w:p>
@@ -13463,6 +13945,15 @@
               </w:rPr>
             </w:pPr>
             <w:r>
+              <w:rPr>
+                <w:rFonts w:ascii="Times New Roman" w:hAnsi="Times New Roman" w:cs="Times New Roman"/>
+                <w:i/>
+                <w:color w:val="065F46"/>
+                <w:sz w:val="24"/>
+                <w:szCs w:val="24"/>
+              </w:rPr>
+            </w:r>
+            <w:r>
               <w:t>{{item.model}}</w:t>
             </w:r>
           </w:p>
@@ -13487,6 +13978,15 @@
               </w:rPr>
             </w:pPr>
             <w:r>
+              <w:rPr>
+                <w:rFonts w:ascii="Times New Roman" w:hAnsi="Times New Roman" w:cs="Times New Roman"/>
+                <w:i/>
+                <w:color w:val="065F46"/>
+                <w:sz w:val="24"/>
+                <w:szCs w:val="24"/>
+              </w:rPr>
+            </w:r>
+            <w:r>
               <w:t>{{item.so_serial}}</w:t>
             </w:r>
           </w:p>
@@ -13511,6 +14011,15 @@
               </w:rPr>
             </w:pPr>
             <w:r>
+              <w:rPr>
+                <w:rFonts w:ascii="Times New Roman" w:hAnsi="Times New Roman" w:cs="Times New Roman"/>
+                <w:i/>
+                <w:color w:val="065F46"/>
+                <w:sz w:val="24"/>
+                <w:szCs w:val="24"/>
+              </w:rPr>
+            </w:r>
+            <w:r>
               <w:t>{{item.do_phan_giai}}</w:t>
             </w:r>
           </w:p>
@@ -13534,6 +14043,97 @@
                 <w:szCs w:val="24"/>
               </w:rPr>
             </w:pPr>
+            <w:proofErr w:type="spellStart"/>
+            <w:r>
+              <w:rPr>
+                <w:rFonts w:ascii="Times New Roman" w:hAnsi="Times New Roman" w:cs="Times New Roman"/>
+                <w:i/>
+                <w:color w:val="065F46"/>
+                <w:sz w:val="24"/>
+                <w:szCs w:val="24"/>
+              </w:rPr>
+            </w:r>
+            <w:proofErr w:type="spellEnd"/>
+            <w:r>
+              <w:rPr>
+                <w:rFonts w:ascii="Times New Roman" w:hAnsi="Times New Roman" w:cs="Times New Roman"/>
+                <w:i/>
+                <w:color w:val="065F46"/>
+                <w:sz w:val="24"/>
+                <w:szCs w:val="24"/>
+              </w:rPr>
+            </w:r>
+            <w:proofErr w:type="spellStart"/>
+            <w:r>
+              <w:rPr>
+                <w:rFonts w:ascii="Times New Roman" w:hAnsi="Times New Roman" w:cs="Times New Roman"/>
+                <w:i/>
+                <w:color w:val="065F46"/>
+                <w:sz w:val="24"/>
+                <w:szCs w:val="24"/>
+              </w:rPr>
+            </w:r>
+            <w:proofErr w:type="spellEnd"/>
+            <w:r>
+              <w:rPr>
+                <w:rFonts w:ascii="Times New Roman" w:hAnsi="Times New Roman" w:cs="Times New Roman"/>
+                <w:i/>
+                <w:color w:val="065F46"/>
+                <w:sz w:val="24"/>
+                <w:szCs w:val="24"/>
+              </w:rPr>
+            </w:r>
+            <w:proofErr w:type="spellStart"/>
+            <w:r>
+              <w:rPr>
+                <w:rFonts w:ascii="Times New Roman" w:hAnsi="Times New Roman" w:cs="Times New Roman"/>
+                <w:i/>
+                <w:color w:val="065F46"/>
+                <w:sz w:val="24"/>
+                <w:szCs w:val="24"/>
+              </w:rPr>
+            </w:r>
+            <w:proofErr w:type="spellEnd"/>
+            <w:r>
+              <w:rPr>
+                <w:rFonts w:ascii="Times New Roman" w:hAnsi="Times New Roman" w:cs="Times New Roman"/>
+                <w:i/>
+                <w:color w:val="065F46"/>
+                <w:sz w:val="24"/>
+                <w:szCs w:val="24"/>
+              </w:rPr>
+            </w:r>
+            <w:proofErr w:type="spellStart"/>
+            <w:r>
+              <w:rPr>
+                <w:rFonts w:ascii="Times New Roman" w:hAnsi="Times New Roman" w:cs="Times New Roman"/>
+                <w:i/>
+                <w:color w:val="065F46"/>
+                <w:sz w:val="24"/>
+                <w:szCs w:val="24"/>
+              </w:rPr>
+            </w:r>
+            <w:proofErr w:type="spellEnd"/>
+            <w:r>
+              <w:rPr>
+                <w:rFonts w:ascii="Times New Roman" w:hAnsi="Times New Roman" w:cs="Times New Roman"/>
+                <w:i/>
+                <w:color w:val="065F46"/>
+                <w:sz w:val="24"/>
+                <w:szCs w:val="24"/>
+              </w:rPr>
+            </w:r>
+            <w:proofErr w:type="spellStart"/>
+            <w:r>
+              <w:rPr>
+                <w:rFonts w:ascii="Times New Roman" w:hAnsi="Times New Roman" w:cs="Times New Roman"/>
+                <w:i/>
+                <w:color w:val="065F46"/>
+                <w:sz w:val="24"/>
+                <w:szCs w:val="24"/>
+              </w:rPr>
+            </w:r>
+            <w:proofErr w:type="spellEnd"/>
             <w:r>
               <w:t>{{item.vi_tri}}</w:t>
             </w:r>
@@ -13561,7 +14161,99 @@
               </w:rPr>
             </w:pPr>
             <w:r>
-              <w:t>{{item.ghi_chu}}{% endfor %}</w:t>
+              <w:rPr>
+                <w:rFonts w:ascii="Times New Roman" w:hAnsi="Times New Roman" w:cs="Times New Roman"/>
+                <w:i/>
+                <w:color w:val="065F46"/>
+                <w:sz w:val="24"/>
+                <w:szCs w:val="24"/>
+              </w:rPr>
+            </w:r>
+            <w:proofErr w:type="spellStart"/>
+            <w:r>
+              <w:rPr>
+                <w:rFonts w:ascii="Times New Roman" w:hAnsi="Times New Roman" w:cs="Times New Roman"/>
+                <w:i/>
+                <w:color w:val="065F46"/>
+                <w:sz w:val="24"/>
+                <w:szCs w:val="24"/>
+              </w:rPr>
+            </w:r>
+            <w:proofErr w:type="spellEnd"/>
+            <w:r>
+              <w:rPr>
+                <w:rFonts w:ascii="Times New Roman" w:hAnsi="Times New Roman" w:cs="Times New Roman"/>
+                <w:i/>
+                <w:color w:val="065F46"/>
+                <w:sz w:val="24"/>
+                <w:szCs w:val="24"/>
+              </w:rPr>
+            </w:r>
+            <w:proofErr w:type="spellStart"/>
+            <w:r>
+              <w:rPr>
+                <w:rFonts w:ascii="Times New Roman" w:hAnsi="Times New Roman" w:cs="Times New Roman"/>
+                <w:i/>
+                <w:color w:val="065F46"/>
+                <w:sz w:val="24"/>
+                <w:szCs w:val="24"/>
+              </w:rPr>
+            </w:r>
+            <w:proofErr w:type="spellEnd"/>
+            <w:r>
+              <w:rPr>
+                <w:rFonts w:ascii="Times New Roman" w:hAnsi="Times New Roman" w:cs="Times New Roman"/>
+                <w:i/>
+                <w:color w:val="065F46"/>
+                <w:sz w:val="24"/>
+                <w:szCs w:val="24"/>
+              </w:rPr>
+            </w:r>
+            <w:proofErr w:type="spellStart"/>
+            <w:r>
+              <w:rPr>
+                <w:rFonts w:ascii="Times New Roman" w:hAnsi="Times New Roman" w:cs="Times New Roman"/>
+                <w:i/>
+                <w:color w:val="065F46"/>
+                <w:sz w:val="24"/>
+                <w:szCs w:val="24"/>
+              </w:rPr>
+            </w:r>
+            <w:proofErr w:type="spellEnd"/>
+            <w:r>
+              <w:rPr>
+                <w:rFonts w:ascii="Times New Roman" w:hAnsi="Times New Roman" w:cs="Times New Roman"/>
+                <w:i/>
+                <w:color w:val="065F46"/>
+                <w:sz w:val="24"/>
+                <w:szCs w:val="24"/>
+              </w:rPr>
+            </w:r>
+            <w:proofErr w:type="spellStart"/>
+            <w:r>
+              <w:rPr>
+                <w:rFonts w:ascii="Times New Roman" w:hAnsi="Times New Roman" w:cs="Times New Roman"/>
+                <w:i/>
+                <w:color w:val="065F46"/>
+                <w:sz w:val="24"/>
+                <w:szCs w:val="24"/>
+              </w:rPr>
+            </w:r>
+            <w:proofErr w:type="spellEnd"/>
+            <w:r>
+              <w:rPr>
+                <w:rFonts w:ascii="Times New Roman" w:hAnsi="Times New Roman" w:cs="Times New Roman"/>
+                <w:i/>
+                <w:color w:val="065F46"/>
+                <w:sz w:val="24"/>
+                <w:szCs w:val="24"/>
+              </w:rPr>
+            </w:r>
+            <w:r>
+              <w:t>{{item.ghi_chu}}</w:t>
+            </w:r>
+            <w:r>
+              <w:t>{% endfor %}</w:t>
             </w:r>
           </w:p>
         </w:tc>
@@ -15118,6 +15810,7 @@
       <w:tblPr>
         <w:tblStyle w:val="TableGrid"/>
         <w:tblW w:w="0" w:type="auto"/>
+        <w:tblLayout w:type="autofit"/>
         <w:tblLook w:val="04A0" w:firstRow="1" w:lastRow="0" w:firstColumn="1" w:lastColumn="0" w:noHBand="0" w:noVBand="1"/>
       </w:tblPr>
       <w:tblGrid>
@@ -15278,7 +15971,17 @@
               </w:rPr>
             </w:pPr>
             <w:r>
-              <w:t>{% for item in ip_tinh %}{{item.idx}}</w:t>
+              <w:rPr>
+                <w:rFonts w:ascii="Times New Roman" w:hAnsi="Times New Roman" w:cs="Times New Roman"/>
+                <w:sz w:val="24"/>
+                <w:szCs w:val="24"/>
+              </w:rPr>
+            </w:r>
+            <w:r>
+              <w:t>{% for item in ip_tinh %}</w:t>
+            </w:r>
+            <w:r>
+              <w:t>{{item.idx}}</w:t>
             </w:r>
           </w:p>
         </w:tc>
@@ -15302,6 +16005,15 @@
               </w:rPr>
             </w:pPr>
             <w:r>
+              <w:rPr>
+                <w:rFonts w:ascii="Times New Roman" w:hAnsi="Times New Roman" w:cs="Times New Roman"/>
+                <w:i/>
+                <w:color w:val="065F46"/>
+                <w:sz w:val="24"/>
+                <w:szCs w:val="24"/>
+              </w:rPr>
+            </w:r>
+            <w:r>
               <w:t>{{item.ten_thiet_bi}}</w:t>
             </w:r>
           </w:p>
@@ -15325,6 +16037,15 @@
                 <w:szCs w:val="24"/>
               </w:rPr>
             </w:pPr>
+            <w:r>
+              <w:rPr>
+                <w:rFonts w:ascii="Times New Roman" w:hAnsi="Times New Roman" w:cs="Times New Roman"/>
+                <w:i/>
+                <w:color w:val="065F46"/>
+                <w:sz w:val="24"/>
+                <w:szCs w:val="24"/>
+              </w:rPr>
+            </w:r>
             <w:r>
               <w:t>{{item.dia_chi_ip}}</w:t>
             </w:r>
@@ -15352,18 +16073,60 @@
               </w:rPr>
             </w:pPr>
             <w:r>
-              <w:t>{{item.ghi_chu}}{% endfor %}</w:t>
-            </w:r>
-          </w:p>
-          <w:p>
-            <w:pPr>
-              <w:rPr>
-                <w:rFonts w:ascii="Times New Roman" w:hAnsi="Times New Roman" w:cs="Times New Roman"/>
-                <w:sz w:val="24"/>
-                <w:szCs w:val="24"/>
-              </w:rPr>
-            </w:pPr>
-            <w:r/>
+              <w:rPr>
+                <w:rFonts w:ascii="Times New Roman" w:hAnsi="Times New Roman" w:cs="Times New Roman"/>
+                <w:i/>
+                <w:color w:val="065F46"/>
+                <w:sz w:val="24"/>
+                <w:szCs w:val="24"/>
+              </w:rPr>
+            </w:r>
+            <w:proofErr w:type="spellStart"/>
+            <w:r>
+              <w:rPr>
+                <w:rFonts w:ascii="Times New Roman" w:hAnsi="Times New Roman" w:cs="Times New Roman"/>
+                <w:i/>
+                <w:color w:val="065F46"/>
+                <w:sz w:val="24"/>
+                <w:szCs w:val="24"/>
+              </w:rPr>
+            </w:r>
+            <w:proofErr w:type="spellEnd"/>
+            <w:r>
+              <w:rPr>
+                <w:rFonts w:ascii="Times New Roman" w:hAnsi="Times New Roman" w:cs="Times New Roman"/>
+                <w:i/>
+                <w:color w:val="065F46"/>
+                <w:sz w:val="24"/>
+                <w:szCs w:val="24"/>
+              </w:rPr>
+            </w:r>
+            <w:proofErr w:type="spellStart"/>
+            <w:r>
+              <w:rPr>
+                <w:rFonts w:ascii="Times New Roman" w:hAnsi="Times New Roman" w:cs="Times New Roman"/>
+                <w:i/>
+                <w:color w:val="065F46"/>
+                <w:sz w:val="24"/>
+                <w:szCs w:val="24"/>
+              </w:rPr>
+            </w:r>
+            <w:proofErr w:type="spellEnd"/>
+            <w:r>
+              <w:rPr>
+                <w:rFonts w:ascii="Times New Roman" w:hAnsi="Times New Roman" w:cs="Times New Roman"/>
+                <w:i/>
+                <w:color w:val="065F46"/>
+                <w:sz w:val="24"/>
+                <w:szCs w:val="24"/>
+              </w:rPr>
+            </w:r>
+            <w:r>
+              <w:t>{{item.ghi_chu}}</w:t>
+            </w:r>
+            <w:r>
+              <w:t>{% endfor %}</w:t>
+            </w:r>
           </w:p>
         </w:tc>
       </w:tr>
@@ -16124,6 +16887,7 @@
       <w:tblPr>
         <w:tblStyle w:val="TableGrid"/>
         <w:tblW w:w="0" w:type="auto"/>
+        <w:tblLayout w:type="autofit"/>
         <w:tblLook w:val="04A0" w:firstRow="1" w:lastRow="0" w:firstColumn="1" w:lastColumn="0" w:noHBand="0" w:noVBand="1"/>
       </w:tblPr>
       <w:tblGrid>
@@ -16383,7 +17147,17 @@
               </w:rPr>
             </w:pPr>
             <w:r>
-              <w:t>{% for item in ung_dung %}{{item.idx}}</w:t>
+              <w:rPr>
+                <w:rFonts w:ascii="Times New Roman" w:hAnsi="Times New Roman" w:cs="Times New Roman"/>
+                <w:sz w:val="24"/>
+                <w:szCs w:val="24"/>
+              </w:rPr>
+            </w:r>
+            <w:r>
+              <w:t>{% for item in ung_dung %}</w:t>
+            </w:r>
+            <w:r>
+              <w:t>{{item.idx}}</w:t>
             </w:r>
           </w:p>
         </w:tc>
@@ -16406,6 +17180,37 @@
                 <w:szCs w:val="24"/>
               </w:rPr>
             </w:pPr>
+            <w:proofErr w:type="spellStart"/>
+            <w:r>
+              <w:rPr>
+                <w:rFonts w:ascii="Times New Roman" w:hAnsi="Times New Roman" w:cs="Times New Roman"/>
+                <w:i/>
+                <w:color w:val="065F46"/>
+                <w:sz w:val="24"/>
+                <w:szCs w:val="24"/>
+              </w:rPr>
+            </w:r>
+            <w:proofErr w:type="spellEnd"/>
+            <w:r>
+              <w:rPr>
+                <w:rFonts w:ascii="Times New Roman" w:hAnsi="Times New Roman" w:cs="Times New Roman"/>
+                <w:i/>
+                <w:color w:val="065F46"/>
+                <w:sz w:val="24"/>
+                <w:szCs w:val="24"/>
+              </w:rPr>
+            </w:r>
+            <w:proofErr w:type="spellStart"/>
+            <w:r>
+              <w:rPr>
+                <w:rFonts w:ascii="Times New Roman" w:hAnsi="Times New Roman" w:cs="Times New Roman"/>
+                <w:i/>
+                <w:color w:val="065F46"/>
+                <w:sz w:val="24"/>
+                <w:szCs w:val="24"/>
+              </w:rPr>
+            </w:r>
+            <w:proofErr w:type="spellEnd"/>
             <w:r>
               <w:t>{{item.ten}}</w:t>
             </w:r>
@@ -16430,6 +17235,197 @@
                 <w:szCs w:val="24"/>
               </w:rPr>
             </w:pPr>
+            <w:proofErr w:type="spellStart"/>
+            <w:r>
+              <w:rPr>
+                <w:rFonts w:ascii="Times New Roman" w:hAnsi="Times New Roman" w:cs="Times New Roman"/>
+                <w:i/>
+                <w:color w:val="065F46"/>
+                <w:sz w:val="24"/>
+                <w:szCs w:val="24"/>
+              </w:rPr>
+            </w:r>
+            <w:proofErr w:type="spellEnd"/>
+            <w:r>
+              <w:rPr>
+                <w:rFonts w:ascii="Times New Roman" w:hAnsi="Times New Roman" w:cs="Times New Roman"/>
+                <w:i/>
+                <w:color w:val="065F46"/>
+                <w:sz w:val="24"/>
+                <w:szCs w:val="24"/>
+              </w:rPr>
+            </w:r>
+            <w:proofErr w:type="spellStart"/>
+            <w:r>
+              <w:rPr>
+                <w:rFonts w:ascii="Times New Roman" w:hAnsi="Times New Roman" w:cs="Times New Roman"/>
+                <w:i/>
+                <w:color w:val="065F46"/>
+                <w:sz w:val="24"/>
+                <w:szCs w:val="24"/>
+              </w:rPr>
+            </w:r>
+            <w:proofErr w:type="spellEnd"/>
+            <w:r>
+              <w:rPr>
+                <w:rFonts w:ascii="Times New Roman" w:hAnsi="Times New Roman" w:cs="Times New Roman"/>
+                <w:i/>
+                <w:color w:val="065F46"/>
+                <w:sz w:val="24"/>
+                <w:szCs w:val="24"/>
+              </w:rPr>
+            </w:r>
+            <w:proofErr w:type="spellStart"/>
+            <w:r>
+              <w:rPr>
+                <w:rFonts w:ascii="Times New Roman" w:hAnsi="Times New Roman" w:cs="Times New Roman"/>
+                <w:i/>
+                <w:color w:val="065F46"/>
+                <w:sz w:val="24"/>
+                <w:szCs w:val="24"/>
+              </w:rPr>
+            </w:r>
+            <w:proofErr w:type="spellEnd"/>
+            <w:r>
+              <w:rPr>
+                <w:rFonts w:ascii="Times New Roman" w:hAnsi="Times New Roman" w:cs="Times New Roman"/>
+                <w:i/>
+                <w:color w:val="065F46"/>
+                <w:sz w:val="24"/>
+                <w:szCs w:val="24"/>
+              </w:rPr>
+            </w:r>
+            <w:proofErr w:type="spellStart"/>
+            <w:r>
+              <w:rPr>
+                <w:rFonts w:ascii="Times New Roman" w:hAnsi="Times New Roman" w:cs="Times New Roman"/>
+                <w:i/>
+                <w:color w:val="065F46"/>
+                <w:sz w:val="24"/>
+                <w:szCs w:val="24"/>
+              </w:rPr>
+            </w:r>
+            <w:proofErr w:type="spellEnd"/>
+            <w:r>
+              <w:rPr>
+                <w:rFonts w:ascii="Times New Roman" w:hAnsi="Times New Roman" w:cs="Times New Roman"/>
+                <w:i/>
+                <w:color w:val="065F46"/>
+                <w:sz w:val="24"/>
+                <w:szCs w:val="24"/>
+              </w:rPr>
+            </w:r>
+            <w:proofErr w:type="spellStart"/>
+            <w:r>
+              <w:rPr>
+                <w:rFonts w:ascii="Times New Roman" w:hAnsi="Times New Roman" w:cs="Times New Roman"/>
+                <w:i/>
+                <w:color w:val="065F46"/>
+                <w:sz w:val="24"/>
+                <w:szCs w:val="24"/>
+              </w:rPr>
+            </w:r>
+            <w:proofErr w:type="spellEnd"/>
+            <w:r>
+              <w:rPr>
+                <w:rFonts w:ascii="Times New Roman" w:hAnsi="Times New Roman" w:cs="Times New Roman"/>
+                <w:i/>
+                <w:color w:val="065F46"/>
+                <w:sz w:val="24"/>
+                <w:szCs w:val="24"/>
+              </w:rPr>
+            </w:r>
+            <w:proofErr w:type="spellStart"/>
+            <w:r>
+              <w:rPr>
+                <w:rFonts w:ascii="Times New Roman" w:hAnsi="Times New Roman" w:cs="Times New Roman"/>
+                <w:i/>
+                <w:color w:val="065F46"/>
+                <w:sz w:val="24"/>
+                <w:szCs w:val="24"/>
+              </w:rPr>
+            </w:r>
+            <w:proofErr w:type="spellEnd"/>
+            <w:r>
+              <w:rPr>
+                <w:rFonts w:ascii="Times New Roman" w:hAnsi="Times New Roman" w:cs="Times New Roman"/>
+                <w:i/>
+                <w:color w:val="065F46"/>
+                <w:sz w:val="24"/>
+                <w:szCs w:val="24"/>
+              </w:rPr>
+            </w:r>
+            <w:proofErr w:type="spellStart"/>
+            <w:r>
+              <w:rPr>
+                <w:rFonts w:ascii="Times New Roman" w:hAnsi="Times New Roman" w:cs="Times New Roman"/>
+                <w:i/>
+                <w:color w:val="065F46"/>
+                <w:sz w:val="24"/>
+                <w:szCs w:val="24"/>
+              </w:rPr>
+            </w:r>
+            <w:proofErr w:type="spellEnd"/>
+            <w:r>
+              <w:rPr>
+                <w:rFonts w:ascii="Times New Roman" w:hAnsi="Times New Roman" w:cs="Times New Roman"/>
+                <w:i/>
+                <w:color w:val="065F46"/>
+                <w:sz w:val="24"/>
+                <w:szCs w:val="24"/>
+              </w:rPr>
+            </w:r>
+            <w:proofErr w:type="spellStart"/>
+            <w:r>
+              <w:rPr>
+                <w:rFonts w:ascii="Times New Roman" w:hAnsi="Times New Roman" w:cs="Times New Roman"/>
+                <w:i/>
+                <w:color w:val="065F46"/>
+                <w:sz w:val="24"/>
+                <w:szCs w:val="24"/>
+              </w:rPr>
+            </w:r>
+            <w:proofErr w:type="spellEnd"/>
+            <w:r>
+              <w:rPr>
+                <w:rFonts w:ascii="Times New Roman" w:hAnsi="Times New Roman" w:cs="Times New Roman"/>
+                <w:i/>
+                <w:color w:val="065F46"/>
+                <w:sz w:val="24"/>
+                <w:szCs w:val="24"/>
+              </w:rPr>
+            </w:r>
+            <w:proofErr w:type="spellStart"/>
+            <w:r>
+              <w:rPr>
+                <w:rFonts w:ascii="Times New Roman" w:hAnsi="Times New Roman" w:cs="Times New Roman"/>
+                <w:i/>
+                <w:color w:val="065F46"/>
+                <w:sz w:val="24"/>
+                <w:szCs w:val="24"/>
+              </w:rPr>
+            </w:r>
+            <w:proofErr w:type="spellEnd"/>
+            <w:r>
+              <w:rPr>
+                <w:rFonts w:ascii="Times New Roman" w:hAnsi="Times New Roman" w:cs="Times New Roman"/>
+                <w:i/>
+                <w:color w:val="065F46"/>
+                <w:sz w:val="24"/>
+                <w:szCs w:val="24"/>
+              </w:rPr>
+            </w:r>
+            <w:proofErr w:type="spellStart"/>
+            <w:r>
+              <w:rPr>
+                <w:rFonts w:ascii="Times New Roman" w:hAnsi="Times New Roman" w:cs="Times New Roman"/>
+                <w:i/>
+                <w:color w:val="065F46"/>
+                <w:sz w:val="24"/>
+                <w:szCs w:val="24"/>
+              </w:rPr>
+            </w:r>
+            <w:proofErr w:type="spellEnd"/>
             <w:r>
               <w:t>{{item.chuc_nang}}</w:t>
             </w:r>
@@ -16455,6 +17451,46 @@
               </w:rPr>
             </w:pPr>
             <w:r>
+              <w:rPr>
+                <w:rFonts w:ascii="Times New Roman" w:hAnsi="Times New Roman" w:cs="Times New Roman"/>
+                <w:i/>
+                <w:color w:val="065F46"/>
+                <w:sz w:val="24"/>
+                <w:szCs w:val="24"/>
+              </w:rPr>
+            </w:r>
+            <w:proofErr w:type="spellStart"/>
+            <w:r>
+              <w:rPr>
+                <w:rFonts w:ascii="Times New Roman" w:hAnsi="Times New Roman" w:cs="Times New Roman"/>
+                <w:i/>
+                <w:color w:val="065F46"/>
+                <w:sz w:val="24"/>
+                <w:szCs w:val="24"/>
+              </w:rPr>
+            </w:r>
+            <w:proofErr w:type="spellEnd"/>
+            <w:r>
+              <w:rPr>
+                <w:rFonts w:ascii="Times New Roman" w:hAnsi="Times New Roman" w:cs="Times New Roman"/>
+                <w:i/>
+                <w:color w:val="065F46"/>
+                <w:sz w:val="24"/>
+                <w:szCs w:val="24"/>
+              </w:rPr>
+            </w:r>
+            <w:proofErr w:type="spellStart"/>
+            <w:r>
+              <w:rPr>
+                <w:rFonts w:ascii="Times New Roman" w:hAnsi="Times New Roman" w:cs="Times New Roman"/>
+                <w:i/>
+                <w:color w:val="065F46"/>
+                <w:sz w:val="24"/>
+                <w:szCs w:val="24"/>
+              </w:rPr>
+            </w:r>
+            <w:proofErr w:type="spellEnd"/>
+            <w:r>
               <w:t>{{item.don_vi_cung_cap}}</w:t>
             </w:r>
           </w:p>
@@ -16479,6 +17515,15 @@
               </w:rPr>
             </w:pPr>
             <w:r>
+              <w:rPr>
+                <w:rFonts w:ascii="Times New Roman" w:hAnsi="Times New Roman" w:cs="Times New Roman"/>
+                <w:i/>
+                <w:color w:val="065F46"/>
+                <w:sz w:val="24"/>
+                <w:szCs w:val="24"/>
+              </w:rPr>
+            </w:r>
+            <w:r>
               <w:t>{{item.phien_ban}}</w:t>
             </w:r>
           </w:p>
@@ -16502,6 +17547,26 @@
                 <w:szCs w:val="24"/>
               </w:rPr>
             </w:pPr>
+            <w:proofErr w:type="spellStart"/>
+            <w:r>
+              <w:rPr>
+                <w:rFonts w:ascii="Times New Roman" w:hAnsi="Times New Roman" w:cs="Times New Roman"/>
+                <w:i/>
+                <w:color w:val="065F46"/>
+                <w:sz w:val="24"/>
+                <w:szCs w:val="24"/>
+              </w:rPr>
+            </w:r>
+            <w:proofErr w:type="spellEnd"/>
+            <w:r>
+              <w:rPr>
+                <w:rFonts w:ascii="Times New Roman" w:hAnsi="Times New Roman" w:cs="Times New Roman"/>
+                <w:i/>
+                <w:color w:val="065F46"/>
+                <w:sz w:val="24"/>
+                <w:szCs w:val="24"/>
+              </w:rPr>
+            </w:r>
             <w:r>
               <w:t>{{item.ket_noi_internet}}</w:t>
             </w:r>
@@ -16529,7 +17594,59 @@
               </w:rPr>
             </w:pPr>
             <w:r>
-              <w:t>{{item.ghi_chu}}{% endfor %}</w:t>
+              <w:rPr>
+                <w:rFonts w:ascii="Times New Roman" w:hAnsi="Times New Roman" w:cs="Times New Roman"/>
+                <w:i/>
+                <w:color w:val="065F46"/>
+                <w:sz w:val="24"/>
+                <w:szCs w:val="24"/>
+              </w:rPr>
+            </w:r>
+            <w:proofErr w:type="spellStart"/>
+            <w:r>
+              <w:rPr>
+                <w:rFonts w:ascii="Times New Roman" w:hAnsi="Times New Roman" w:cs="Times New Roman"/>
+                <w:i/>
+                <w:color w:val="065F46"/>
+                <w:sz w:val="24"/>
+                <w:szCs w:val="24"/>
+              </w:rPr>
+            </w:r>
+            <w:proofErr w:type="spellEnd"/>
+            <w:r>
+              <w:rPr>
+                <w:rFonts w:ascii="Times New Roman" w:hAnsi="Times New Roman" w:cs="Times New Roman"/>
+                <w:i/>
+                <w:color w:val="065F46"/>
+                <w:sz w:val="24"/>
+                <w:szCs w:val="24"/>
+              </w:rPr>
+            </w:r>
+            <w:proofErr w:type="spellStart"/>
+            <w:r>
+              <w:rPr>
+                <w:rFonts w:ascii="Times New Roman" w:hAnsi="Times New Roman" w:cs="Times New Roman"/>
+                <w:i/>
+                <w:color w:val="065F46"/>
+                <w:sz w:val="24"/>
+                <w:szCs w:val="24"/>
+              </w:rPr>
+            </w:r>
+            <w:proofErr w:type="spellEnd"/>
+            <w:r>
+              <w:rPr>
+                <w:rFonts w:ascii="Times New Roman" w:hAnsi="Times New Roman" w:cs="Times New Roman"/>
+                <w:i/>
+                <w:color w:val="065F46"/>
+                <w:sz w:val="24"/>
+                <w:szCs w:val="24"/>
+              </w:rPr>
+            </w:r>
+            <w:r>
+              <w:t>{{item.ghi_chu}}</w:t>
+            </w:r>
+            <w:r>
+              <w:t>{% endfor %}</w:t>
             </w:r>
           </w:p>
         </w:tc>
@@ -18583,6 +19700,7 @@
       <w:tblPr>
         <w:tblStyle w:val="TableGrid"/>
         <w:tblW w:w="0" w:type="auto"/>
+        <w:tblLayout w:type="autofit"/>
         <w:tblLook w:val="04A0" w:firstRow="1" w:lastRow="0" w:firstColumn="1" w:lastColumn="0" w:noHBand="0" w:noVBand="1"/>
       </w:tblPr>
       <w:tblGrid>
@@ -18743,7 +19861,17 @@
               </w:rPr>
             </w:pPr>
             <w:r>
-              <w:t>{% for item in K_van_ban %}{{item.idx}}</w:t>
+              <w:rPr>
+                <w:rFonts w:ascii="Times New Roman" w:hAnsi="Times New Roman" w:cs="Times New Roman"/>
+                <w:sz w:val="24"/>
+                <w:szCs w:val="24"/>
+              </w:rPr>
+            </w:r>
+            <w:r>
+              <w:t>{% for item in K_van_ban %}</w:t>
+            </w:r>
+            <w:r>
+              <w:t>{{item.idx}}</w:t>
             </w:r>
           </w:p>
         </w:tc>
@@ -18767,6 +19895,13 @@
               </w:rPr>
             </w:pPr>
             <w:r>
+              <w:rPr>
+                <w:rFonts w:ascii="Times New Roman" w:hAnsi="Times New Roman" w:cs="Times New Roman"/>
+                <w:sz w:val="24"/>
+                <w:szCs w:val="24"/>
+              </w:rPr>
+            </w:r>
+            <w:r>
               <w:t>{{item.loai}}</w:t>
             </w:r>
           </w:p>
@@ -18791,6 +19926,55 @@
               </w:rPr>
             </w:pPr>
             <w:r>
+              <w:rPr>
+                <w:rFonts w:ascii="Times New Roman" w:hAnsi="Times New Roman" w:cs="Times New Roman"/>
+                <w:i/>
+                <w:color w:val="065F46"/>
+                <w:sz w:val="24"/>
+                <w:szCs w:val="24"/>
+              </w:rPr>
+            </w:r>
+            <w:proofErr w:type="spellStart"/>
+            <w:r>
+              <w:rPr>
+                <w:rFonts w:ascii="Times New Roman" w:hAnsi="Times New Roman" w:cs="Times New Roman"/>
+                <w:i/>
+                <w:color w:val="065F46"/>
+                <w:sz w:val="24"/>
+                <w:szCs w:val="24"/>
+              </w:rPr>
+            </w:r>
+            <w:proofErr w:type="spellEnd"/>
+            <w:r>
+              <w:rPr>
+                <w:rFonts w:ascii="Times New Roman" w:hAnsi="Times New Roman" w:cs="Times New Roman"/>
+                <w:i/>
+                <w:color w:val="065F46"/>
+                <w:sz w:val="24"/>
+                <w:szCs w:val="24"/>
+              </w:rPr>
+            </w:r>
+            <w:proofErr w:type="spellStart"/>
+            <w:r>
+              <w:rPr>
+                <w:rFonts w:ascii="Times New Roman" w:hAnsi="Times New Roman" w:cs="Times New Roman"/>
+                <w:i/>
+                <w:color w:val="065F46"/>
+                <w:sz w:val="24"/>
+                <w:szCs w:val="24"/>
+              </w:rPr>
+            </w:r>
+            <w:proofErr w:type="spellEnd"/>
+            <w:r>
+              <w:rPr>
+                <w:rFonts w:ascii="Times New Roman" w:hAnsi="Times New Roman" w:cs="Times New Roman"/>
+                <w:i/>
+                <w:color w:val="065F46"/>
+                <w:sz w:val="24"/>
+                <w:szCs w:val="24"/>
+              </w:rPr>
+            </w:r>
+            <w:r>
               <w:t>{{item.so_vb}}</w:t>
             </w:r>
           </w:p>
@@ -18814,8 +19998,71 @@
                 <w:szCs w:val="24"/>
               </w:rPr>
             </w:pPr>
-            <w:r>
-              <w:t>{{item.ghi_chu}}{% endfor %}</w:t>
+            <w:proofErr w:type="spellStart"/>
+            <w:r>
+              <w:rPr>
+                <w:rFonts w:ascii="Times New Roman" w:hAnsi="Times New Roman" w:cs="Times New Roman"/>
+                <w:i/>
+                <w:color w:val="065F46"/>
+                <w:sz w:val="24"/>
+                <w:szCs w:val="24"/>
+              </w:rPr>
+            </w:r>
+            <w:proofErr w:type="spellEnd"/>
+            <w:r>
+              <w:rPr>
+                <w:rFonts w:ascii="Times New Roman" w:hAnsi="Times New Roman" w:cs="Times New Roman"/>
+                <w:i/>
+                <w:color w:val="065F46"/>
+                <w:sz w:val="24"/>
+                <w:szCs w:val="24"/>
+              </w:rPr>
+            </w:r>
+            <w:proofErr w:type="spellStart"/>
+            <w:r>
+              <w:rPr>
+                <w:rFonts w:ascii="Times New Roman" w:hAnsi="Times New Roman" w:cs="Times New Roman"/>
+                <w:i/>
+                <w:color w:val="065F46"/>
+                <w:sz w:val="24"/>
+                <w:szCs w:val="24"/>
+              </w:rPr>
+            </w:r>
+            <w:proofErr w:type="spellEnd"/>
+            <w:r>
+              <w:rPr>
+                <w:rFonts w:ascii="Times New Roman" w:hAnsi="Times New Roman" w:cs="Times New Roman"/>
+                <w:i/>
+                <w:color w:val="065F46"/>
+                <w:sz w:val="24"/>
+                <w:szCs w:val="24"/>
+              </w:rPr>
+            </w:r>
+            <w:proofErr w:type="spellStart"/>
+            <w:r>
+              <w:rPr>
+                <w:rFonts w:ascii="Times New Roman" w:hAnsi="Times New Roman" w:cs="Times New Roman"/>
+                <w:i/>
+                <w:color w:val="065F46"/>
+                <w:sz w:val="24"/>
+                <w:szCs w:val="24"/>
+              </w:rPr>
+            </w:r>
+            <w:proofErr w:type="spellEnd"/>
+            <w:r>
+              <w:rPr>
+                <w:rFonts w:ascii="Times New Roman" w:hAnsi="Times New Roman" w:cs="Times New Roman"/>
+                <w:i/>
+                <w:color w:val="065F46"/>
+                <w:sz w:val="24"/>
+                <w:szCs w:val="24"/>
+              </w:rPr>
+            </w:r>
+            <w:r>
+              <w:t>{{item.ghi_chu}}</w:t>
+            </w:r>
+            <w:r>
+              <w:t>{% endfor %}</w:t>
             </w:r>
           </w:p>
         </w:tc>
@@ -24530,6 +25777,7 @@
       <w:tblPr>
         <w:tblStyle w:val="TableGrid"/>
         <w:tblW w:w="0" w:type="auto"/>
+        <w:tblLayout w:type="autofit"/>
         <w:tblLook w:val="04A0" w:firstRow="1" w:lastRow="0" w:firstColumn="1" w:lastColumn="0" w:noHBand="0" w:noVBand="1"/>
       </w:tblPr>
       <w:tblGrid>
@@ -24778,7 +26026,17 @@
               </w:rPr>
             </w:pPr>
             <w:r>
-              <w:t>{% for item in dao_tao %}{{item.idx}}</w:t>
+              <w:rPr>
+                <w:rFonts w:ascii="Times New Roman" w:hAnsi="Times New Roman" w:cs="Times New Roman"/>
+                <w:sz w:val="24"/>
+                <w:szCs w:val="24"/>
+              </w:rPr>
+            </w:r>
+            <w:r>
+              <w:t>{% for item in dao_tao %}</w:t>
+            </w:r>
+            <w:r>
+              <w:t>{{item.idx}}</w:t>
             </w:r>
           </w:p>
         </w:tc>
@@ -24801,6 +26059,137 @@
                 <w:szCs w:val="24"/>
               </w:rPr>
             </w:pPr>
+            <w:proofErr w:type="spellStart"/>
+            <w:r>
+              <w:rPr>
+                <w:rFonts w:ascii="Times New Roman" w:hAnsi="Times New Roman" w:cs="Times New Roman"/>
+                <w:i/>
+                <w:color w:val="065F46"/>
+                <w:sz w:val="24"/>
+                <w:szCs w:val="24"/>
+              </w:rPr>
+            </w:r>
+            <w:proofErr w:type="spellEnd"/>
+            <w:r>
+              <w:rPr>
+                <w:rFonts w:ascii="Times New Roman" w:hAnsi="Times New Roman" w:cs="Times New Roman"/>
+                <w:i/>
+                <w:color w:val="065F46"/>
+                <w:sz w:val="24"/>
+                <w:szCs w:val="24"/>
+              </w:rPr>
+            </w:r>
+            <w:proofErr w:type="spellStart"/>
+            <w:r>
+              <w:rPr>
+                <w:rFonts w:ascii="Times New Roman" w:hAnsi="Times New Roman" w:cs="Times New Roman"/>
+                <w:i/>
+                <w:color w:val="065F46"/>
+                <w:sz w:val="24"/>
+                <w:szCs w:val="24"/>
+              </w:rPr>
+            </w:r>
+            <w:proofErr w:type="spellEnd"/>
+            <w:r>
+              <w:rPr>
+                <w:rFonts w:ascii="Times New Roman" w:hAnsi="Times New Roman" w:cs="Times New Roman"/>
+                <w:i/>
+                <w:color w:val="065F46"/>
+                <w:sz w:val="24"/>
+                <w:szCs w:val="24"/>
+              </w:rPr>
+            </w:r>
+            <w:proofErr w:type="gramStart"/>
+            <w:r>
+              <w:rPr>
+                <w:rFonts w:ascii="Times New Roman" w:hAnsi="Times New Roman" w:cs="Times New Roman"/>
+                <w:i/>
+                <w:color w:val="065F46"/>
+                <w:sz w:val="24"/>
+                <w:szCs w:val="24"/>
+              </w:rPr>
+            </w:r>
+            <w:proofErr w:type="gramEnd"/>
+            <w:r>
+              <w:rPr>
+                <w:rFonts w:ascii="Times New Roman" w:hAnsi="Times New Roman" w:cs="Times New Roman"/>
+                <w:i/>
+                <w:color w:val="065F46"/>
+                <w:sz w:val="24"/>
+                <w:szCs w:val="24"/>
+              </w:rPr>
+            </w:r>
+            <w:proofErr w:type="spellStart"/>
+            <w:r>
+              <w:rPr>
+                <w:rFonts w:ascii="Times New Roman" w:hAnsi="Times New Roman" w:cs="Times New Roman"/>
+                <w:i/>
+                <w:color w:val="065F46"/>
+                <w:sz w:val="24"/>
+                <w:szCs w:val="24"/>
+              </w:rPr>
+            </w:r>
+            <w:proofErr w:type="spellEnd"/>
+            <w:r>
+              <w:rPr>
+                <w:rFonts w:ascii="Times New Roman" w:hAnsi="Times New Roman" w:cs="Times New Roman"/>
+                <w:i/>
+                <w:color w:val="065F46"/>
+                <w:sz w:val="24"/>
+                <w:szCs w:val="24"/>
+              </w:rPr>
+            </w:r>
+            <w:proofErr w:type="spellStart"/>
+            <w:r>
+              <w:rPr>
+                <w:rFonts w:ascii="Times New Roman" w:hAnsi="Times New Roman" w:cs="Times New Roman"/>
+                <w:i/>
+                <w:color w:val="065F46"/>
+                <w:sz w:val="24"/>
+                <w:szCs w:val="24"/>
+              </w:rPr>
+            </w:r>
+            <w:proofErr w:type="spellEnd"/>
+            <w:r>
+              <w:rPr>
+                <w:rFonts w:ascii="Times New Roman" w:hAnsi="Times New Roman" w:cs="Times New Roman"/>
+                <w:i/>
+                <w:color w:val="065F46"/>
+                <w:sz w:val="24"/>
+                <w:szCs w:val="24"/>
+              </w:rPr>
+            </w:r>
+            <w:proofErr w:type="spellStart"/>
+            <w:r>
+              <w:rPr>
+                <w:rFonts w:ascii="Times New Roman" w:hAnsi="Times New Roman" w:cs="Times New Roman"/>
+                <w:i/>
+                <w:color w:val="065F46"/>
+                <w:sz w:val="24"/>
+                <w:szCs w:val="24"/>
+              </w:rPr>
+            </w:r>
+            <w:proofErr w:type="spellEnd"/>
+            <w:r>
+              <w:rPr>
+                <w:rFonts w:ascii="Times New Roman" w:hAnsi="Times New Roman" w:cs="Times New Roman"/>
+                <w:i/>
+                <w:color w:val="065F46"/>
+                <w:sz w:val="24"/>
+                <w:szCs w:val="24"/>
+              </w:rPr>
+            </w:r>
+            <w:proofErr w:type="spellStart"/>
+            <w:r>
+              <w:rPr>
+                <w:rFonts w:ascii="Times New Roman" w:hAnsi="Times New Roman" w:cs="Times New Roman"/>
+                <w:i/>
+                <w:color w:val="065F46"/>
+                <w:sz w:val="24"/>
+                <w:szCs w:val="24"/>
+              </w:rPr>
+            </w:r>
+            <w:proofErr w:type="spellEnd"/>
             <w:r>
               <w:t>{{item.hinh_thuc}}</w:t>
             </w:r>
@@ -24825,6 +26214,37 @@
                 <w:szCs w:val="24"/>
               </w:rPr>
             </w:pPr>
+            <w:proofErr w:type="spellStart"/>
+            <w:r>
+              <w:rPr>
+                <w:rFonts w:ascii="Times New Roman" w:hAnsi="Times New Roman" w:cs="Times New Roman"/>
+                <w:i/>
+                <w:color w:val="065F46"/>
+                <w:sz w:val="24"/>
+                <w:szCs w:val="24"/>
+              </w:rPr>
+            </w:r>
+            <w:proofErr w:type="spellEnd"/>
+            <w:r>
+              <w:rPr>
+                <w:rFonts w:ascii="Times New Roman" w:hAnsi="Times New Roman" w:cs="Times New Roman"/>
+                <w:i/>
+                <w:color w:val="065F46"/>
+                <w:sz w:val="24"/>
+                <w:szCs w:val="24"/>
+              </w:rPr>
+            </w:r>
+            <w:proofErr w:type="spellStart"/>
+            <w:r>
+              <w:rPr>
+                <w:rFonts w:ascii="Times New Roman" w:hAnsi="Times New Roman" w:cs="Times New Roman"/>
+                <w:i/>
+                <w:color w:val="065F46"/>
+                <w:sz w:val="24"/>
+                <w:szCs w:val="24"/>
+              </w:rPr>
+            </w:r>
+            <w:proofErr w:type="spellEnd"/>
             <w:r>
               <w:t>{{item.don_vi_to_chuc}}</w:t>
             </w:r>
@@ -24850,6 +26270,15 @@
               </w:rPr>
             </w:pPr>
             <w:r>
+              <w:rPr>
+                <w:rFonts w:ascii="Times New Roman" w:hAnsi="Times New Roman" w:cs="Times New Roman"/>
+                <w:i/>
+                <w:color w:val="065F46"/>
+                <w:sz w:val="24"/>
+                <w:szCs w:val="24"/>
+              </w:rPr>
+            </w:r>
+            <w:r>
               <w:t>{{item.thoi_gian}}</w:t>
             </w:r>
           </w:p>
@@ -24874,6 +26303,46 @@
               </w:rPr>
             </w:pPr>
             <w:r>
+              <w:rPr>
+                <w:rFonts w:ascii="Times New Roman" w:hAnsi="Times New Roman" w:cs="Times New Roman"/>
+                <w:i/>
+                <w:color w:val="065F46"/>
+                <w:sz w:val="24"/>
+                <w:szCs w:val="24"/>
+              </w:rPr>
+            </w:r>
+            <w:proofErr w:type="spellStart"/>
+            <w:r>
+              <w:rPr>
+                <w:rFonts w:ascii="Times New Roman" w:hAnsi="Times New Roman" w:cs="Times New Roman"/>
+                <w:i/>
+                <w:color w:val="065F46"/>
+                <w:sz w:val="24"/>
+                <w:szCs w:val="24"/>
+              </w:rPr>
+            </w:r>
+            <w:proofErr w:type="spellEnd"/>
+            <w:r>
+              <w:rPr>
+                <w:rFonts w:ascii="Times New Roman" w:hAnsi="Times New Roman" w:cs="Times New Roman"/>
+                <w:i/>
+                <w:color w:val="065F46"/>
+                <w:sz w:val="24"/>
+                <w:szCs w:val="24"/>
+              </w:rPr>
+            </w:r>
+            <w:proofErr w:type="spellStart"/>
+            <w:r>
+              <w:rPr>
+                <w:rFonts w:ascii="Times New Roman" w:hAnsi="Times New Roman" w:cs="Times New Roman"/>
+                <w:i/>
+                <w:color w:val="065F46"/>
+                <w:sz w:val="24"/>
+                <w:szCs w:val="24"/>
+              </w:rPr>
+            </w:r>
+            <w:proofErr w:type="spellEnd"/>
+            <w:r>
               <w:t>{{item.so_can_bo}}</w:t>
             </w:r>
           </w:p>
@@ -24897,8 +26366,111 @@
                 <w:szCs w:val="24"/>
               </w:rPr>
             </w:pPr>
-            <w:r>
-              <w:t>{{item.chung_chi_so_vb}}{% endfor %}</w:t>
+            <w:proofErr w:type="spellStart"/>
+            <w:r>
+              <w:rPr>
+                <w:rFonts w:ascii="Times New Roman" w:hAnsi="Times New Roman" w:cs="Times New Roman"/>
+                <w:i/>
+                <w:color w:val="065F46"/>
+                <w:sz w:val="24"/>
+                <w:szCs w:val="24"/>
+              </w:rPr>
+            </w:r>
+            <w:proofErr w:type="spellEnd"/>
+            <w:r>
+              <w:rPr>
+                <w:rFonts w:ascii="Times New Roman" w:hAnsi="Times New Roman" w:cs="Times New Roman"/>
+                <w:i/>
+                <w:color w:val="065F46"/>
+                <w:sz w:val="24"/>
+                <w:szCs w:val="24"/>
+              </w:rPr>
+            </w:r>
+            <w:proofErr w:type="spellStart"/>
+            <w:r>
+              <w:rPr>
+                <w:rFonts w:ascii="Times New Roman" w:hAnsi="Times New Roman" w:cs="Times New Roman"/>
+                <w:i/>
+                <w:color w:val="065F46"/>
+                <w:sz w:val="24"/>
+                <w:szCs w:val="24"/>
+              </w:rPr>
+            </w:r>
+            <w:proofErr w:type="spellEnd"/>
+            <w:r>
+              <w:rPr>
+                <w:rFonts w:ascii="Times New Roman" w:hAnsi="Times New Roman" w:cs="Times New Roman"/>
+                <w:i/>
+                <w:color w:val="065F46"/>
+                <w:sz w:val="24"/>
+                <w:szCs w:val="24"/>
+              </w:rPr>
+            </w:r>
+            <w:proofErr w:type="spellStart"/>
+            <w:r>
+              <w:rPr>
+                <w:rFonts w:ascii="Times New Roman" w:hAnsi="Times New Roman" w:cs="Times New Roman"/>
+                <w:i/>
+                <w:color w:val="065F46"/>
+                <w:sz w:val="24"/>
+                <w:szCs w:val="24"/>
+              </w:rPr>
+            </w:r>
+            <w:proofErr w:type="spellEnd"/>
+            <w:r>
+              <w:rPr>
+                <w:rFonts w:ascii="Times New Roman" w:hAnsi="Times New Roman" w:cs="Times New Roman"/>
+                <w:i/>
+                <w:color w:val="065F46"/>
+                <w:sz w:val="24"/>
+                <w:szCs w:val="24"/>
+              </w:rPr>
+            </w:r>
+            <w:proofErr w:type="spellStart"/>
+            <w:r>
+              <w:rPr>
+                <w:rFonts w:ascii="Times New Roman" w:hAnsi="Times New Roman" w:cs="Times New Roman"/>
+                <w:i/>
+                <w:color w:val="065F46"/>
+                <w:sz w:val="24"/>
+                <w:szCs w:val="24"/>
+              </w:rPr>
+            </w:r>
+            <w:proofErr w:type="spellEnd"/>
+            <w:r>
+              <w:rPr>
+                <w:rFonts w:ascii="Times New Roman" w:hAnsi="Times New Roman" w:cs="Times New Roman"/>
+                <w:i/>
+                <w:color w:val="065F46"/>
+                <w:sz w:val="24"/>
+                <w:szCs w:val="24"/>
+              </w:rPr>
+            </w:r>
+            <w:proofErr w:type="spellStart"/>
+            <w:r>
+              <w:rPr>
+                <w:rFonts w:ascii="Times New Roman" w:hAnsi="Times New Roman" w:cs="Times New Roman"/>
+                <w:i/>
+                <w:color w:val="065F46"/>
+                <w:sz w:val="24"/>
+                <w:szCs w:val="24"/>
+              </w:rPr>
+            </w:r>
+            <w:proofErr w:type="spellEnd"/>
+            <w:r>
+              <w:rPr>
+                <w:rFonts w:ascii="Times New Roman" w:hAnsi="Times New Roman" w:cs="Times New Roman"/>
+                <w:i/>
+                <w:color w:val="065F46"/>
+                <w:sz w:val="24"/>
+                <w:szCs w:val="24"/>
+              </w:rPr>
+            </w:r>
+            <w:r>
+              <w:t>{{item.chung_chi_so_vb}}</w:t>
+            </w:r>
+            <w:r>
+              <w:t>{% endfor %}</w:t>
             </w:r>
           </w:p>
         </w:tc>
@@ -25505,6 +27077,7 @@
       <w:tblPr>
         <w:tblStyle w:val="TableGrid"/>
         <w:tblW w:w="0" w:type="auto"/>
+        <w:tblLayout w:type="autofit"/>
         <w:tblLook w:val="04A0" w:firstRow="1" w:lastRow="0" w:firstColumn="1" w:lastColumn="0" w:noHBand="0" w:noVBand="1"/>
       </w:tblPr>
       <w:tblGrid>
@@ -25709,7 +27282,17 @@
               </w:rPr>
             </w:pPr>
             <w:r>
-              <w:t>{% for item in kiem_tra_attt %}{{item.idx}}</w:t>
+              <w:rPr>
+                <w:rFonts w:ascii="Times New Roman" w:hAnsi="Times New Roman" w:cs="Times New Roman"/>
+                <w:sz w:val="24"/>
+                <w:szCs w:val="24"/>
+              </w:rPr>
+            </w:r>
+            <w:r>
+              <w:t>{% for item in kiem_tra_attt %}</w:t>
+            </w:r>
+            <w:r>
+              <w:t>{{item.idx}}</w:t>
             </w:r>
           </w:p>
         </w:tc>
@@ -25732,6 +27315,66 @@
                 <w:szCs w:val="24"/>
               </w:rPr>
             </w:pPr>
+            <w:proofErr w:type="spellStart"/>
+            <w:r>
+              <w:rPr>
+                <w:rFonts w:ascii="Times New Roman" w:hAnsi="Times New Roman" w:cs="Times New Roman"/>
+                <w:i/>
+                <w:color w:val="065F46"/>
+                <w:sz w:val="24"/>
+                <w:szCs w:val="24"/>
+              </w:rPr>
+            </w:r>
+            <w:proofErr w:type="spellEnd"/>
+            <w:r>
+              <w:rPr>
+                <w:rFonts w:ascii="Times New Roman" w:hAnsi="Times New Roman" w:cs="Times New Roman"/>
+                <w:i/>
+                <w:color w:val="065F46"/>
+                <w:sz w:val="24"/>
+                <w:szCs w:val="24"/>
+              </w:rPr>
+            </w:r>
+            <w:proofErr w:type="spellStart"/>
+            <w:r>
+              <w:rPr>
+                <w:rFonts w:ascii="Times New Roman" w:hAnsi="Times New Roman" w:cs="Times New Roman"/>
+                <w:i/>
+                <w:color w:val="065F46"/>
+                <w:sz w:val="24"/>
+                <w:szCs w:val="24"/>
+              </w:rPr>
+            </w:r>
+            <w:proofErr w:type="spellEnd"/>
+            <w:r>
+              <w:rPr>
+                <w:rFonts w:ascii="Times New Roman" w:hAnsi="Times New Roman" w:cs="Times New Roman"/>
+                <w:i/>
+                <w:color w:val="065F46"/>
+                <w:sz w:val="24"/>
+                <w:szCs w:val="24"/>
+              </w:rPr>
+            </w:r>
+            <w:proofErr w:type="spellStart"/>
+            <w:r>
+              <w:rPr>
+                <w:rFonts w:ascii="Times New Roman" w:hAnsi="Times New Roman" w:cs="Times New Roman"/>
+                <w:i/>
+                <w:color w:val="065F46"/>
+                <w:sz w:val="24"/>
+                <w:szCs w:val="24"/>
+              </w:rPr>
+            </w:r>
+            <w:proofErr w:type="spellEnd"/>
+            <w:r>
+              <w:rPr>
+                <w:rFonts w:ascii="Times New Roman" w:hAnsi="Times New Roman" w:cs="Times New Roman"/>
+                <w:i/>
+                <w:color w:val="065F46"/>
+                <w:sz w:val="24"/>
+                <w:szCs w:val="24"/>
+              </w:rPr>
+            </w:r>
             <w:r>
               <w:t>{{item.loai_kiem_tra}}</w:t>
             </w:r>
@@ -25756,6 +27399,37 @@
                 <w:szCs w:val="24"/>
               </w:rPr>
             </w:pPr>
+            <w:proofErr w:type="spellStart"/>
+            <w:r>
+              <w:rPr>
+                <w:rFonts w:ascii="Times New Roman" w:hAnsi="Times New Roman" w:cs="Times New Roman"/>
+                <w:i/>
+                <w:color w:val="065F46"/>
+                <w:sz w:val="24"/>
+                <w:szCs w:val="24"/>
+              </w:rPr>
+            </w:r>
+            <w:proofErr w:type="spellEnd"/>
+            <w:r>
+              <w:rPr>
+                <w:rFonts w:ascii="Times New Roman" w:hAnsi="Times New Roman" w:cs="Times New Roman"/>
+                <w:i/>
+                <w:color w:val="065F46"/>
+                <w:sz w:val="24"/>
+                <w:szCs w:val="24"/>
+              </w:rPr>
+            </w:r>
+            <w:proofErr w:type="spellStart"/>
+            <w:r>
+              <w:rPr>
+                <w:rFonts w:ascii="Times New Roman" w:hAnsi="Times New Roman" w:cs="Times New Roman"/>
+                <w:i/>
+                <w:color w:val="065F46"/>
+                <w:sz w:val="24"/>
+                <w:szCs w:val="24"/>
+              </w:rPr>
+            </w:r>
+            <w:proofErr w:type="spellEnd"/>
             <w:r>
               <w:t>{{item.don_vi_thuc_hien}}</w:t>
             </w:r>
@@ -25780,6 +27454,15 @@
                 <w:szCs w:val="24"/>
               </w:rPr>
             </w:pPr>
+            <w:r>
+              <w:rPr>
+                <w:rFonts w:ascii="Times New Roman" w:hAnsi="Times New Roman" w:cs="Times New Roman"/>
+                <w:i/>
+                <w:color w:val="065F46"/>
+                <w:sz w:val="24"/>
+                <w:szCs w:val="24"/>
+              </w:rPr>
+            </w:r>
             <w:r>
               <w:t>{{item.thoi_gian}}</w:t>
             </w:r>
@@ -25806,8 +27489,182 @@
                 <w:szCs w:val="24"/>
               </w:rPr>
             </w:pPr>
-            <w:r>
-              <w:t>{{item.ket_qua_so_vb}}{% endfor %}</w:t>
+            <w:proofErr w:type="spellStart"/>
+            <w:r>
+              <w:rPr>
+                <w:rFonts w:ascii="Times New Roman" w:hAnsi="Times New Roman" w:cs="Times New Roman"/>
+                <w:i/>
+                <w:color w:val="065F46"/>
+                <w:sz w:val="24"/>
+                <w:szCs w:val="24"/>
+              </w:rPr>
+            </w:r>
+            <w:proofErr w:type="spellEnd"/>
+            <w:r>
+              <w:rPr>
+                <w:rFonts w:ascii="Times New Roman" w:hAnsi="Times New Roman" w:cs="Times New Roman"/>
+                <w:i/>
+                <w:color w:val="065F46"/>
+                <w:sz w:val="24"/>
+                <w:szCs w:val="24"/>
+              </w:rPr>
+            </w:r>
+            <w:proofErr w:type="spellStart"/>
+            <w:r>
+              <w:rPr>
+                <w:rFonts w:ascii="Times New Roman" w:hAnsi="Times New Roman" w:cs="Times New Roman"/>
+                <w:i/>
+                <w:color w:val="065F46"/>
+                <w:sz w:val="24"/>
+                <w:szCs w:val="24"/>
+              </w:rPr>
+            </w:r>
+            <w:proofErr w:type="spellEnd"/>
+            <w:r>
+              <w:rPr>
+                <w:rFonts w:ascii="Times New Roman" w:hAnsi="Times New Roman" w:cs="Times New Roman"/>
+                <w:i/>
+                <w:color w:val="065F46"/>
+                <w:sz w:val="24"/>
+                <w:szCs w:val="24"/>
+              </w:rPr>
+            </w:r>
+            <w:proofErr w:type="spellStart"/>
+            <w:r>
+              <w:rPr>
+                <w:rFonts w:ascii="Times New Roman" w:hAnsi="Times New Roman" w:cs="Times New Roman"/>
+                <w:i/>
+                <w:color w:val="065F46"/>
+                <w:sz w:val="24"/>
+                <w:szCs w:val="24"/>
+              </w:rPr>
+            </w:r>
+            <w:proofErr w:type="spellEnd"/>
+            <w:r>
+              <w:rPr>
+                <w:rFonts w:ascii="Times New Roman" w:hAnsi="Times New Roman" w:cs="Times New Roman"/>
+                <w:i/>
+                <w:color w:val="065F46"/>
+                <w:sz w:val="24"/>
+                <w:szCs w:val="24"/>
+              </w:rPr>
+            </w:r>
+            <w:proofErr w:type="spellStart"/>
+            <w:r>
+              <w:rPr>
+                <w:rFonts w:ascii="Times New Roman" w:hAnsi="Times New Roman" w:cs="Times New Roman"/>
+                <w:i/>
+                <w:color w:val="065F46"/>
+                <w:sz w:val="24"/>
+                <w:szCs w:val="24"/>
+              </w:rPr>
+            </w:r>
+            <w:proofErr w:type="spellEnd"/>
+            <w:r>
+              <w:rPr>
+                <w:rFonts w:ascii="Times New Roman" w:hAnsi="Times New Roman" w:cs="Times New Roman"/>
+                <w:i/>
+                <w:color w:val="065F46"/>
+                <w:sz w:val="24"/>
+                <w:szCs w:val="24"/>
+              </w:rPr>
+            </w:r>
+            <w:proofErr w:type="spellStart"/>
+            <w:r>
+              <w:rPr>
+                <w:rFonts w:ascii="Times New Roman" w:hAnsi="Times New Roman" w:cs="Times New Roman"/>
+                <w:i/>
+                <w:color w:val="065F46"/>
+                <w:sz w:val="24"/>
+                <w:szCs w:val="24"/>
+              </w:rPr>
+            </w:r>
+            <w:proofErr w:type="spellEnd"/>
+            <w:r>
+              <w:rPr>
+                <w:rFonts w:ascii="Times New Roman" w:hAnsi="Times New Roman" w:cs="Times New Roman"/>
+                <w:i/>
+                <w:color w:val="065F46"/>
+                <w:sz w:val="24"/>
+                <w:szCs w:val="24"/>
+              </w:rPr>
+            </w:r>
+            <w:proofErr w:type="spellStart"/>
+            <w:r>
+              <w:rPr>
+                <w:rFonts w:ascii="Times New Roman" w:hAnsi="Times New Roman" w:cs="Times New Roman"/>
+                <w:i/>
+                <w:color w:val="065F46"/>
+                <w:sz w:val="24"/>
+                <w:szCs w:val="24"/>
+              </w:rPr>
+            </w:r>
+            <w:proofErr w:type="spellEnd"/>
+            <w:r>
+              <w:rPr>
+                <w:rFonts w:ascii="Times New Roman" w:hAnsi="Times New Roman" w:cs="Times New Roman"/>
+                <w:i/>
+                <w:color w:val="065F46"/>
+                <w:sz w:val="24"/>
+                <w:szCs w:val="24"/>
+              </w:rPr>
+            </w:r>
+            <w:proofErr w:type="spellStart"/>
+            <w:r>
+              <w:rPr>
+                <w:rFonts w:ascii="Times New Roman" w:hAnsi="Times New Roman" w:cs="Times New Roman"/>
+                <w:i/>
+                <w:color w:val="065F46"/>
+                <w:sz w:val="24"/>
+                <w:szCs w:val="24"/>
+              </w:rPr>
+            </w:r>
+            <w:proofErr w:type="spellEnd"/>
+            <w:r>
+              <w:rPr>
+                <w:rFonts w:ascii="Times New Roman" w:hAnsi="Times New Roman" w:cs="Times New Roman"/>
+                <w:i/>
+                <w:color w:val="065F46"/>
+                <w:sz w:val="24"/>
+                <w:szCs w:val="24"/>
+              </w:rPr>
+            </w:r>
+            <w:proofErr w:type="spellStart"/>
+            <w:r>
+              <w:rPr>
+                <w:rFonts w:ascii="Times New Roman" w:hAnsi="Times New Roman" w:cs="Times New Roman"/>
+                <w:i/>
+                <w:color w:val="065F46"/>
+                <w:sz w:val="24"/>
+                <w:szCs w:val="24"/>
+              </w:rPr>
+            </w:r>
+            <w:proofErr w:type="spellEnd"/>
+            <w:r>
+              <w:rPr>
+                <w:rFonts w:ascii="Times New Roman" w:hAnsi="Times New Roman" w:cs="Times New Roman"/>
+                <w:i/>
+                <w:color w:val="065F46"/>
+                <w:sz w:val="24"/>
+                <w:szCs w:val="24"/>
+              </w:rPr>
+            </w:r>
+            <w:proofErr w:type="spellStart"/>
+            <w:r>
+              <w:rPr>
+                <w:rFonts w:ascii="Times New Roman" w:hAnsi="Times New Roman" w:cs="Times New Roman"/>
+                <w:i/>
+                <w:color w:val="065F46"/>
+                <w:sz w:val="24"/>
+                <w:szCs w:val="24"/>
+              </w:rPr>
+            </w:r>
+            <w:proofErr w:type="spellEnd"/>
+            <w:r>
+              <w:t>{{item.ket_qua_so_vb}}</w:t>
+            </w:r>
+            <w:r>
+              <w:t>{% endfor %}</w:t>
             </w:r>
           </w:p>
         </w:tc>
@@ -26995,6 +28852,7 @@
       <w:tblPr>
         <w:tblStyle w:val="TableGrid"/>
         <w:tblW w:w="0" w:type="auto"/>
+        <w:tblLayout w:type="autofit"/>
         <w:tblLook w:val="04A0" w:firstRow="1" w:lastRow="0" w:firstColumn="1" w:lastColumn="0" w:noHBand="0" w:noVBand="1"/>
       </w:tblPr>
       <w:tblGrid>
@@ -27176,7 +29034,30 @@
               </w:rPr>
             </w:pPr>
             <w:r>
-              <w:t>{% for item in port_switch %}{{item.ten_switch}}</w:t>
+              <w:rPr>
+                <w:rFonts w:ascii="Times New Roman" w:hAnsi="Times New Roman" w:cs="Times New Roman"/>
+                <w:i/>
+                <w:color w:val="065F46"/>
+                <w:sz w:val="24"/>
+                <w:szCs w:val="24"/>
+              </w:rPr>
+            </w:r>
+            <w:proofErr w:type="spellStart"/>
+            <w:r>
+              <w:rPr>
+                <w:rFonts w:ascii="Times New Roman" w:hAnsi="Times New Roman" w:cs="Times New Roman"/>
+                <w:i/>
+                <w:color w:val="065F46"/>
+                <w:sz w:val="24"/>
+                <w:szCs w:val="24"/>
+              </w:rPr>
+            </w:r>
+            <w:proofErr w:type="spellEnd"/>
+            <w:r>
+              <w:t>{% for item in port_switch %}</w:t>
+            </w:r>
+            <w:r>
+              <w:t>{{item.ten_switch}}</w:t>
             </w:r>
           </w:p>
         </w:tc>
@@ -27200,6 +29081,26 @@
               </w:rPr>
             </w:pPr>
             <w:r>
+              <w:rPr>
+                <w:rFonts w:ascii="Times New Roman" w:hAnsi="Times New Roman" w:cs="Times New Roman"/>
+                <w:i/>
+                <w:color w:val="065F46"/>
+                <w:sz w:val="24"/>
+                <w:szCs w:val="24"/>
+              </w:rPr>
+            </w:r>
+            <w:proofErr w:type="spellStart"/>
+            <w:r>
+              <w:rPr>
+                <w:rFonts w:ascii="Times New Roman" w:hAnsi="Times New Roman" w:cs="Times New Roman"/>
+                <w:i/>
+                <w:color w:val="065F46"/>
+                <w:sz w:val="24"/>
+                <w:szCs w:val="24"/>
+              </w:rPr>
+            </w:r>
+            <w:proofErr w:type="spellEnd"/>
+            <w:r>
               <w:t>{{item.so_cong}}</w:t>
             </w:r>
           </w:p>
@@ -27224,6 +29125,15 @@
               </w:rPr>
             </w:pPr>
             <w:r>
+              <w:rPr>
+                <w:rFonts w:ascii="Times New Roman" w:hAnsi="Times New Roman" w:cs="Times New Roman"/>
+                <w:i/>
+                <w:color w:val="065F46"/>
+                <w:sz w:val="24"/>
+                <w:szCs w:val="24"/>
+              </w:rPr>
+            </w:r>
+            <w:r>
               <w:t>{{item.cong_su_dung}}</w:t>
             </w:r>
           </w:p>
@@ -27248,7 +29158,28 @@
               </w:rPr>
             </w:pPr>
             <w:r>
-              <w:t>{{item.ghi_chu}}{% endfor %}</w:t>
+              <w:rPr>
+                <w:rFonts w:ascii="Times New Roman" w:hAnsi="Times New Roman" w:cs="Times New Roman"/>
+                <w:i/>
+                <w:color w:val="065F46"/>
+                <w:sz w:val="24"/>
+                <w:szCs w:val="24"/>
+              </w:rPr>
+            </w:r>
+            <w:r>
+              <w:rPr>
+                <w:rFonts w:ascii="Times New Roman" w:hAnsi="Times New Roman" w:cs="Times New Roman"/>
+                <w:i/>
+                <w:color w:val="065F46"/>
+                <w:sz w:val="24"/>
+                <w:szCs w:val="24"/>
+              </w:rPr>
+            </w:r>
+            <w:r>
+              <w:t>{{item.ghi_chu}}</w:t>
+            </w:r>
+            <w:r>
+              <w:t>{% endfor %}</w:t>
             </w:r>
           </w:p>
         </w:tc>
@@ -28892,6 +30823,7 @@
       <w:tblPr>
         <w:tblStyle w:val="TableGrid"/>
         <w:tblW w:w="0" w:type="auto"/>
+        <w:tblLayout w:type="autofit"/>
         <w:tblLook w:val="04A0" w:firstRow="1" w:lastRow="0" w:firstColumn="1" w:lastColumn="0" w:noHBand="0" w:noVBand="1"/>
       </w:tblPr>
       <w:tblGrid>
@@ -29062,7 +30994,19 @@
               </w:rPr>
             </w:pPr>
             <w:r>
-              <w:t>{% for item in T5_vi_tri %}{{item.idx}}</w:t>
+              <w:rPr>
+                <w:rFonts w:ascii="Times New Roman" w:hAnsi="Times New Roman" w:cs="Times New Roman"/>
+                <w:i/>
+                <w:color w:val="065F46"/>
+                <w:sz w:val="24"/>
+                <w:szCs w:val="24"/>
+              </w:rPr>
+            </w:r>
+            <w:r>
+              <w:t>{% for item in T5_vi_tri %}</w:t>
+            </w:r>
+            <w:r>
+              <w:t>{{item.idx}}</w:t>
             </w:r>
           </w:p>
         </w:tc>
@@ -29086,6 +31030,26 @@
                 <w:szCs w:val="24"/>
               </w:rPr>
             </w:pPr>
+            <w:proofErr w:type="spellStart"/>
+            <w:r>
+              <w:rPr>
+                <w:rFonts w:ascii="Times New Roman" w:hAnsi="Times New Roman" w:cs="Times New Roman"/>
+                <w:i/>
+                <w:color w:val="065F46"/>
+                <w:sz w:val="24"/>
+                <w:szCs w:val="24"/>
+              </w:rPr>
+            </w:r>
+            <w:proofErr w:type="spellEnd"/>
+            <w:r>
+              <w:rPr>
+                <w:rFonts w:ascii="Times New Roman" w:hAnsi="Times New Roman" w:cs="Times New Roman"/>
+                <w:i/>
+                <w:color w:val="065F46"/>
+                <w:sz w:val="24"/>
+                <w:szCs w:val="24"/>
+              </w:rPr>
+            </w:r>
             <w:r>
               <w:t>{{item.thiet_bi}}</w:t>
             </w:r>
@@ -29110,6 +31074,46 @@
                 <w:szCs w:val="24"/>
               </w:rPr>
             </w:pPr>
+            <w:proofErr w:type="spellStart"/>
+            <w:r>
+              <w:rPr>
+                <w:rFonts w:ascii="Times New Roman" w:hAnsi="Times New Roman" w:cs="Times New Roman"/>
+                <w:i/>
+                <w:color w:val="065F46"/>
+                <w:sz w:val="24"/>
+                <w:szCs w:val="24"/>
+              </w:rPr>
+            </w:r>
+            <w:proofErr w:type="spellEnd"/>
+            <w:r>
+              <w:rPr>
+                <w:rFonts w:ascii="Times New Roman" w:hAnsi="Times New Roman" w:cs="Times New Roman"/>
+                <w:i/>
+                <w:color w:val="065F46"/>
+                <w:sz w:val="24"/>
+                <w:szCs w:val="24"/>
+              </w:rPr>
+            </w:r>
+            <w:proofErr w:type="spellStart"/>
+            <w:r>
+              <w:rPr>
+                <w:rFonts w:ascii="Times New Roman" w:hAnsi="Times New Roman" w:cs="Times New Roman"/>
+                <w:i/>
+                <w:color w:val="065F46"/>
+                <w:sz w:val="24"/>
+                <w:szCs w:val="24"/>
+              </w:rPr>
+            </w:r>
+            <w:proofErr w:type="spellEnd"/>
+            <w:r>
+              <w:rPr>
+                <w:rFonts w:ascii="Times New Roman" w:hAnsi="Times New Roman" w:cs="Times New Roman"/>
+                <w:i/>
+                <w:color w:val="065F46"/>
+                <w:sz w:val="24"/>
+                <w:szCs w:val="24"/>
+              </w:rPr>
+            </w:r>
             <w:r>
               <w:t>{{item.tang}}</w:t>
             </w:r>
@@ -29134,8 +31138,142 @@
                 <w:szCs w:val="24"/>
               </w:rPr>
             </w:pPr>
-            <w:r>
-              <w:t>{{item.phong}}{% endfor %}</w:t>
+            <w:proofErr w:type="spellStart"/>
+            <w:r>
+              <w:rPr>
+                <w:rFonts w:ascii="Times New Roman" w:hAnsi="Times New Roman" w:cs="Times New Roman"/>
+                <w:i/>
+                <w:color w:val="065F46"/>
+                <w:sz w:val="24"/>
+                <w:szCs w:val="24"/>
+              </w:rPr>
+            </w:r>
+            <w:proofErr w:type="spellEnd"/>
+            <w:r>
+              <w:rPr>
+                <w:rFonts w:ascii="Times New Roman" w:hAnsi="Times New Roman" w:cs="Times New Roman"/>
+                <w:i/>
+                <w:color w:val="065F46"/>
+                <w:sz w:val="24"/>
+                <w:szCs w:val="24"/>
+              </w:rPr>
+            </w:r>
+            <w:proofErr w:type="spellStart"/>
+            <w:r>
+              <w:rPr>
+                <w:rFonts w:ascii="Times New Roman" w:hAnsi="Times New Roman" w:cs="Times New Roman"/>
+                <w:i/>
+                <w:color w:val="065F46"/>
+                <w:sz w:val="24"/>
+                <w:szCs w:val="24"/>
+              </w:rPr>
+            </w:r>
+            <w:proofErr w:type="spellEnd"/>
+            <w:r>
+              <w:rPr>
+                <w:rFonts w:ascii="Times New Roman" w:hAnsi="Times New Roman" w:cs="Times New Roman"/>
+                <w:i/>
+                <w:color w:val="065F46"/>
+                <w:sz w:val="24"/>
+                <w:szCs w:val="24"/>
+              </w:rPr>
+            </w:r>
+            <w:proofErr w:type="spellStart"/>
+            <w:r>
+              <w:rPr>
+                <w:rFonts w:ascii="Times New Roman" w:hAnsi="Times New Roman" w:cs="Times New Roman"/>
+                <w:i/>
+                <w:color w:val="065F46"/>
+                <w:sz w:val="24"/>
+                <w:szCs w:val="24"/>
+              </w:rPr>
+            </w:r>
+            <w:proofErr w:type="spellEnd"/>
+            <w:r>
+              <w:rPr>
+                <w:rFonts w:ascii="Times New Roman" w:hAnsi="Times New Roman" w:cs="Times New Roman"/>
+                <w:i/>
+                <w:color w:val="065F46"/>
+                <w:sz w:val="24"/>
+                <w:szCs w:val="24"/>
+              </w:rPr>
+            </w:r>
+            <w:proofErr w:type="spellStart"/>
+            <w:r>
+              <w:rPr>
+                <w:rFonts w:ascii="Times New Roman" w:hAnsi="Times New Roman" w:cs="Times New Roman"/>
+                <w:i/>
+                <w:color w:val="065F46"/>
+                <w:sz w:val="24"/>
+                <w:szCs w:val="24"/>
+              </w:rPr>
+            </w:r>
+            <w:proofErr w:type="spellEnd"/>
+            <w:r>
+              <w:rPr>
+                <w:rFonts w:ascii="Times New Roman" w:hAnsi="Times New Roman" w:cs="Times New Roman"/>
+                <w:i/>
+                <w:color w:val="065F46"/>
+                <w:sz w:val="24"/>
+                <w:szCs w:val="24"/>
+              </w:rPr>
+            </w:r>
+            <w:proofErr w:type="spellStart"/>
+            <w:r>
+              <w:rPr>
+                <w:rFonts w:ascii="Times New Roman" w:hAnsi="Times New Roman" w:cs="Times New Roman"/>
+                <w:i/>
+                <w:color w:val="065F46"/>
+                <w:sz w:val="24"/>
+                <w:szCs w:val="24"/>
+              </w:rPr>
+            </w:r>
+            <w:proofErr w:type="spellEnd"/>
+            <w:r>
+              <w:rPr>
+                <w:rFonts w:ascii="Times New Roman" w:hAnsi="Times New Roman" w:cs="Times New Roman"/>
+                <w:i/>
+                <w:color w:val="065F46"/>
+                <w:sz w:val="24"/>
+                <w:szCs w:val="24"/>
+              </w:rPr>
+            </w:r>
+            <w:proofErr w:type="spellStart"/>
+            <w:r>
+              <w:rPr>
+                <w:rFonts w:ascii="Times New Roman" w:hAnsi="Times New Roman" w:cs="Times New Roman"/>
+                <w:i/>
+                <w:color w:val="065F46"/>
+                <w:sz w:val="24"/>
+                <w:szCs w:val="24"/>
+              </w:rPr>
+            </w:r>
+            <w:proofErr w:type="spellEnd"/>
+            <w:r>
+              <w:rPr>
+                <w:rFonts w:ascii="Times New Roman" w:hAnsi="Times New Roman" w:cs="Times New Roman"/>
+                <w:i/>
+                <w:color w:val="065F46"/>
+                <w:sz w:val="24"/>
+                <w:szCs w:val="24"/>
+              </w:rPr>
+            </w:r>
+            <w:proofErr w:type="spellStart"/>
+            <w:r>
+              <w:rPr>
+                <w:rFonts w:ascii="Times New Roman" w:hAnsi="Times New Roman" w:cs="Times New Roman"/>
+                <w:i/>
+                <w:color w:val="065F46"/>
+                <w:sz w:val="24"/>
+                <w:szCs w:val="24"/>
+              </w:rPr>
+            </w:r>
+            <w:proofErr w:type="spellEnd"/>
+            <w:r>
+              <w:t>{{item.phong}}</w:t>
+            </w:r>
+            <w:r>
+              <w:t>{% endfor %}</w:t>
             </w:r>
           </w:p>
         </w:tc>

</xml_diff>

<commit_message>
fix: Word table layout (Triple-Row wrapping technique for 100% stable row loops)
</commit_message>
<xml_diff>
--- a/Code/backend/templates/phieu_khao_sat_template.docx
+++ b/Code/backend/templates/phieu_khao_sat_template.docx
@@ -2062,7 +2062,6 @@
       <w:tblPr>
         <w:tblStyle w:val="TableGrid"/>
         <w:tblW w:w="0" w:type="auto"/>
-        <w:tblLayout w:type="autofit"/>
         <w:tblLook w:val="04A0" w:firstRow="1" w:lastRow="0" w:firstColumn="1" w:lastColumn="0" w:noHBand="0" w:noVBand="1"/>
       </w:tblPr>
       <w:tblGrid>
@@ -2303,6 +2302,54 @@
       <w:tr>
         <w:tc>
           <w:tcPr>
+            <w:tcW w:type="dxa" w:w="631"/>
+          </w:tcPr>
+          <w:p>
+            <w:r>
+              <w:t>{%tr for item in can_bo_phu_trach %}</w:t>
+            </w:r>
+          </w:p>
+        </w:tc>
+        <w:tc>
+          <w:tcPr>
+            <w:tcW w:type="dxa" w:w="643"/>
+          </w:tcPr>
+          <w:p/>
+        </w:tc>
+        <w:tc>
+          <w:tcPr>
+            <w:tcW w:type="dxa" w:w="898"/>
+          </w:tcPr>
+          <w:p/>
+        </w:tc>
+        <w:tc>
+          <w:tcPr>
+            <w:tcW w:type="dxa" w:w="1422"/>
+          </w:tcPr>
+          <w:p/>
+        </w:tc>
+        <w:tc>
+          <w:tcPr>
+            <w:tcW w:type="dxa" w:w="3668"/>
+          </w:tcPr>
+          <w:p/>
+        </w:tc>
+        <w:tc>
+          <w:tcPr>
+            <w:tcW w:type="dxa" w:w="1240"/>
+          </w:tcPr>
+          <w:p/>
+        </w:tc>
+        <w:tc>
+          <w:tcPr>
+            <w:tcW w:type="dxa" w:w="1069"/>
+          </w:tcPr>
+          <w:p/>
+        </w:tc>
+      </w:tr>
+      <w:tr>
+        <w:tc>
+          <w:tcPr>
             <w:tcW w:w="652" w:type="dxa"/>
             <w:tcBorders>
               <w:top w:val="single" w:sz="4" w:space="0" w:color="CBD5E1"/>
@@ -2322,16 +2369,6 @@
               </w:rPr>
             </w:pPr>
             <w:r>
-              <w:rPr>
-                <w:rFonts w:ascii="Times New Roman" w:hAnsi="Times New Roman" w:cs="Times New Roman"/>
-                <w:sz w:val="24"/>
-                <w:szCs w:val="24"/>
-              </w:rPr>
-            </w:r>
-            <w:r>
-              <w:t>{% for item in can_bo_phu_trach %}</w:t>
-            </w:r>
-            <w:r>
               <w:t>{{item.idx}}</w:t>
             </w:r>
           </w:p>
@@ -2355,31 +2392,6 @@
                 <w:szCs w:val="24"/>
               </w:rPr>
             </w:pPr>
-            <w:proofErr w:type="spellStart"/>
-            <w:r>
-              <w:rPr>
-                <w:rFonts w:ascii="Times New Roman" w:hAnsi="Times New Roman" w:cs="Times New Roman"/>
-                <w:sz w:val="24"/>
-                <w:szCs w:val="24"/>
-              </w:rPr>
-            </w:r>
-            <w:proofErr w:type="spellEnd"/>
-            <w:r>
-              <w:rPr>
-                <w:rFonts w:ascii="Times New Roman" w:hAnsi="Times New Roman" w:cs="Times New Roman"/>
-                <w:sz w:val="24"/>
-                <w:szCs w:val="24"/>
-              </w:rPr>
-            </w:r>
-            <w:proofErr w:type="spellStart"/>
-            <w:r>
-              <w:rPr>
-                <w:rFonts w:ascii="Times New Roman" w:hAnsi="Times New Roman" w:cs="Times New Roman"/>
-                <w:sz w:val="24"/>
-                <w:szCs w:val="24"/>
-              </w:rPr>
-            </w:r>
-            <w:proofErr w:type="spellEnd"/>
             <w:r>
               <w:t>{{item.ho_ten}}</w:t>
             </w:r>
@@ -2405,22 +2417,6 @@
               </w:rPr>
             </w:pPr>
             <w:r>
-              <w:rPr>
-                <w:rFonts w:ascii="Times New Roman" w:hAnsi="Times New Roman" w:cs="Times New Roman"/>
-                <w:sz w:val="24"/>
-                <w:szCs w:val="24"/>
-              </w:rPr>
-            </w:r>
-            <w:proofErr w:type="spellStart"/>
-            <w:r>
-              <w:rPr>
-                <w:rFonts w:ascii="Times New Roman" w:hAnsi="Times New Roman" w:cs="Times New Roman"/>
-                <w:sz w:val="24"/>
-                <w:szCs w:val="24"/>
-              </w:rPr>
-            </w:r>
-            <w:proofErr w:type="spellEnd"/>
-            <w:r>
               <w:t>{{item.chuc_vu}}</w:t>
             </w:r>
           </w:p>
@@ -2444,13 +2440,6 @@
                 <w:szCs w:val="24"/>
               </w:rPr>
             </w:pPr>
-            <w:r>
-              <w:rPr>
-                <w:rFonts w:ascii="Times New Roman" w:hAnsi="Times New Roman" w:cs="Times New Roman"/>
-                <w:sz w:val="24"/>
-                <w:szCs w:val="24"/>
-              </w:rPr>
-            </w:r>
             <w:r>
               <w:t>{{item.so_dt}}</w:t>
             </w:r>
@@ -2476,13 +2465,6 @@
               </w:rPr>
             </w:pPr>
             <w:r>
-              <w:rPr>
-                <w:color w:val="000000"/>
-                <w:sz w:val="26"/>
-                <w:szCs w:val="26"/>
-              </w:rPr>
-            </w:r>
-            <w:r>
               <w:t>{{item.email}}</w:t>
             </w:r>
           </w:p>
@@ -2507,22 +2489,6 @@
               </w:rPr>
             </w:pPr>
             <w:r>
-              <w:rPr>
-                <w:rFonts w:ascii="Times New Roman" w:hAnsi="Times New Roman" w:cs="Times New Roman"/>
-                <w:sz w:val="24"/>
-                <w:szCs w:val="24"/>
-              </w:rPr>
-            </w:r>
-            <w:proofErr w:type="spellStart"/>
-            <w:r>
-              <w:rPr>
-                <w:rFonts w:ascii="Times New Roman" w:hAnsi="Times New Roman" w:cs="Times New Roman"/>
-                <w:sz w:val="24"/>
-                <w:szCs w:val="24"/>
-              </w:rPr>
-            </w:r>
-            <w:proofErr w:type="spellEnd"/>
-            <w:r>
               <w:t>{{item.trinh_do}}</w:t>
             </w:r>
           </w:p>
@@ -2549,10 +2515,55 @@
             <w:r>
               <w:t>{{item.chung_chi_attt}}</w:t>
             </w:r>
-            <w:r>
-              <w:t>{% endfor %}</w:t>
-            </w:r>
-          </w:p>
+          </w:p>
+        </w:tc>
+      </w:tr>
+      <w:tr>
+        <w:tc>
+          <w:tcPr>
+            <w:tcW w:type="dxa" w:w="631"/>
+          </w:tcPr>
+          <w:p>
+            <w:r>
+              <w:t>{%tr endfor %}</w:t>
+            </w:r>
+          </w:p>
+        </w:tc>
+        <w:tc>
+          <w:tcPr>
+            <w:tcW w:type="dxa" w:w="643"/>
+          </w:tcPr>
+          <w:p/>
+        </w:tc>
+        <w:tc>
+          <w:tcPr>
+            <w:tcW w:type="dxa" w:w="898"/>
+          </w:tcPr>
+          <w:p/>
+        </w:tc>
+        <w:tc>
+          <w:tcPr>
+            <w:tcW w:type="dxa" w:w="1422"/>
+          </w:tcPr>
+          <w:p/>
+        </w:tc>
+        <w:tc>
+          <w:tcPr>
+            <w:tcW w:type="dxa" w:w="3668"/>
+          </w:tcPr>
+          <w:p/>
+        </w:tc>
+        <w:tc>
+          <w:tcPr>
+            <w:tcW w:type="dxa" w:w="1240"/>
+          </w:tcPr>
+          <w:p/>
+        </w:tc>
+        <w:tc>
+          <w:tcPr>
+            <w:tcW w:type="dxa" w:w="1069"/>
+          </w:tcPr>
+          <w:p/>
         </w:tc>
       </w:tr>
       <w:tr>
@@ -6105,7 +6116,6 @@
       <w:tblPr>
         <w:tblStyle w:val="TableGrid"/>
         <w:tblW w:w="0" w:type="auto"/>
-        <w:tblLayout w:type="autofit"/>
         <w:tblLook w:val="04A0" w:firstRow="1" w:lastRow="0" w:firstColumn="1" w:lastColumn="0" w:noHBand="0" w:noVBand="1"/>
       </w:tblPr>
       <w:tblGrid>
@@ -6368,6 +6378,54 @@
       <w:tr>
         <w:tc>
           <w:tcPr>
+            <w:tcW w:type="dxa" w:w="1332"/>
+          </w:tcPr>
+          <w:p>
+            <w:r>
+              <w:t>{%tr for item in ket_noi_internet %}</w:t>
+            </w:r>
+          </w:p>
+        </w:tc>
+        <w:tc>
+          <w:tcPr>
+            <w:tcW w:type="dxa" w:w="1413"/>
+          </w:tcPr>
+          <w:p/>
+        </w:tc>
+        <w:tc>
+          <w:tcPr>
+            <w:tcW w:type="dxa" w:w="1333"/>
+          </w:tcPr>
+          <w:p/>
+        </w:tc>
+        <w:tc>
+          <w:tcPr>
+            <w:tcW w:type="dxa" w:w="1332"/>
+          </w:tcPr>
+          <w:p/>
+        </w:tc>
+        <w:tc>
+          <w:tcPr>
+            <w:tcW w:type="dxa" w:w="1413"/>
+          </w:tcPr>
+          <w:p/>
+        </w:tc>
+        <w:tc>
+          <w:tcPr>
+            <w:tcW w:type="dxa" w:w="1414"/>
+          </w:tcPr>
+          <w:p/>
+        </w:tc>
+        <w:tc>
+          <w:tcPr>
+            <w:tcW w:type="dxa" w:w="1334"/>
+          </w:tcPr>
+          <w:p/>
+        </w:tc>
+      </w:tr>
+      <w:tr>
+        <w:tc>
+          <w:tcPr>
             <w:tcW w:w="1336" w:type="dxa"/>
             <w:tcBorders>
               <w:top w:val="single" w:sz="4" w:space="0" w:color="CBD5E1"/>
@@ -6387,16 +6445,6 @@
               </w:rPr>
             </w:pPr>
             <w:r>
-              <w:rPr>
-                <w:rFonts w:ascii="Times New Roman" w:hAnsi="Times New Roman" w:cs="Times New Roman"/>
-                <w:sz w:val="24"/>
-                <w:szCs w:val="24"/>
-              </w:rPr>
-            </w:r>
-            <w:r>
-              <w:t>{% for item in ket_noi_internet %}</w:t>
-            </w:r>
-            <w:r>
               <w:t>{{item.idx}}</w:t>
             </w:r>
           </w:p>
@@ -6421,13 +6469,6 @@
               </w:rPr>
             </w:pPr>
             <w:r>
-              <w:rPr>
-                <w:rFonts w:ascii="Times New Roman" w:hAnsi="Times New Roman" w:cs="Times New Roman"/>
-                <w:sz w:val="24"/>
-                <w:szCs w:val="24"/>
-              </w:rPr>
-            </w:r>
-            <w:r>
               <w:t>{{item.isp}}</w:t>
             </w:r>
           </w:p>
@@ -6451,31 +6492,6 @@
                 <w:szCs w:val="24"/>
               </w:rPr>
             </w:pPr>
-            <w:proofErr w:type="spellStart"/>
-            <w:r>
-              <w:rPr>
-                <w:rFonts w:ascii="Times New Roman" w:hAnsi="Times New Roman" w:cs="Times New Roman"/>
-                <w:sz w:val="24"/>
-                <w:szCs w:val="24"/>
-              </w:rPr>
-            </w:r>
-            <w:proofErr w:type="spellEnd"/>
-            <w:r>
-              <w:rPr>
-                <w:rFonts w:ascii="Times New Roman" w:hAnsi="Times New Roman" w:cs="Times New Roman"/>
-                <w:sz w:val="24"/>
-                <w:szCs w:val="24"/>
-              </w:rPr>
-            </w:r>
-            <w:proofErr w:type="spellStart"/>
-            <w:r>
-              <w:rPr>
-                <w:rFonts w:ascii="Times New Roman" w:hAnsi="Times New Roman" w:cs="Times New Roman"/>
-                <w:sz w:val="24"/>
-                <w:szCs w:val="24"/>
-              </w:rPr>
-            </w:r>
-            <w:proofErr w:type="spellEnd"/>
             <w:r>
               <w:t>{{item.loai_ket_noi}}</w:t>
             </w:r>
@@ -6500,47 +6516,6 @@
                 <w:szCs w:val="24"/>
               </w:rPr>
             </w:pPr>
-            <w:proofErr w:type="spellStart"/>
-            <w:r>
-              <w:rPr>
-                <w:rFonts w:ascii="Times New Roman" w:hAnsi="Times New Roman" w:cs="Times New Roman"/>
-                <w:sz w:val="24"/>
-                <w:szCs w:val="24"/>
-              </w:rPr>
-            </w:r>
-            <w:proofErr w:type="spellEnd"/>
-            <w:r>
-              <w:rPr>
-                <w:rFonts w:ascii="Times New Roman" w:hAnsi="Times New Roman" w:cs="Times New Roman"/>
-                <w:sz w:val="24"/>
-                <w:szCs w:val="24"/>
-              </w:rPr>
-            </w:r>
-            <w:proofErr w:type="spellStart"/>
-            <w:r>
-              <w:rPr>
-                <w:rFonts w:ascii="Times New Roman" w:hAnsi="Times New Roman" w:cs="Times New Roman"/>
-                <w:sz w:val="24"/>
-                <w:szCs w:val="24"/>
-              </w:rPr>
-            </w:r>
-            <w:proofErr w:type="spellEnd"/>
-            <w:r>
-              <w:rPr>
-                <w:rFonts w:ascii="Times New Roman" w:hAnsi="Times New Roman" w:cs="Times New Roman"/>
-                <w:sz w:val="24"/>
-                <w:szCs w:val="24"/>
-              </w:rPr>
-            </w:r>
-            <w:proofErr w:type="spellStart"/>
-            <w:r>
-              <w:rPr>
-                <w:rFonts w:ascii="Times New Roman" w:hAnsi="Times New Roman" w:cs="Times New Roman"/>
-                <w:sz w:val="24"/>
-                <w:szCs w:val="24"/>
-              </w:rPr>
-            </w:r>
-            <w:proofErr w:type="spellEnd"/>
             <w:r>
               <w:t>{{item.bang_thong}}</w:t>
             </w:r>
@@ -6565,15 +6540,6 @@
                 <w:szCs w:val="24"/>
               </w:rPr>
             </w:pPr>
-            <w:proofErr w:type="spellStart"/>
-            <w:r>
-              <w:rPr>
-                <w:rFonts w:ascii="Times New Roman" w:hAnsi="Times New Roman" w:cs="Times New Roman"/>
-                <w:sz w:val="24"/>
-                <w:szCs w:val="24"/>
-              </w:rPr>
-            </w:r>
-            <w:proofErr w:type="spellEnd"/>
             <w:r>
               <w:t>{{item.vai_tro}}</w:t>
             </w:r>
@@ -6598,15 +6564,6 @@
                 <w:szCs w:val="24"/>
               </w:rPr>
             </w:pPr>
-            <w:proofErr w:type="spellStart"/>
-            <w:r>
-              <w:rPr>
-                <w:rFonts w:ascii="Times New Roman" w:hAnsi="Times New Roman" w:cs="Times New Roman"/>
-                <w:sz w:val="24"/>
-                <w:szCs w:val="24"/>
-              </w:rPr>
-            </w:r>
-            <w:proofErr w:type="spellEnd"/>
             <w:r>
               <w:t>{{item.ip_wan}}</w:t>
             </w:r>
@@ -6634,10 +6591,55 @@
             <w:r>
               <w:t>{{item.ghi_chu}}</w:t>
             </w:r>
-            <w:r>
-              <w:t>{% endfor %}</w:t>
-            </w:r>
-          </w:p>
+          </w:p>
+        </w:tc>
+      </w:tr>
+      <w:tr>
+        <w:tc>
+          <w:tcPr>
+            <w:tcW w:type="dxa" w:w="1332"/>
+          </w:tcPr>
+          <w:p>
+            <w:r>
+              <w:t>{%tr endfor %}</w:t>
+            </w:r>
+          </w:p>
+        </w:tc>
+        <w:tc>
+          <w:tcPr>
+            <w:tcW w:type="dxa" w:w="1413"/>
+          </w:tcPr>
+          <w:p/>
+        </w:tc>
+        <w:tc>
+          <w:tcPr>
+            <w:tcW w:type="dxa" w:w="1333"/>
+          </w:tcPr>
+          <w:p/>
+        </w:tc>
+        <w:tc>
+          <w:tcPr>
+            <w:tcW w:type="dxa" w:w="1332"/>
+          </w:tcPr>
+          <w:p/>
+        </w:tc>
+        <w:tc>
+          <w:tcPr>
+            <w:tcW w:type="dxa" w:w="1413"/>
+          </w:tcPr>
+          <w:p/>
+        </w:tc>
+        <w:tc>
+          <w:tcPr>
+            <w:tcW w:type="dxa" w:w="1414"/>
+          </w:tcPr>
+          <w:p/>
+        </w:tc>
+        <w:tc>
+          <w:tcPr>
+            <w:tcW w:type="dxa" w:w="1334"/>
+          </w:tcPr>
+          <w:p/>
         </w:tc>
       </w:tr>
       <w:tr>
@@ -7921,7 +7923,6 @@
       <w:tblPr>
         <w:tblStyle w:val="TableGrid"/>
         <w:tblW w:w="0" w:type="auto"/>
-        <w:tblLayout w:type="autofit"/>
         <w:tblLook w:val="04A0" w:firstRow="1" w:lastRow="0" w:firstColumn="1" w:lastColumn="0" w:noHBand="0" w:noVBand="1"/>
       </w:tblPr>
       <w:tblGrid>
@@ -8206,6 +8207,60 @@
       <w:tr>
         <w:tc>
           <w:tcPr>
+            <w:tcW w:type="dxa" w:w="912"/>
+          </w:tcPr>
+          <w:p>
+            <w:r>
+              <w:t>{%tr for item in thiet_bi_mang %}</w:t>
+            </w:r>
+          </w:p>
+        </w:tc>
+        <w:tc>
+          <w:tcPr>
+            <w:tcW w:type="dxa" w:w="1229"/>
+          </w:tcPr>
+          <w:p/>
+        </w:tc>
+        <w:tc>
+          <w:tcPr>
+            <w:tcW w:type="dxa" w:w="1063"/>
+          </w:tcPr>
+          <w:p/>
+        </w:tc>
+        <w:tc>
+          <w:tcPr>
+            <w:tcW w:type="dxa" w:w="1145"/>
+          </w:tcPr>
+          <w:p/>
+        </w:tc>
+        <w:tc>
+          <w:tcPr>
+            <w:tcW w:type="dxa" w:w="1829"/>
+          </w:tcPr>
+          <w:p/>
+        </w:tc>
+        <w:tc>
+          <w:tcPr>
+            <w:tcW w:type="dxa" w:w="1314"/>
+          </w:tcPr>
+          <w:p/>
+        </w:tc>
+        <w:tc>
+          <w:tcPr>
+            <w:tcW w:type="dxa" w:w="932"/>
+          </w:tcPr>
+          <w:p/>
+        </w:tc>
+        <w:tc>
+          <w:tcPr>
+            <w:tcW w:type="dxa" w:w="1147"/>
+          </w:tcPr>
+          <w:p/>
+        </w:tc>
+      </w:tr>
+      <w:tr>
+        <w:tc>
+          <w:tcPr>
             <w:tcW w:w="1169" w:type="dxa"/>
             <w:tcBorders>
               <w:top w:val="single" w:sz="4" w:space="0" w:color="CBD5E1"/>
@@ -8225,16 +8280,6 @@
               </w:rPr>
             </w:pPr>
             <w:r>
-              <w:rPr>
-                <w:rFonts w:ascii="Times New Roman" w:hAnsi="Times New Roman" w:cs="Times New Roman"/>
-                <w:sz w:val="24"/>
-                <w:szCs w:val="24"/>
-              </w:rPr>
-            </w:r>
-            <w:r>
-              <w:t>{% for item in thiet_bi_mang %}</w:t>
-            </w:r>
-            <w:r>
               <w:t>{{item.idx}}</w:t>
             </w:r>
           </w:p>
@@ -8259,15 +8304,6 @@
               </w:rPr>
             </w:pPr>
             <w:r>
-              <w:rPr>
-                <w:rFonts w:ascii="Times New Roman" w:hAnsi="Times New Roman" w:cs="Times New Roman"/>
-                <w:i/>
-                <w:color w:val="065F46"/>
-                <w:sz w:val="24"/>
-                <w:szCs w:val="24"/>
-              </w:rPr>
-            </w:r>
-            <w:r>
               <w:t>{{item.loai_thiet_bi}}</w:t>
             </w:r>
           </w:p>
@@ -8292,15 +8328,6 @@
               </w:rPr>
             </w:pPr>
             <w:r>
-              <w:rPr>
-                <w:rFonts w:ascii="Times New Roman" w:hAnsi="Times New Roman" w:cs="Times New Roman"/>
-                <w:i/>
-                <w:color w:val="065F46"/>
-                <w:sz w:val="24"/>
-                <w:szCs w:val="24"/>
-              </w:rPr>
-            </w:r>
-            <w:r>
               <w:t>{{item.hang_san_xuat}}</w:t>
             </w:r>
           </w:p>
@@ -8325,15 +8352,6 @@
               </w:rPr>
             </w:pPr>
             <w:r>
-              <w:rPr>
-                <w:rFonts w:ascii="Times New Roman" w:hAnsi="Times New Roman" w:cs="Times New Roman"/>
-                <w:i/>
-                <w:color w:val="065F46"/>
-                <w:sz w:val="24"/>
-                <w:szCs w:val="24"/>
-              </w:rPr>
-            </w:r>
-            <w:r>
               <w:t>{{item.model}}</w:t>
             </w:r>
           </w:p>
@@ -8358,15 +8376,6 @@
               </w:rPr>
             </w:pPr>
             <w:r>
-              <w:rPr>
-                <w:rFonts w:ascii="Times New Roman" w:hAnsi="Times New Roman" w:cs="Times New Roman"/>
-                <w:i/>
-                <w:color w:val="065F46"/>
-                <w:sz w:val="24"/>
-                <w:szCs w:val="24"/>
-              </w:rPr>
-            </w:r>
-            <w:r>
               <w:t>{{item.so_serial}}</w:t>
             </w:r>
           </w:p>
@@ -8390,66 +8399,6 @@
                 <w:szCs w:val="24"/>
               </w:rPr>
             </w:pPr>
-            <w:proofErr w:type="spellStart"/>
-            <w:r>
-              <w:rPr>
-                <w:rFonts w:ascii="Times New Roman" w:hAnsi="Times New Roman" w:cs="Times New Roman"/>
-                <w:i/>
-                <w:color w:val="065F46"/>
-                <w:sz w:val="24"/>
-                <w:szCs w:val="24"/>
-              </w:rPr>
-            </w:r>
-            <w:proofErr w:type="spellEnd"/>
-            <w:r>
-              <w:rPr>
-                <w:rFonts w:ascii="Times New Roman" w:hAnsi="Times New Roman" w:cs="Times New Roman"/>
-                <w:i/>
-                <w:color w:val="065F46"/>
-                <w:sz w:val="24"/>
-                <w:szCs w:val="24"/>
-              </w:rPr>
-            </w:r>
-            <w:proofErr w:type="spellStart"/>
-            <w:r>
-              <w:rPr>
-                <w:rFonts w:ascii="Times New Roman" w:hAnsi="Times New Roman" w:cs="Times New Roman"/>
-                <w:i/>
-                <w:color w:val="065F46"/>
-                <w:sz w:val="24"/>
-                <w:szCs w:val="24"/>
-              </w:rPr>
-            </w:r>
-            <w:proofErr w:type="spellEnd"/>
-            <w:r>
-              <w:rPr>
-                <w:rFonts w:ascii="Times New Roman" w:hAnsi="Times New Roman" w:cs="Times New Roman"/>
-                <w:i/>
-                <w:color w:val="065F46"/>
-                <w:sz w:val="24"/>
-                <w:szCs w:val="24"/>
-              </w:rPr>
-            </w:r>
-            <w:proofErr w:type="spellStart"/>
-            <w:r>
-              <w:rPr>
-                <w:rFonts w:ascii="Times New Roman" w:hAnsi="Times New Roman" w:cs="Times New Roman"/>
-                <w:i/>
-                <w:color w:val="065F46"/>
-                <w:sz w:val="24"/>
-                <w:szCs w:val="24"/>
-              </w:rPr>
-            </w:r>
-            <w:proofErr w:type="spellEnd"/>
-            <w:r>
-              <w:rPr>
-                <w:rFonts w:ascii="Times New Roman" w:hAnsi="Times New Roman" w:cs="Times New Roman"/>
-                <w:i/>
-                <w:color w:val="065F46"/>
-                <w:sz w:val="24"/>
-                <w:szCs w:val="24"/>
-              </w:rPr>
-            </w:r>
             <w:r>
               <w:t>{{item.vi_tri}}</w:t>
             </w:r>
@@ -8474,15 +8423,6 @@
                 <w:szCs w:val="24"/>
               </w:rPr>
             </w:pPr>
-            <w:r>
-              <w:rPr>
-                <w:rFonts w:ascii="Times New Roman" w:hAnsi="Times New Roman" w:cs="Times New Roman"/>
-                <w:i/>
-                <w:color w:val="065F46"/>
-                <w:sz w:val="24"/>
-                <w:szCs w:val="24"/>
-              </w:rPr>
-            </w:r>
             <w:r>
               <w:t>{{item.nam_mua}}</w:t>
             </w:r>
@@ -8510,52 +8450,63 @@
               </w:rPr>
             </w:pPr>
             <w:r>
-              <w:rPr>
-                <w:rFonts w:ascii="Times New Roman" w:hAnsi="Times New Roman" w:cs="Times New Roman"/>
-                <w:i/>
-                <w:color w:val="065F46"/>
-                <w:sz w:val="24"/>
-                <w:szCs w:val="24"/>
-              </w:rPr>
-            </w:r>
-            <w:proofErr w:type="spellStart"/>
-            <w:r>
-              <w:rPr>
-                <w:rFonts w:ascii="Times New Roman" w:hAnsi="Times New Roman" w:cs="Times New Roman"/>
-                <w:i/>
-                <w:color w:val="065F46"/>
-                <w:sz w:val="24"/>
-                <w:szCs w:val="24"/>
-              </w:rPr>
-            </w:r>
-            <w:proofErr w:type="spellEnd"/>
-            <w:r>
-              <w:rPr>
-                <w:rFonts w:ascii="Times New Roman" w:hAnsi="Times New Roman" w:cs="Times New Roman"/>
-                <w:i/>
-                <w:color w:val="065F46"/>
-                <w:sz w:val="24"/>
-                <w:szCs w:val="24"/>
-              </w:rPr>
-            </w:r>
-            <w:proofErr w:type="spellStart"/>
-            <w:r>
-              <w:rPr>
-                <w:rFonts w:ascii="Times New Roman" w:hAnsi="Times New Roman" w:cs="Times New Roman"/>
-                <w:i/>
-                <w:color w:val="065F46"/>
-                <w:sz w:val="24"/>
-                <w:szCs w:val="24"/>
-              </w:rPr>
-            </w:r>
-            <w:proofErr w:type="spellEnd"/>
-            <w:r>
               <w:t>{{item.ghi_chu}}</w:t>
             </w:r>
-            <w:r>
-              <w:t>{% endfor %}</w:t>
-            </w:r>
-          </w:p>
+          </w:p>
+        </w:tc>
+      </w:tr>
+      <w:tr>
+        <w:tc>
+          <w:tcPr>
+            <w:tcW w:type="dxa" w:w="912"/>
+          </w:tcPr>
+          <w:p>
+            <w:r>
+              <w:t>{%tr endfor %}</w:t>
+            </w:r>
+          </w:p>
+        </w:tc>
+        <w:tc>
+          <w:tcPr>
+            <w:tcW w:type="dxa" w:w="1229"/>
+          </w:tcPr>
+          <w:p/>
+        </w:tc>
+        <w:tc>
+          <w:tcPr>
+            <w:tcW w:type="dxa" w:w="1063"/>
+          </w:tcPr>
+          <w:p/>
+        </w:tc>
+        <w:tc>
+          <w:tcPr>
+            <w:tcW w:type="dxa" w:w="1145"/>
+          </w:tcPr>
+          <w:p/>
+        </w:tc>
+        <w:tc>
+          <w:tcPr>
+            <w:tcW w:type="dxa" w:w="1829"/>
+          </w:tcPr>
+          <w:p/>
+        </w:tc>
+        <w:tc>
+          <w:tcPr>
+            <w:tcW w:type="dxa" w:w="1314"/>
+          </w:tcPr>
+          <w:p/>
+        </w:tc>
+        <w:tc>
+          <w:tcPr>
+            <w:tcW w:type="dxa" w:w="932"/>
+          </w:tcPr>
+          <w:p/>
+        </w:tc>
+        <w:tc>
+          <w:tcPr>
+            <w:tcW w:type="dxa" w:w="1147"/>
+          </w:tcPr>
+          <w:p/>
         </w:tc>
       </w:tr>
       <w:tr>
@@ -12058,7 +12009,6 @@
       <w:tblPr>
         <w:tblStyle w:val="TableGrid"/>
         <w:tblW w:w="0" w:type="auto"/>
-        <w:tblLayout w:type="autofit"/>
         <w:tblLook w:val="04A0" w:firstRow="1" w:lastRow="0" w:firstColumn="1" w:lastColumn="0" w:noHBand="0" w:noVBand="1"/>
       </w:tblPr>
       <w:tblGrid>
@@ -12354,6 +12304,60 @@
       <w:tr>
         <w:tc>
           <w:tcPr>
+            <w:tcW w:type="dxa" w:w="917"/>
+          </w:tcPr>
+          <w:p>
+            <w:r>
+              <w:t>{%tr for item in may_chu %}</w:t>
+            </w:r>
+          </w:p>
+        </w:tc>
+        <w:tc>
+          <w:tcPr>
+            <w:tcW w:type="dxa" w:w="1303"/>
+          </w:tcPr>
+          <w:p/>
+        </w:tc>
+        <w:tc>
+          <w:tcPr>
+            <w:tcW w:type="dxa" w:w="1376"/>
+          </w:tcPr>
+          <w:p/>
+        </w:tc>
+        <w:tc>
+          <w:tcPr>
+            <w:tcW w:type="dxa" w:w="1536"/>
+          </w:tcPr>
+          <w:p/>
+        </w:tc>
+        <w:tc>
+          <w:tcPr>
+            <w:tcW w:type="dxa" w:w="977"/>
+          </w:tcPr>
+          <w:p/>
+        </w:tc>
+        <w:tc>
+          <w:tcPr>
+            <w:tcW w:type="dxa" w:w="942"/>
+          </w:tcPr>
+          <w:p/>
+        </w:tc>
+        <w:tc>
+          <w:tcPr>
+            <w:tcW w:type="dxa" w:w="1255"/>
+          </w:tcPr>
+          <w:p/>
+        </w:tc>
+        <w:tc>
+          <w:tcPr>
+            <w:tcW w:type="dxa" w:w="1265"/>
+          </w:tcPr>
+          <w:p/>
+        </w:tc>
+      </w:tr>
+      <w:tr>
+        <w:tc>
+          <w:tcPr>
             <w:tcW w:w="1169" w:type="dxa"/>
             <w:tcBorders>
               <w:top w:val="single" w:sz="4" w:space="0" w:color="CBD5E1"/>
@@ -12373,16 +12377,6 @@
               </w:rPr>
             </w:pPr>
             <w:r>
-              <w:rPr>
-                <w:rFonts w:ascii="Times New Roman" w:hAnsi="Times New Roman" w:cs="Times New Roman"/>
-                <w:sz w:val="24"/>
-                <w:szCs w:val="24"/>
-              </w:rPr>
-            </w:r>
-            <w:r>
-              <w:t>{% for item in may_chu %}</w:t>
-            </w:r>
-            <w:r>
               <w:t>{{item.idx}}</w:t>
             </w:r>
           </w:p>
@@ -12407,46 +12401,6 @@
               </w:rPr>
             </w:pPr>
             <w:r>
-              <w:rPr>
-                <w:rFonts w:ascii="Times New Roman" w:hAnsi="Times New Roman" w:cs="Times New Roman"/>
-                <w:i/>
-                <w:color w:val="065F46"/>
-                <w:sz w:val="24"/>
-                <w:szCs w:val="24"/>
-              </w:rPr>
-            </w:r>
-            <w:proofErr w:type="spellStart"/>
-            <w:r>
-              <w:rPr>
-                <w:rFonts w:ascii="Times New Roman" w:hAnsi="Times New Roman" w:cs="Times New Roman"/>
-                <w:i/>
-                <w:color w:val="065F46"/>
-                <w:sz w:val="24"/>
-                <w:szCs w:val="24"/>
-              </w:rPr>
-            </w:r>
-            <w:proofErr w:type="spellEnd"/>
-            <w:r>
-              <w:rPr>
-                <w:rFonts w:ascii="Times New Roman" w:hAnsi="Times New Roman" w:cs="Times New Roman"/>
-                <w:i/>
-                <w:color w:val="065F46"/>
-                <w:sz w:val="24"/>
-                <w:szCs w:val="24"/>
-              </w:rPr>
-            </w:r>
-            <w:proofErr w:type="spellStart"/>
-            <w:r>
-              <w:rPr>
-                <w:rFonts w:ascii="Times New Roman" w:hAnsi="Times New Roman" w:cs="Times New Roman"/>
-                <w:i/>
-                <w:color w:val="065F46"/>
-                <w:sz w:val="24"/>
-                <w:szCs w:val="24"/>
-              </w:rPr>
-            </w:r>
-            <w:proofErr w:type="spellEnd"/>
-            <w:r>
               <w:t>{{item.vai_tro}}</w:t>
             </w:r>
           </w:p>
@@ -12471,15 +12425,6 @@
               </w:rPr>
             </w:pPr>
             <w:r>
-              <w:rPr>
-                <w:rFonts w:ascii="Times New Roman" w:hAnsi="Times New Roman" w:cs="Times New Roman"/>
-                <w:i/>
-                <w:color w:val="065F46"/>
-                <w:sz w:val="24"/>
-                <w:szCs w:val="24"/>
-              </w:rPr>
-            </w:r>
-            <w:r>
               <w:t>{{item.hang_model}}</w:t>
             </w:r>
           </w:p>
@@ -12504,13 +12449,6 @@
               </w:rPr>
             </w:pPr>
             <w:r>
-              <w:rPr>
-                <w:rFonts w:ascii="Times New Roman" w:hAnsi="Times New Roman" w:cs="Times New Roman"/>
-                <w:sz w:val="24"/>
-                <w:szCs w:val="24"/>
-              </w:rPr>
-            </w:r>
-            <w:r>
               <w:t>{{item.so_serial}}</w:t>
             </w:r>
           </w:p>
@@ -12535,13 +12473,6 @@
               </w:rPr>
             </w:pPr>
             <w:r>
-              <w:rPr>
-                <w:rFonts w:ascii="Times New Roman" w:hAnsi="Times New Roman" w:cs="Times New Roman"/>
-                <w:sz w:val="24"/>
-                <w:szCs w:val="24"/>
-              </w:rPr>
-            </w:r>
-            <w:r>
               <w:t>{{item.ram_gb}}</w:t>
             </w:r>
           </w:p>
@@ -12566,13 +12497,6 @@
               </w:rPr>
             </w:pPr>
             <w:r>
-              <w:rPr>
-                <w:rFonts w:ascii="Times New Roman" w:hAnsi="Times New Roman" w:cs="Times New Roman"/>
-                <w:sz w:val="24"/>
-                <w:szCs w:val="24"/>
-              </w:rPr>
-            </w:r>
-            <w:r>
               <w:t>{{item.o_cung_tb}}</w:t>
             </w:r>
           </w:p>
@@ -12596,15 +12520,6 @@
                 <w:szCs w:val="24"/>
               </w:rPr>
             </w:pPr>
-            <w:r>
-              <w:rPr>
-                <w:rFonts w:ascii="Times New Roman" w:hAnsi="Times New Roman" w:cs="Times New Roman"/>
-                <w:i/>
-                <w:color w:val="065F46"/>
-                <w:sz w:val="24"/>
-                <w:szCs w:val="24"/>
-              </w:rPr>
-            </w:r>
             <w:r>
               <w:t>{{item.he_dieu_hanh}}</w:t>
             </w:r>
@@ -12631,53 +12546,64 @@
                 <w:szCs w:val="24"/>
               </w:rPr>
             </w:pPr>
-            <w:proofErr w:type="spellStart"/>
-            <w:r>
-              <w:rPr>
-                <w:rFonts w:ascii="Times New Roman" w:hAnsi="Times New Roman" w:cs="Times New Roman"/>
-                <w:i/>
-                <w:color w:val="065F46"/>
-                <w:sz w:val="24"/>
-                <w:szCs w:val="24"/>
-              </w:rPr>
-            </w:r>
-            <w:proofErr w:type="spellEnd"/>
-            <w:r>
-              <w:rPr>
-                <w:rFonts w:ascii="Times New Roman" w:hAnsi="Times New Roman" w:cs="Times New Roman"/>
-                <w:i/>
-                <w:color w:val="065F46"/>
-                <w:sz w:val="24"/>
-                <w:szCs w:val="24"/>
-              </w:rPr>
-            </w:r>
-            <w:proofErr w:type="spellStart"/>
-            <w:r>
-              <w:rPr>
-                <w:rFonts w:ascii="Times New Roman" w:hAnsi="Times New Roman" w:cs="Times New Roman"/>
-                <w:i/>
-                <w:color w:val="065F46"/>
-                <w:sz w:val="24"/>
-                <w:szCs w:val="24"/>
-              </w:rPr>
-            </w:r>
-            <w:proofErr w:type="spellEnd"/>
-            <w:r>
-              <w:rPr>
-                <w:rFonts w:ascii="Times New Roman" w:hAnsi="Times New Roman" w:cs="Times New Roman"/>
-                <w:i/>
-                <w:color w:val="065F46"/>
-                <w:sz w:val="24"/>
-                <w:szCs w:val="24"/>
-              </w:rPr>
-            </w:r>
             <w:r>
               <w:t>{{item.vi_tri}}</w:t>
             </w:r>
-            <w:r>
-              <w:t>{% endfor %}</w:t>
-            </w:r>
-          </w:p>
+          </w:p>
+        </w:tc>
+      </w:tr>
+      <w:tr>
+        <w:tc>
+          <w:tcPr>
+            <w:tcW w:type="dxa" w:w="917"/>
+          </w:tcPr>
+          <w:p>
+            <w:r>
+              <w:t>{%tr endfor %}</w:t>
+            </w:r>
+          </w:p>
+        </w:tc>
+        <w:tc>
+          <w:tcPr>
+            <w:tcW w:type="dxa" w:w="1303"/>
+          </w:tcPr>
+          <w:p/>
+        </w:tc>
+        <w:tc>
+          <w:tcPr>
+            <w:tcW w:type="dxa" w:w="1376"/>
+          </w:tcPr>
+          <w:p/>
+        </w:tc>
+        <w:tc>
+          <w:tcPr>
+            <w:tcW w:type="dxa" w:w="1536"/>
+          </w:tcPr>
+          <w:p/>
+        </w:tc>
+        <w:tc>
+          <w:tcPr>
+            <w:tcW w:type="dxa" w:w="977"/>
+          </w:tcPr>
+          <w:p/>
+        </w:tc>
+        <w:tc>
+          <w:tcPr>
+            <w:tcW w:type="dxa" w:w="942"/>
+          </w:tcPr>
+          <w:p/>
+        </w:tc>
+        <w:tc>
+          <w:tcPr>
+            <w:tcW w:type="dxa" w:w="1255"/>
+          </w:tcPr>
+          <w:p/>
+        </w:tc>
+        <w:tc>
+          <w:tcPr>
+            <w:tcW w:type="dxa" w:w="1265"/>
+          </w:tcPr>
+          <w:p/>
         </w:tc>
       </w:tr>
       <w:tr>
@@ -13618,7 +13544,6 @@
       <w:tblPr>
         <w:tblStyle w:val="TableGrid"/>
         <w:tblW w:w="0" w:type="auto"/>
-        <w:tblLayout w:type="autofit"/>
         <w:tblLook w:val="04A0" w:firstRow="1" w:lastRow="0" w:firstColumn="1" w:lastColumn="0" w:noHBand="0" w:noVBand="1"/>
       </w:tblPr>
       <w:tblGrid>
@@ -13859,6 +13784,54 @@
       <w:tr>
         <w:tc>
           <w:tcPr>
+            <w:tcW w:type="dxa" w:w="1129"/>
+          </w:tcPr>
+          <w:p>
+            <w:r>
+              <w:t>{%tr for item in camera %}</w:t>
+            </w:r>
+          </w:p>
+        </w:tc>
+        <w:tc>
+          <w:tcPr>
+            <w:tcW w:type="dxa" w:w="1247"/>
+          </w:tcPr>
+          <w:p/>
+        </w:tc>
+        <w:tc>
+          <w:tcPr>
+            <w:tcW w:type="dxa" w:w="1496"/>
+          </w:tcPr>
+          <w:p/>
+        </w:tc>
+        <w:tc>
+          <w:tcPr>
+            <w:tcW w:type="dxa" w:w="1575"/>
+          </w:tcPr>
+          <w:p/>
+        </w:tc>
+        <w:tc>
+          <w:tcPr>
+            <w:tcW w:type="dxa" w:w="1150"/>
+          </w:tcPr>
+          <w:p/>
+        </w:tc>
+        <w:tc>
+          <w:tcPr>
+            <w:tcW w:type="dxa" w:w="1406"/>
+          </w:tcPr>
+          <w:p/>
+        </w:tc>
+        <w:tc>
+          <w:tcPr>
+            <w:tcW w:type="dxa" w:w="1568"/>
+          </w:tcPr>
+          <w:p/>
+        </w:tc>
+      </w:tr>
+      <w:tr>
+        <w:tc>
+          <w:tcPr>
             <w:tcW w:w="1129" w:type="dxa"/>
             <w:tcBorders>
               <w:top w:val="single" w:sz="4" w:space="0" w:color="CBD5E1"/>
@@ -13878,16 +13851,6 @@
               </w:rPr>
             </w:pPr>
             <w:r>
-              <w:rPr>
-                <w:rFonts w:ascii="Times New Roman" w:hAnsi="Times New Roman" w:cs="Times New Roman"/>
-                <w:sz w:val="24"/>
-                <w:szCs w:val="24"/>
-              </w:rPr>
-            </w:r>
-            <w:r>
-              <w:t>{% for item in camera %}</w:t>
-            </w:r>
-            <w:r>
               <w:t>{{item.idx}}</w:t>
             </w:r>
           </w:p>
@@ -13912,15 +13875,6 @@
               </w:rPr>
             </w:pPr>
             <w:r>
-              <w:rPr>
-                <w:rFonts w:ascii="Times New Roman" w:hAnsi="Times New Roman" w:cs="Times New Roman"/>
-                <w:i/>
-                <w:color w:val="065F46"/>
-                <w:sz w:val="24"/>
-                <w:szCs w:val="24"/>
-              </w:rPr>
-            </w:r>
-            <w:r>
               <w:t>{{item.hang_san_xuat}}</w:t>
             </w:r>
           </w:p>
@@ -13945,15 +13899,6 @@
               </w:rPr>
             </w:pPr>
             <w:r>
-              <w:rPr>
-                <w:rFonts w:ascii="Times New Roman" w:hAnsi="Times New Roman" w:cs="Times New Roman"/>
-                <w:i/>
-                <w:color w:val="065F46"/>
-                <w:sz w:val="24"/>
-                <w:szCs w:val="24"/>
-              </w:rPr>
-            </w:r>
-            <w:r>
               <w:t>{{item.model}}</w:t>
             </w:r>
           </w:p>
@@ -13978,15 +13923,6 @@
               </w:rPr>
             </w:pPr>
             <w:r>
-              <w:rPr>
-                <w:rFonts w:ascii="Times New Roman" w:hAnsi="Times New Roman" w:cs="Times New Roman"/>
-                <w:i/>
-                <w:color w:val="065F46"/>
-                <w:sz w:val="24"/>
-                <w:szCs w:val="24"/>
-              </w:rPr>
-            </w:r>
-            <w:r>
               <w:t>{{item.so_serial}}</w:t>
             </w:r>
           </w:p>
@@ -14011,15 +13947,6 @@
               </w:rPr>
             </w:pPr>
             <w:r>
-              <w:rPr>
-                <w:rFonts w:ascii="Times New Roman" w:hAnsi="Times New Roman" w:cs="Times New Roman"/>
-                <w:i/>
-                <w:color w:val="065F46"/>
-                <w:sz w:val="24"/>
-                <w:szCs w:val="24"/>
-              </w:rPr>
-            </w:r>
-            <w:r>
               <w:t>{{item.do_phan_giai}}</w:t>
             </w:r>
           </w:p>
@@ -14043,97 +13970,6 @@
                 <w:szCs w:val="24"/>
               </w:rPr>
             </w:pPr>
-            <w:proofErr w:type="spellStart"/>
-            <w:r>
-              <w:rPr>
-                <w:rFonts w:ascii="Times New Roman" w:hAnsi="Times New Roman" w:cs="Times New Roman"/>
-                <w:i/>
-                <w:color w:val="065F46"/>
-                <w:sz w:val="24"/>
-                <w:szCs w:val="24"/>
-              </w:rPr>
-            </w:r>
-            <w:proofErr w:type="spellEnd"/>
-            <w:r>
-              <w:rPr>
-                <w:rFonts w:ascii="Times New Roman" w:hAnsi="Times New Roman" w:cs="Times New Roman"/>
-                <w:i/>
-                <w:color w:val="065F46"/>
-                <w:sz w:val="24"/>
-                <w:szCs w:val="24"/>
-              </w:rPr>
-            </w:r>
-            <w:proofErr w:type="spellStart"/>
-            <w:r>
-              <w:rPr>
-                <w:rFonts w:ascii="Times New Roman" w:hAnsi="Times New Roman" w:cs="Times New Roman"/>
-                <w:i/>
-                <w:color w:val="065F46"/>
-                <w:sz w:val="24"/>
-                <w:szCs w:val="24"/>
-              </w:rPr>
-            </w:r>
-            <w:proofErr w:type="spellEnd"/>
-            <w:r>
-              <w:rPr>
-                <w:rFonts w:ascii="Times New Roman" w:hAnsi="Times New Roman" w:cs="Times New Roman"/>
-                <w:i/>
-                <w:color w:val="065F46"/>
-                <w:sz w:val="24"/>
-                <w:szCs w:val="24"/>
-              </w:rPr>
-            </w:r>
-            <w:proofErr w:type="spellStart"/>
-            <w:r>
-              <w:rPr>
-                <w:rFonts w:ascii="Times New Roman" w:hAnsi="Times New Roman" w:cs="Times New Roman"/>
-                <w:i/>
-                <w:color w:val="065F46"/>
-                <w:sz w:val="24"/>
-                <w:szCs w:val="24"/>
-              </w:rPr>
-            </w:r>
-            <w:proofErr w:type="spellEnd"/>
-            <w:r>
-              <w:rPr>
-                <w:rFonts w:ascii="Times New Roman" w:hAnsi="Times New Roman" w:cs="Times New Roman"/>
-                <w:i/>
-                <w:color w:val="065F46"/>
-                <w:sz w:val="24"/>
-                <w:szCs w:val="24"/>
-              </w:rPr>
-            </w:r>
-            <w:proofErr w:type="spellStart"/>
-            <w:r>
-              <w:rPr>
-                <w:rFonts w:ascii="Times New Roman" w:hAnsi="Times New Roman" w:cs="Times New Roman"/>
-                <w:i/>
-                <w:color w:val="065F46"/>
-                <w:sz w:val="24"/>
-                <w:szCs w:val="24"/>
-              </w:rPr>
-            </w:r>
-            <w:proofErr w:type="spellEnd"/>
-            <w:r>
-              <w:rPr>
-                <w:rFonts w:ascii="Times New Roman" w:hAnsi="Times New Roman" w:cs="Times New Roman"/>
-                <w:i/>
-                <w:color w:val="065F46"/>
-                <w:sz w:val="24"/>
-                <w:szCs w:val="24"/>
-              </w:rPr>
-            </w:r>
-            <w:proofErr w:type="spellStart"/>
-            <w:r>
-              <w:rPr>
-                <w:rFonts w:ascii="Times New Roman" w:hAnsi="Times New Roman" w:cs="Times New Roman"/>
-                <w:i/>
-                <w:color w:val="065F46"/>
-                <w:sz w:val="24"/>
-                <w:szCs w:val="24"/>
-              </w:rPr>
-            </w:r>
-            <w:proofErr w:type="spellEnd"/>
             <w:r>
               <w:t>{{item.vi_tri}}</w:t>
             </w:r>
@@ -14161,101 +13997,57 @@
               </w:rPr>
             </w:pPr>
             <w:r>
-              <w:rPr>
-                <w:rFonts w:ascii="Times New Roman" w:hAnsi="Times New Roman" w:cs="Times New Roman"/>
-                <w:i/>
-                <w:color w:val="065F46"/>
-                <w:sz w:val="24"/>
-                <w:szCs w:val="24"/>
-              </w:rPr>
-            </w:r>
-            <w:proofErr w:type="spellStart"/>
-            <w:r>
-              <w:rPr>
-                <w:rFonts w:ascii="Times New Roman" w:hAnsi="Times New Roman" w:cs="Times New Roman"/>
-                <w:i/>
-                <w:color w:val="065F46"/>
-                <w:sz w:val="24"/>
-                <w:szCs w:val="24"/>
-              </w:rPr>
-            </w:r>
-            <w:proofErr w:type="spellEnd"/>
-            <w:r>
-              <w:rPr>
-                <w:rFonts w:ascii="Times New Roman" w:hAnsi="Times New Roman" w:cs="Times New Roman"/>
-                <w:i/>
-                <w:color w:val="065F46"/>
-                <w:sz w:val="24"/>
-                <w:szCs w:val="24"/>
-              </w:rPr>
-            </w:r>
-            <w:proofErr w:type="spellStart"/>
-            <w:r>
-              <w:rPr>
-                <w:rFonts w:ascii="Times New Roman" w:hAnsi="Times New Roman" w:cs="Times New Roman"/>
-                <w:i/>
-                <w:color w:val="065F46"/>
-                <w:sz w:val="24"/>
-                <w:szCs w:val="24"/>
-              </w:rPr>
-            </w:r>
-            <w:proofErr w:type="spellEnd"/>
-            <w:r>
-              <w:rPr>
-                <w:rFonts w:ascii="Times New Roman" w:hAnsi="Times New Roman" w:cs="Times New Roman"/>
-                <w:i/>
-                <w:color w:val="065F46"/>
-                <w:sz w:val="24"/>
-                <w:szCs w:val="24"/>
-              </w:rPr>
-            </w:r>
-            <w:proofErr w:type="spellStart"/>
-            <w:r>
-              <w:rPr>
-                <w:rFonts w:ascii="Times New Roman" w:hAnsi="Times New Roman" w:cs="Times New Roman"/>
-                <w:i/>
-                <w:color w:val="065F46"/>
-                <w:sz w:val="24"/>
-                <w:szCs w:val="24"/>
-              </w:rPr>
-            </w:r>
-            <w:proofErr w:type="spellEnd"/>
-            <w:r>
-              <w:rPr>
-                <w:rFonts w:ascii="Times New Roman" w:hAnsi="Times New Roman" w:cs="Times New Roman"/>
-                <w:i/>
-                <w:color w:val="065F46"/>
-                <w:sz w:val="24"/>
-                <w:szCs w:val="24"/>
-              </w:rPr>
-            </w:r>
-            <w:proofErr w:type="spellStart"/>
-            <w:r>
-              <w:rPr>
-                <w:rFonts w:ascii="Times New Roman" w:hAnsi="Times New Roman" w:cs="Times New Roman"/>
-                <w:i/>
-                <w:color w:val="065F46"/>
-                <w:sz w:val="24"/>
-                <w:szCs w:val="24"/>
-              </w:rPr>
-            </w:r>
-            <w:proofErr w:type="spellEnd"/>
-            <w:r>
-              <w:rPr>
-                <w:rFonts w:ascii="Times New Roman" w:hAnsi="Times New Roman" w:cs="Times New Roman"/>
-                <w:i/>
-                <w:color w:val="065F46"/>
-                <w:sz w:val="24"/>
-                <w:szCs w:val="24"/>
-              </w:rPr>
-            </w:r>
-            <w:r>
               <w:t>{{item.ghi_chu}}</w:t>
             </w:r>
-            <w:r>
-              <w:t>{% endfor %}</w:t>
-            </w:r>
-          </w:p>
+          </w:p>
+        </w:tc>
+      </w:tr>
+      <w:tr>
+        <w:tc>
+          <w:tcPr>
+            <w:tcW w:type="dxa" w:w="1129"/>
+          </w:tcPr>
+          <w:p>
+            <w:r>
+              <w:t>{%tr endfor %}</w:t>
+            </w:r>
+          </w:p>
+        </w:tc>
+        <w:tc>
+          <w:tcPr>
+            <w:tcW w:type="dxa" w:w="1247"/>
+          </w:tcPr>
+          <w:p/>
+        </w:tc>
+        <w:tc>
+          <w:tcPr>
+            <w:tcW w:type="dxa" w:w="1496"/>
+          </w:tcPr>
+          <w:p/>
+        </w:tc>
+        <w:tc>
+          <w:tcPr>
+            <w:tcW w:type="dxa" w:w="1575"/>
+          </w:tcPr>
+          <w:p/>
+        </w:tc>
+        <w:tc>
+          <w:tcPr>
+            <w:tcW w:type="dxa" w:w="1150"/>
+          </w:tcPr>
+          <w:p/>
+        </w:tc>
+        <w:tc>
+          <w:tcPr>
+            <w:tcW w:type="dxa" w:w="1406"/>
+          </w:tcPr>
+          <w:p/>
+        </w:tc>
+        <w:tc>
+          <w:tcPr>
+            <w:tcW w:type="dxa" w:w="1568"/>
+          </w:tcPr>
+          <w:p/>
         </w:tc>
       </w:tr>
       <w:tr>
@@ -15810,7 +15602,6 @@
       <w:tblPr>
         <w:tblStyle w:val="TableGrid"/>
         <w:tblW w:w="0" w:type="auto"/>
-        <w:tblLayout w:type="autofit"/>
         <w:tblLook w:val="04A0" w:firstRow="1" w:lastRow="0" w:firstColumn="1" w:lastColumn="0" w:noHBand="0" w:noVBand="1"/>
       </w:tblPr>
       <w:tblGrid>
@@ -15952,6 +15743,36 @@
       <w:tr>
         <w:tc>
           <w:tcPr>
+            <w:tcW w:type="dxa" w:w="2107"/>
+          </w:tcPr>
+          <w:p>
+            <w:r>
+              <w:t>{%tr for item in ip_tinh %}</w:t>
+            </w:r>
+          </w:p>
+        </w:tc>
+        <w:tc>
+          <w:tcPr>
+            <w:tcW w:type="dxa" w:w="2364"/>
+          </w:tcPr>
+          <w:p/>
+        </w:tc>
+        <w:tc>
+          <w:tcPr>
+            <w:tcW w:type="dxa" w:w="2219"/>
+          </w:tcPr>
+          <w:p/>
+        </w:tc>
+        <w:tc>
+          <w:tcPr>
+            <w:tcW w:type="dxa" w:w="2881"/>
+          </w:tcPr>
+          <w:p/>
+        </w:tc>
+      </w:tr>
+      <w:tr>
+        <w:tc>
+          <w:tcPr>
             <w:tcW w:w="2339" w:type="dxa"/>
             <w:tcBorders>
               <w:top w:val="single" w:sz="4" w:space="0" w:color="CBD5E1"/>
@@ -15971,16 +15792,6 @@
               </w:rPr>
             </w:pPr>
             <w:r>
-              <w:rPr>
-                <w:rFonts w:ascii="Times New Roman" w:hAnsi="Times New Roman" w:cs="Times New Roman"/>
-                <w:sz w:val="24"/>
-                <w:szCs w:val="24"/>
-              </w:rPr>
-            </w:r>
-            <w:r>
-              <w:t>{% for item in ip_tinh %}</w:t>
-            </w:r>
-            <w:r>
               <w:t>{{item.idx}}</w:t>
             </w:r>
           </w:p>
@@ -16005,15 +15816,6 @@
               </w:rPr>
             </w:pPr>
             <w:r>
-              <w:rPr>
-                <w:rFonts w:ascii="Times New Roman" w:hAnsi="Times New Roman" w:cs="Times New Roman"/>
-                <w:i/>
-                <w:color w:val="065F46"/>
-                <w:sz w:val="24"/>
-                <w:szCs w:val="24"/>
-              </w:rPr>
-            </w:r>
-            <w:r>
               <w:t>{{item.ten_thiet_bi}}</w:t>
             </w:r>
           </w:p>
@@ -16037,15 +15839,6 @@
                 <w:szCs w:val="24"/>
               </w:rPr>
             </w:pPr>
-            <w:r>
-              <w:rPr>
-                <w:rFonts w:ascii="Times New Roman" w:hAnsi="Times New Roman" w:cs="Times New Roman"/>
-                <w:i/>
-                <w:color w:val="065F46"/>
-                <w:sz w:val="24"/>
-                <w:szCs w:val="24"/>
-              </w:rPr>
-            </w:r>
             <w:r>
               <w:t>{{item.dia_chi_ip}}</w:t>
             </w:r>
@@ -16073,61 +15866,39 @@
               </w:rPr>
             </w:pPr>
             <w:r>
-              <w:rPr>
-                <w:rFonts w:ascii="Times New Roman" w:hAnsi="Times New Roman" w:cs="Times New Roman"/>
-                <w:i/>
-                <w:color w:val="065F46"/>
-                <w:sz w:val="24"/>
-                <w:szCs w:val="24"/>
-              </w:rPr>
-            </w:r>
-            <w:proofErr w:type="spellStart"/>
-            <w:r>
-              <w:rPr>
-                <w:rFonts w:ascii="Times New Roman" w:hAnsi="Times New Roman" w:cs="Times New Roman"/>
-                <w:i/>
-                <w:color w:val="065F46"/>
-                <w:sz w:val="24"/>
-                <w:szCs w:val="24"/>
-              </w:rPr>
-            </w:r>
-            <w:proofErr w:type="spellEnd"/>
-            <w:r>
-              <w:rPr>
-                <w:rFonts w:ascii="Times New Roman" w:hAnsi="Times New Roman" w:cs="Times New Roman"/>
-                <w:i/>
-                <w:color w:val="065F46"/>
-                <w:sz w:val="24"/>
-                <w:szCs w:val="24"/>
-              </w:rPr>
-            </w:r>
-            <w:proofErr w:type="spellStart"/>
-            <w:r>
-              <w:rPr>
-                <w:rFonts w:ascii="Times New Roman" w:hAnsi="Times New Roman" w:cs="Times New Roman"/>
-                <w:i/>
-                <w:color w:val="065F46"/>
-                <w:sz w:val="24"/>
-                <w:szCs w:val="24"/>
-              </w:rPr>
-            </w:r>
-            <w:proofErr w:type="spellEnd"/>
-            <w:r>
-              <w:rPr>
-                <w:rFonts w:ascii="Times New Roman" w:hAnsi="Times New Roman" w:cs="Times New Roman"/>
-                <w:i/>
-                <w:color w:val="065F46"/>
-                <w:sz w:val="24"/>
-                <w:szCs w:val="24"/>
-              </w:rPr>
-            </w:r>
-            <w:r>
               <w:t>{{item.ghi_chu}}</w:t>
             </w:r>
-            <w:r>
-              <w:t>{% endfor %}</w:t>
-            </w:r>
-          </w:p>
+          </w:p>
+        </w:tc>
+      </w:tr>
+      <w:tr>
+        <w:tc>
+          <w:tcPr>
+            <w:tcW w:type="dxa" w:w="2107"/>
+          </w:tcPr>
+          <w:p>
+            <w:r>
+              <w:t>{%tr endfor %}</w:t>
+            </w:r>
+          </w:p>
+        </w:tc>
+        <w:tc>
+          <w:tcPr>
+            <w:tcW w:type="dxa" w:w="2364"/>
+          </w:tcPr>
+          <w:p/>
+        </w:tc>
+        <w:tc>
+          <w:tcPr>
+            <w:tcW w:type="dxa" w:w="2219"/>
+          </w:tcPr>
+          <w:p/>
+        </w:tc>
+        <w:tc>
+          <w:tcPr>
+            <w:tcW w:type="dxa" w:w="2881"/>
+          </w:tcPr>
+          <w:p/>
         </w:tc>
       </w:tr>
       <w:tr>
@@ -16887,7 +16658,6 @@
       <w:tblPr>
         <w:tblStyle w:val="TableGrid"/>
         <w:tblW w:w="0" w:type="auto"/>
-        <w:tblLayout w:type="autofit"/>
         <w:tblLook w:val="04A0" w:firstRow="1" w:lastRow="0" w:firstColumn="1" w:lastColumn="0" w:noHBand="0" w:noVBand="1"/>
       </w:tblPr>
       <w:tblGrid>
@@ -17128,6 +16898,54 @@
       <w:tr>
         <w:tc>
           <w:tcPr>
+            <w:tcW w:type="dxa" w:w="759"/>
+          </w:tcPr>
+          <w:p>
+            <w:r>
+              <w:t>{%tr for item in ung_dung %}</w:t>
+            </w:r>
+          </w:p>
+        </w:tc>
+        <w:tc>
+          <w:tcPr>
+            <w:tcW w:type="dxa" w:w="1304"/>
+          </w:tcPr>
+          <w:p/>
+        </w:tc>
+        <w:tc>
+          <w:tcPr>
+            <w:tcW w:type="dxa" w:w="986"/>
+          </w:tcPr>
+          <w:p/>
+        </w:tc>
+        <w:tc>
+          <w:tcPr>
+            <w:tcW w:type="dxa" w:w="946"/>
+          </w:tcPr>
+          <w:p/>
+        </w:tc>
+        <w:tc>
+          <w:tcPr>
+            <w:tcW w:type="dxa" w:w="1036"/>
+          </w:tcPr>
+          <w:p/>
+        </w:tc>
+        <w:tc>
+          <w:tcPr>
+            <w:tcW w:type="dxa" w:w="1208"/>
+          </w:tcPr>
+          <w:p/>
+        </w:tc>
+        <w:tc>
+          <w:tcPr>
+            <w:tcW w:type="dxa" w:w="3332"/>
+          </w:tcPr>
+          <w:p/>
+        </w:tc>
+      </w:tr>
+      <w:tr>
+        <w:tc>
+          <w:tcPr>
             <w:tcW w:w="1336" w:type="dxa"/>
             <w:tcBorders>
               <w:top w:val="single" w:sz="4" w:space="0" w:color="CBD5E1"/>
@@ -17147,16 +16965,6 @@
               </w:rPr>
             </w:pPr>
             <w:r>
-              <w:rPr>
-                <w:rFonts w:ascii="Times New Roman" w:hAnsi="Times New Roman" w:cs="Times New Roman"/>
-                <w:sz w:val="24"/>
-                <w:szCs w:val="24"/>
-              </w:rPr>
-            </w:r>
-            <w:r>
-              <w:t>{% for item in ung_dung %}</w:t>
-            </w:r>
-            <w:r>
               <w:t>{{item.idx}}</w:t>
             </w:r>
           </w:p>
@@ -17180,37 +16988,6 @@
                 <w:szCs w:val="24"/>
               </w:rPr>
             </w:pPr>
-            <w:proofErr w:type="spellStart"/>
-            <w:r>
-              <w:rPr>
-                <w:rFonts w:ascii="Times New Roman" w:hAnsi="Times New Roman" w:cs="Times New Roman"/>
-                <w:i/>
-                <w:color w:val="065F46"/>
-                <w:sz w:val="24"/>
-                <w:szCs w:val="24"/>
-              </w:rPr>
-            </w:r>
-            <w:proofErr w:type="spellEnd"/>
-            <w:r>
-              <w:rPr>
-                <w:rFonts w:ascii="Times New Roman" w:hAnsi="Times New Roman" w:cs="Times New Roman"/>
-                <w:i/>
-                <w:color w:val="065F46"/>
-                <w:sz w:val="24"/>
-                <w:szCs w:val="24"/>
-              </w:rPr>
-            </w:r>
-            <w:proofErr w:type="spellStart"/>
-            <w:r>
-              <w:rPr>
-                <w:rFonts w:ascii="Times New Roman" w:hAnsi="Times New Roman" w:cs="Times New Roman"/>
-                <w:i/>
-                <w:color w:val="065F46"/>
-                <w:sz w:val="24"/>
-                <w:szCs w:val="24"/>
-              </w:rPr>
-            </w:r>
-            <w:proofErr w:type="spellEnd"/>
             <w:r>
               <w:t>{{item.ten}}</w:t>
             </w:r>
@@ -17235,197 +17012,6 @@
                 <w:szCs w:val="24"/>
               </w:rPr>
             </w:pPr>
-            <w:proofErr w:type="spellStart"/>
-            <w:r>
-              <w:rPr>
-                <w:rFonts w:ascii="Times New Roman" w:hAnsi="Times New Roman" w:cs="Times New Roman"/>
-                <w:i/>
-                <w:color w:val="065F46"/>
-                <w:sz w:val="24"/>
-                <w:szCs w:val="24"/>
-              </w:rPr>
-            </w:r>
-            <w:proofErr w:type="spellEnd"/>
-            <w:r>
-              <w:rPr>
-                <w:rFonts w:ascii="Times New Roman" w:hAnsi="Times New Roman" w:cs="Times New Roman"/>
-                <w:i/>
-                <w:color w:val="065F46"/>
-                <w:sz w:val="24"/>
-                <w:szCs w:val="24"/>
-              </w:rPr>
-            </w:r>
-            <w:proofErr w:type="spellStart"/>
-            <w:r>
-              <w:rPr>
-                <w:rFonts w:ascii="Times New Roman" w:hAnsi="Times New Roman" w:cs="Times New Roman"/>
-                <w:i/>
-                <w:color w:val="065F46"/>
-                <w:sz w:val="24"/>
-                <w:szCs w:val="24"/>
-              </w:rPr>
-            </w:r>
-            <w:proofErr w:type="spellEnd"/>
-            <w:r>
-              <w:rPr>
-                <w:rFonts w:ascii="Times New Roman" w:hAnsi="Times New Roman" w:cs="Times New Roman"/>
-                <w:i/>
-                <w:color w:val="065F46"/>
-                <w:sz w:val="24"/>
-                <w:szCs w:val="24"/>
-              </w:rPr>
-            </w:r>
-            <w:proofErr w:type="spellStart"/>
-            <w:r>
-              <w:rPr>
-                <w:rFonts w:ascii="Times New Roman" w:hAnsi="Times New Roman" w:cs="Times New Roman"/>
-                <w:i/>
-                <w:color w:val="065F46"/>
-                <w:sz w:val="24"/>
-                <w:szCs w:val="24"/>
-              </w:rPr>
-            </w:r>
-            <w:proofErr w:type="spellEnd"/>
-            <w:r>
-              <w:rPr>
-                <w:rFonts w:ascii="Times New Roman" w:hAnsi="Times New Roman" w:cs="Times New Roman"/>
-                <w:i/>
-                <w:color w:val="065F46"/>
-                <w:sz w:val="24"/>
-                <w:szCs w:val="24"/>
-              </w:rPr>
-            </w:r>
-            <w:proofErr w:type="spellStart"/>
-            <w:r>
-              <w:rPr>
-                <w:rFonts w:ascii="Times New Roman" w:hAnsi="Times New Roman" w:cs="Times New Roman"/>
-                <w:i/>
-                <w:color w:val="065F46"/>
-                <w:sz w:val="24"/>
-                <w:szCs w:val="24"/>
-              </w:rPr>
-            </w:r>
-            <w:proofErr w:type="spellEnd"/>
-            <w:r>
-              <w:rPr>
-                <w:rFonts w:ascii="Times New Roman" w:hAnsi="Times New Roman" w:cs="Times New Roman"/>
-                <w:i/>
-                <w:color w:val="065F46"/>
-                <w:sz w:val="24"/>
-                <w:szCs w:val="24"/>
-              </w:rPr>
-            </w:r>
-            <w:proofErr w:type="spellStart"/>
-            <w:r>
-              <w:rPr>
-                <w:rFonts w:ascii="Times New Roman" w:hAnsi="Times New Roman" w:cs="Times New Roman"/>
-                <w:i/>
-                <w:color w:val="065F46"/>
-                <w:sz w:val="24"/>
-                <w:szCs w:val="24"/>
-              </w:rPr>
-            </w:r>
-            <w:proofErr w:type="spellEnd"/>
-            <w:r>
-              <w:rPr>
-                <w:rFonts w:ascii="Times New Roman" w:hAnsi="Times New Roman" w:cs="Times New Roman"/>
-                <w:i/>
-                <w:color w:val="065F46"/>
-                <w:sz w:val="24"/>
-                <w:szCs w:val="24"/>
-              </w:rPr>
-            </w:r>
-            <w:proofErr w:type="spellStart"/>
-            <w:r>
-              <w:rPr>
-                <w:rFonts w:ascii="Times New Roman" w:hAnsi="Times New Roman" w:cs="Times New Roman"/>
-                <w:i/>
-                <w:color w:val="065F46"/>
-                <w:sz w:val="24"/>
-                <w:szCs w:val="24"/>
-              </w:rPr>
-            </w:r>
-            <w:proofErr w:type="spellEnd"/>
-            <w:r>
-              <w:rPr>
-                <w:rFonts w:ascii="Times New Roman" w:hAnsi="Times New Roman" w:cs="Times New Roman"/>
-                <w:i/>
-                <w:color w:val="065F46"/>
-                <w:sz w:val="24"/>
-                <w:szCs w:val="24"/>
-              </w:rPr>
-            </w:r>
-            <w:proofErr w:type="spellStart"/>
-            <w:r>
-              <w:rPr>
-                <w:rFonts w:ascii="Times New Roman" w:hAnsi="Times New Roman" w:cs="Times New Roman"/>
-                <w:i/>
-                <w:color w:val="065F46"/>
-                <w:sz w:val="24"/>
-                <w:szCs w:val="24"/>
-              </w:rPr>
-            </w:r>
-            <w:proofErr w:type="spellEnd"/>
-            <w:r>
-              <w:rPr>
-                <w:rFonts w:ascii="Times New Roman" w:hAnsi="Times New Roman" w:cs="Times New Roman"/>
-                <w:i/>
-                <w:color w:val="065F46"/>
-                <w:sz w:val="24"/>
-                <w:szCs w:val="24"/>
-              </w:rPr>
-            </w:r>
-            <w:proofErr w:type="spellStart"/>
-            <w:r>
-              <w:rPr>
-                <w:rFonts w:ascii="Times New Roman" w:hAnsi="Times New Roman" w:cs="Times New Roman"/>
-                <w:i/>
-                <w:color w:val="065F46"/>
-                <w:sz w:val="24"/>
-                <w:szCs w:val="24"/>
-              </w:rPr>
-            </w:r>
-            <w:proofErr w:type="spellEnd"/>
-            <w:r>
-              <w:rPr>
-                <w:rFonts w:ascii="Times New Roman" w:hAnsi="Times New Roman" w:cs="Times New Roman"/>
-                <w:i/>
-                <w:color w:val="065F46"/>
-                <w:sz w:val="24"/>
-                <w:szCs w:val="24"/>
-              </w:rPr>
-            </w:r>
-            <w:proofErr w:type="spellStart"/>
-            <w:r>
-              <w:rPr>
-                <w:rFonts w:ascii="Times New Roman" w:hAnsi="Times New Roman" w:cs="Times New Roman"/>
-                <w:i/>
-                <w:color w:val="065F46"/>
-                <w:sz w:val="24"/>
-                <w:szCs w:val="24"/>
-              </w:rPr>
-            </w:r>
-            <w:proofErr w:type="spellEnd"/>
-            <w:r>
-              <w:rPr>
-                <w:rFonts w:ascii="Times New Roman" w:hAnsi="Times New Roman" w:cs="Times New Roman"/>
-                <w:i/>
-                <w:color w:val="065F46"/>
-                <w:sz w:val="24"/>
-                <w:szCs w:val="24"/>
-              </w:rPr>
-            </w:r>
-            <w:proofErr w:type="spellStart"/>
-            <w:r>
-              <w:rPr>
-                <w:rFonts w:ascii="Times New Roman" w:hAnsi="Times New Roman" w:cs="Times New Roman"/>
-                <w:i/>
-                <w:color w:val="065F46"/>
-                <w:sz w:val="24"/>
-                <w:szCs w:val="24"/>
-              </w:rPr>
-            </w:r>
-            <w:proofErr w:type="spellEnd"/>
             <w:r>
               <w:t>{{item.chuc_nang}}</w:t>
             </w:r>
@@ -17451,46 +17037,6 @@
               </w:rPr>
             </w:pPr>
             <w:r>
-              <w:rPr>
-                <w:rFonts w:ascii="Times New Roman" w:hAnsi="Times New Roman" w:cs="Times New Roman"/>
-                <w:i/>
-                <w:color w:val="065F46"/>
-                <w:sz w:val="24"/>
-                <w:szCs w:val="24"/>
-              </w:rPr>
-            </w:r>
-            <w:proofErr w:type="spellStart"/>
-            <w:r>
-              <w:rPr>
-                <w:rFonts w:ascii="Times New Roman" w:hAnsi="Times New Roman" w:cs="Times New Roman"/>
-                <w:i/>
-                <w:color w:val="065F46"/>
-                <w:sz w:val="24"/>
-                <w:szCs w:val="24"/>
-              </w:rPr>
-            </w:r>
-            <w:proofErr w:type="spellEnd"/>
-            <w:r>
-              <w:rPr>
-                <w:rFonts w:ascii="Times New Roman" w:hAnsi="Times New Roman" w:cs="Times New Roman"/>
-                <w:i/>
-                <w:color w:val="065F46"/>
-                <w:sz w:val="24"/>
-                <w:szCs w:val="24"/>
-              </w:rPr>
-            </w:r>
-            <w:proofErr w:type="spellStart"/>
-            <w:r>
-              <w:rPr>
-                <w:rFonts w:ascii="Times New Roman" w:hAnsi="Times New Roman" w:cs="Times New Roman"/>
-                <w:i/>
-                <w:color w:val="065F46"/>
-                <w:sz w:val="24"/>
-                <w:szCs w:val="24"/>
-              </w:rPr>
-            </w:r>
-            <w:proofErr w:type="spellEnd"/>
-            <w:r>
               <w:t>{{item.don_vi_cung_cap}}</w:t>
             </w:r>
           </w:p>
@@ -17515,15 +17061,6 @@
               </w:rPr>
             </w:pPr>
             <w:r>
-              <w:rPr>
-                <w:rFonts w:ascii="Times New Roman" w:hAnsi="Times New Roman" w:cs="Times New Roman"/>
-                <w:i/>
-                <w:color w:val="065F46"/>
-                <w:sz w:val="24"/>
-                <w:szCs w:val="24"/>
-              </w:rPr>
-            </w:r>
-            <w:r>
               <w:t>{{item.phien_ban}}</w:t>
             </w:r>
           </w:p>
@@ -17547,26 +17084,6 @@
                 <w:szCs w:val="24"/>
               </w:rPr>
             </w:pPr>
-            <w:proofErr w:type="spellStart"/>
-            <w:r>
-              <w:rPr>
-                <w:rFonts w:ascii="Times New Roman" w:hAnsi="Times New Roman" w:cs="Times New Roman"/>
-                <w:i/>
-                <w:color w:val="065F46"/>
-                <w:sz w:val="24"/>
-                <w:szCs w:val="24"/>
-              </w:rPr>
-            </w:r>
-            <w:proofErr w:type="spellEnd"/>
-            <w:r>
-              <w:rPr>
-                <w:rFonts w:ascii="Times New Roman" w:hAnsi="Times New Roman" w:cs="Times New Roman"/>
-                <w:i/>
-                <w:color w:val="065F46"/>
-                <w:sz w:val="24"/>
-                <w:szCs w:val="24"/>
-              </w:rPr>
-            </w:r>
             <w:r>
               <w:t>{{item.ket_noi_internet}}</w:t>
             </w:r>
@@ -17594,61 +17111,57 @@
               </w:rPr>
             </w:pPr>
             <w:r>
-              <w:rPr>
-                <w:rFonts w:ascii="Times New Roman" w:hAnsi="Times New Roman" w:cs="Times New Roman"/>
-                <w:i/>
-                <w:color w:val="065F46"/>
-                <w:sz w:val="24"/>
-                <w:szCs w:val="24"/>
-              </w:rPr>
-            </w:r>
-            <w:proofErr w:type="spellStart"/>
-            <w:r>
-              <w:rPr>
-                <w:rFonts w:ascii="Times New Roman" w:hAnsi="Times New Roman" w:cs="Times New Roman"/>
-                <w:i/>
-                <w:color w:val="065F46"/>
-                <w:sz w:val="24"/>
-                <w:szCs w:val="24"/>
-              </w:rPr>
-            </w:r>
-            <w:proofErr w:type="spellEnd"/>
-            <w:r>
-              <w:rPr>
-                <w:rFonts w:ascii="Times New Roman" w:hAnsi="Times New Roman" w:cs="Times New Roman"/>
-                <w:i/>
-                <w:color w:val="065F46"/>
-                <w:sz w:val="24"/>
-                <w:szCs w:val="24"/>
-              </w:rPr>
-            </w:r>
-            <w:proofErr w:type="spellStart"/>
-            <w:r>
-              <w:rPr>
-                <w:rFonts w:ascii="Times New Roman" w:hAnsi="Times New Roman" w:cs="Times New Roman"/>
-                <w:i/>
-                <w:color w:val="065F46"/>
-                <w:sz w:val="24"/>
-                <w:szCs w:val="24"/>
-              </w:rPr>
-            </w:r>
-            <w:proofErr w:type="spellEnd"/>
-            <w:r>
-              <w:rPr>
-                <w:rFonts w:ascii="Times New Roman" w:hAnsi="Times New Roman" w:cs="Times New Roman"/>
-                <w:i/>
-                <w:color w:val="065F46"/>
-                <w:sz w:val="24"/>
-                <w:szCs w:val="24"/>
-              </w:rPr>
-            </w:r>
-            <w:r>
               <w:t>{{item.ghi_chu}}</w:t>
             </w:r>
-            <w:r>
-              <w:t>{% endfor %}</w:t>
-            </w:r>
-          </w:p>
+          </w:p>
+        </w:tc>
+      </w:tr>
+      <w:tr>
+        <w:tc>
+          <w:tcPr>
+            <w:tcW w:type="dxa" w:w="759"/>
+          </w:tcPr>
+          <w:p>
+            <w:r>
+              <w:t>{%tr endfor %}</w:t>
+            </w:r>
+          </w:p>
+        </w:tc>
+        <w:tc>
+          <w:tcPr>
+            <w:tcW w:type="dxa" w:w="1304"/>
+          </w:tcPr>
+          <w:p/>
+        </w:tc>
+        <w:tc>
+          <w:tcPr>
+            <w:tcW w:type="dxa" w:w="986"/>
+          </w:tcPr>
+          <w:p/>
+        </w:tc>
+        <w:tc>
+          <w:tcPr>
+            <w:tcW w:type="dxa" w:w="946"/>
+          </w:tcPr>
+          <w:p/>
+        </w:tc>
+        <w:tc>
+          <w:tcPr>
+            <w:tcW w:type="dxa" w:w="1036"/>
+          </w:tcPr>
+          <w:p/>
+        </w:tc>
+        <w:tc>
+          <w:tcPr>
+            <w:tcW w:type="dxa" w:w="1208"/>
+          </w:tcPr>
+          <w:p/>
+        </w:tc>
+        <w:tc>
+          <w:tcPr>
+            <w:tcW w:type="dxa" w:w="3332"/>
+          </w:tcPr>
+          <w:p/>
         </w:tc>
       </w:tr>
       <w:tr>
@@ -19700,7 +19213,6 @@
       <w:tblPr>
         <w:tblStyle w:val="TableGrid"/>
         <w:tblW w:w="0" w:type="auto"/>
-        <w:tblLayout w:type="autofit"/>
         <w:tblLook w:val="04A0" w:firstRow="1" w:lastRow="0" w:firstColumn="1" w:lastColumn="0" w:noHBand="0" w:noVBand="1"/>
       </w:tblPr>
       <w:tblGrid>
@@ -19842,6 +19354,36 @@
       <w:tr>
         <w:tc>
           <w:tcPr>
+            <w:tcW w:type="dxa" w:w="2072"/>
+          </w:tcPr>
+          <w:p>
+            <w:r>
+              <w:t>{%tr for item in K_van_ban %}</w:t>
+            </w:r>
+          </w:p>
+        </w:tc>
+        <w:tc>
+          <w:tcPr>
+            <w:tcW w:type="dxa" w:w="2550"/>
+          </w:tcPr>
+          <w:p/>
+        </w:tc>
+        <w:tc>
+          <w:tcPr>
+            <w:tcW w:type="dxa" w:w="2828"/>
+          </w:tcPr>
+          <w:p/>
+        </w:tc>
+        <w:tc>
+          <w:tcPr>
+            <w:tcW w:type="dxa" w:w="2121"/>
+          </w:tcPr>
+          <w:p/>
+        </w:tc>
+      </w:tr>
+      <w:tr>
+        <w:tc>
+          <w:tcPr>
             <w:tcW w:w="2339" w:type="dxa"/>
             <w:tcBorders>
               <w:top w:val="single" w:sz="4" w:space="0" w:color="CBD5E1"/>
@@ -19861,16 +19403,6 @@
               </w:rPr>
             </w:pPr>
             <w:r>
-              <w:rPr>
-                <w:rFonts w:ascii="Times New Roman" w:hAnsi="Times New Roman" w:cs="Times New Roman"/>
-                <w:sz w:val="24"/>
-                <w:szCs w:val="24"/>
-              </w:rPr>
-            </w:r>
-            <w:r>
-              <w:t>{% for item in K_van_ban %}</w:t>
-            </w:r>
-            <w:r>
               <w:t>{{item.idx}}</w:t>
             </w:r>
           </w:p>
@@ -19895,13 +19427,6 @@
               </w:rPr>
             </w:pPr>
             <w:r>
-              <w:rPr>
-                <w:rFonts w:ascii="Times New Roman" w:hAnsi="Times New Roman" w:cs="Times New Roman"/>
-                <w:sz w:val="24"/>
-                <w:szCs w:val="24"/>
-              </w:rPr>
-            </w:r>
-            <w:r>
               <w:t>{{item.loai}}</w:t>
             </w:r>
           </w:p>
@@ -19926,55 +19451,6 @@
               </w:rPr>
             </w:pPr>
             <w:r>
-              <w:rPr>
-                <w:rFonts w:ascii="Times New Roman" w:hAnsi="Times New Roman" w:cs="Times New Roman"/>
-                <w:i/>
-                <w:color w:val="065F46"/>
-                <w:sz w:val="24"/>
-                <w:szCs w:val="24"/>
-              </w:rPr>
-            </w:r>
-            <w:proofErr w:type="spellStart"/>
-            <w:r>
-              <w:rPr>
-                <w:rFonts w:ascii="Times New Roman" w:hAnsi="Times New Roman" w:cs="Times New Roman"/>
-                <w:i/>
-                <w:color w:val="065F46"/>
-                <w:sz w:val="24"/>
-                <w:szCs w:val="24"/>
-              </w:rPr>
-            </w:r>
-            <w:proofErr w:type="spellEnd"/>
-            <w:r>
-              <w:rPr>
-                <w:rFonts w:ascii="Times New Roman" w:hAnsi="Times New Roman" w:cs="Times New Roman"/>
-                <w:i/>
-                <w:color w:val="065F46"/>
-                <w:sz w:val="24"/>
-                <w:szCs w:val="24"/>
-              </w:rPr>
-            </w:r>
-            <w:proofErr w:type="spellStart"/>
-            <w:r>
-              <w:rPr>
-                <w:rFonts w:ascii="Times New Roman" w:hAnsi="Times New Roman" w:cs="Times New Roman"/>
-                <w:i/>
-                <w:color w:val="065F46"/>
-                <w:sz w:val="24"/>
-                <w:szCs w:val="24"/>
-              </w:rPr>
-            </w:r>
-            <w:proofErr w:type="spellEnd"/>
-            <w:r>
-              <w:rPr>
-                <w:rFonts w:ascii="Times New Roman" w:hAnsi="Times New Roman" w:cs="Times New Roman"/>
-                <w:i/>
-                <w:color w:val="065F46"/>
-                <w:sz w:val="24"/>
-                <w:szCs w:val="24"/>
-              </w:rPr>
-            </w:r>
-            <w:r>
               <w:t>{{item.so_vb}}</w:t>
             </w:r>
           </w:p>
@@ -19998,73 +19474,40 @@
                 <w:szCs w:val="24"/>
               </w:rPr>
             </w:pPr>
-            <w:proofErr w:type="spellStart"/>
-            <w:r>
-              <w:rPr>
-                <w:rFonts w:ascii="Times New Roman" w:hAnsi="Times New Roman" w:cs="Times New Roman"/>
-                <w:i/>
-                <w:color w:val="065F46"/>
-                <w:sz w:val="24"/>
-                <w:szCs w:val="24"/>
-              </w:rPr>
-            </w:r>
-            <w:proofErr w:type="spellEnd"/>
-            <w:r>
-              <w:rPr>
-                <w:rFonts w:ascii="Times New Roman" w:hAnsi="Times New Roman" w:cs="Times New Roman"/>
-                <w:i/>
-                <w:color w:val="065F46"/>
-                <w:sz w:val="24"/>
-                <w:szCs w:val="24"/>
-              </w:rPr>
-            </w:r>
-            <w:proofErr w:type="spellStart"/>
-            <w:r>
-              <w:rPr>
-                <w:rFonts w:ascii="Times New Roman" w:hAnsi="Times New Roman" w:cs="Times New Roman"/>
-                <w:i/>
-                <w:color w:val="065F46"/>
-                <w:sz w:val="24"/>
-                <w:szCs w:val="24"/>
-              </w:rPr>
-            </w:r>
-            <w:proofErr w:type="spellEnd"/>
-            <w:r>
-              <w:rPr>
-                <w:rFonts w:ascii="Times New Roman" w:hAnsi="Times New Roman" w:cs="Times New Roman"/>
-                <w:i/>
-                <w:color w:val="065F46"/>
-                <w:sz w:val="24"/>
-                <w:szCs w:val="24"/>
-              </w:rPr>
-            </w:r>
-            <w:proofErr w:type="spellStart"/>
-            <w:r>
-              <w:rPr>
-                <w:rFonts w:ascii="Times New Roman" w:hAnsi="Times New Roman" w:cs="Times New Roman"/>
-                <w:i/>
-                <w:color w:val="065F46"/>
-                <w:sz w:val="24"/>
-                <w:szCs w:val="24"/>
-              </w:rPr>
-            </w:r>
-            <w:proofErr w:type="spellEnd"/>
-            <w:r>
-              <w:rPr>
-                <w:rFonts w:ascii="Times New Roman" w:hAnsi="Times New Roman" w:cs="Times New Roman"/>
-                <w:i/>
-                <w:color w:val="065F46"/>
-                <w:sz w:val="24"/>
-                <w:szCs w:val="24"/>
-              </w:rPr>
-            </w:r>
             <w:r>
               <w:t>{{item.ghi_chu}}</w:t>
             </w:r>
-            <w:r>
-              <w:t>{% endfor %}</w:t>
-            </w:r>
-          </w:p>
+          </w:p>
+        </w:tc>
+      </w:tr>
+      <w:tr>
+        <w:tc>
+          <w:tcPr>
+            <w:tcW w:type="dxa" w:w="2072"/>
+          </w:tcPr>
+          <w:p>
+            <w:r>
+              <w:t>{%tr endfor %}</w:t>
+            </w:r>
+          </w:p>
+        </w:tc>
+        <w:tc>
+          <w:tcPr>
+            <w:tcW w:type="dxa" w:w="2550"/>
+          </w:tcPr>
+          <w:p/>
+        </w:tc>
+        <w:tc>
+          <w:tcPr>
+            <w:tcW w:type="dxa" w:w="2828"/>
+          </w:tcPr>
+          <w:p/>
+        </w:tc>
+        <w:tc>
+          <w:tcPr>
+            <w:tcW w:type="dxa" w:w="2121"/>
+          </w:tcPr>
+          <w:p/>
         </w:tc>
       </w:tr>
       <w:tr>
@@ -25777,7 +25220,6 @@
       <w:tblPr>
         <w:tblStyle w:val="TableGrid"/>
         <w:tblW w:w="0" w:type="auto"/>
-        <w:tblLayout w:type="autofit"/>
         <w:tblLook w:val="04A0" w:firstRow="1" w:lastRow="0" w:firstColumn="1" w:lastColumn="0" w:noHBand="0" w:noVBand="1"/>
       </w:tblPr>
       <w:tblGrid>
@@ -26007,6 +25449,48 @@
       <w:tr>
         <w:tc>
           <w:tcPr>
+            <w:tcW w:type="dxa" w:w="1397"/>
+          </w:tcPr>
+          <w:p>
+            <w:r>
+              <w:t>{%tr for item in dao_tao %}</w:t>
+            </w:r>
+          </w:p>
+        </w:tc>
+        <w:tc>
+          <w:tcPr>
+            <w:tcW w:type="dxa" w:w="2010"/>
+          </w:tcPr>
+          <w:p/>
+        </w:tc>
+        <w:tc>
+          <w:tcPr>
+            <w:tcW w:type="dxa" w:w="1542"/>
+          </w:tcPr>
+          <w:p/>
+        </w:tc>
+        <w:tc>
+          <w:tcPr>
+            <w:tcW w:type="dxa" w:w="1603"/>
+          </w:tcPr>
+          <w:p/>
+        </w:tc>
+        <w:tc>
+          <w:tcPr>
+            <w:tcW w:type="dxa" w:w="1411"/>
+          </w:tcPr>
+          <w:p/>
+        </w:tc>
+        <w:tc>
+          <w:tcPr>
+            <w:tcW w:type="dxa" w:w="1608"/>
+          </w:tcPr>
+          <w:p/>
+        </w:tc>
+      </w:tr>
+      <w:tr>
+        <w:tc>
+          <w:tcPr>
             <w:tcW w:w="1559" w:type="dxa"/>
             <w:tcBorders>
               <w:top w:val="single" w:sz="4" w:space="0" w:color="CBD5E1"/>
@@ -26026,16 +25510,6 @@
               </w:rPr>
             </w:pPr>
             <w:r>
-              <w:rPr>
-                <w:rFonts w:ascii="Times New Roman" w:hAnsi="Times New Roman" w:cs="Times New Roman"/>
-                <w:sz w:val="24"/>
-                <w:szCs w:val="24"/>
-              </w:rPr>
-            </w:r>
-            <w:r>
-              <w:t>{% for item in dao_tao %}</w:t>
-            </w:r>
-            <w:r>
               <w:t>{{item.idx}}</w:t>
             </w:r>
           </w:p>
@@ -26059,137 +25533,6 @@
                 <w:szCs w:val="24"/>
               </w:rPr>
             </w:pPr>
-            <w:proofErr w:type="spellStart"/>
-            <w:r>
-              <w:rPr>
-                <w:rFonts w:ascii="Times New Roman" w:hAnsi="Times New Roman" w:cs="Times New Roman"/>
-                <w:i/>
-                <w:color w:val="065F46"/>
-                <w:sz w:val="24"/>
-                <w:szCs w:val="24"/>
-              </w:rPr>
-            </w:r>
-            <w:proofErr w:type="spellEnd"/>
-            <w:r>
-              <w:rPr>
-                <w:rFonts w:ascii="Times New Roman" w:hAnsi="Times New Roman" w:cs="Times New Roman"/>
-                <w:i/>
-                <w:color w:val="065F46"/>
-                <w:sz w:val="24"/>
-                <w:szCs w:val="24"/>
-              </w:rPr>
-            </w:r>
-            <w:proofErr w:type="spellStart"/>
-            <w:r>
-              <w:rPr>
-                <w:rFonts w:ascii="Times New Roman" w:hAnsi="Times New Roman" w:cs="Times New Roman"/>
-                <w:i/>
-                <w:color w:val="065F46"/>
-                <w:sz w:val="24"/>
-                <w:szCs w:val="24"/>
-              </w:rPr>
-            </w:r>
-            <w:proofErr w:type="spellEnd"/>
-            <w:r>
-              <w:rPr>
-                <w:rFonts w:ascii="Times New Roman" w:hAnsi="Times New Roman" w:cs="Times New Roman"/>
-                <w:i/>
-                <w:color w:val="065F46"/>
-                <w:sz w:val="24"/>
-                <w:szCs w:val="24"/>
-              </w:rPr>
-            </w:r>
-            <w:proofErr w:type="gramStart"/>
-            <w:r>
-              <w:rPr>
-                <w:rFonts w:ascii="Times New Roman" w:hAnsi="Times New Roman" w:cs="Times New Roman"/>
-                <w:i/>
-                <w:color w:val="065F46"/>
-                <w:sz w:val="24"/>
-                <w:szCs w:val="24"/>
-              </w:rPr>
-            </w:r>
-            <w:proofErr w:type="gramEnd"/>
-            <w:r>
-              <w:rPr>
-                <w:rFonts w:ascii="Times New Roman" w:hAnsi="Times New Roman" w:cs="Times New Roman"/>
-                <w:i/>
-                <w:color w:val="065F46"/>
-                <w:sz w:val="24"/>
-                <w:szCs w:val="24"/>
-              </w:rPr>
-            </w:r>
-            <w:proofErr w:type="spellStart"/>
-            <w:r>
-              <w:rPr>
-                <w:rFonts w:ascii="Times New Roman" w:hAnsi="Times New Roman" w:cs="Times New Roman"/>
-                <w:i/>
-                <w:color w:val="065F46"/>
-                <w:sz w:val="24"/>
-                <w:szCs w:val="24"/>
-              </w:rPr>
-            </w:r>
-            <w:proofErr w:type="spellEnd"/>
-            <w:r>
-              <w:rPr>
-                <w:rFonts w:ascii="Times New Roman" w:hAnsi="Times New Roman" w:cs="Times New Roman"/>
-                <w:i/>
-                <w:color w:val="065F46"/>
-                <w:sz w:val="24"/>
-                <w:szCs w:val="24"/>
-              </w:rPr>
-            </w:r>
-            <w:proofErr w:type="spellStart"/>
-            <w:r>
-              <w:rPr>
-                <w:rFonts w:ascii="Times New Roman" w:hAnsi="Times New Roman" w:cs="Times New Roman"/>
-                <w:i/>
-                <w:color w:val="065F46"/>
-                <w:sz w:val="24"/>
-                <w:szCs w:val="24"/>
-              </w:rPr>
-            </w:r>
-            <w:proofErr w:type="spellEnd"/>
-            <w:r>
-              <w:rPr>
-                <w:rFonts w:ascii="Times New Roman" w:hAnsi="Times New Roman" w:cs="Times New Roman"/>
-                <w:i/>
-                <w:color w:val="065F46"/>
-                <w:sz w:val="24"/>
-                <w:szCs w:val="24"/>
-              </w:rPr>
-            </w:r>
-            <w:proofErr w:type="spellStart"/>
-            <w:r>
-              <w:rPr>
-                <w:rFonts w:ascii="Times New Roman" w:hAnsi="Times New Roman" w:cs="Times New Roman"/>
-                <w:i/>
-                <w:color w:val="065F46"/>
-                <w:sz w:val="24"/>
-                <w:szCs w:val="24"/>
-              </w:rPr>
-            </w:r>
-            <w:proofErr w:type="spellEnd"/>
-            <w:r>
-              <w:rPr>
-                <w:rFonts w:ascii="Times New Roman" w:hAnsi="Times New Roman" w:cs="Times New Roman"/>
-                <w:i/>
-                <w:color w:val="065F46"/>
-                <w:sz w:val="24"/>
-                <w:szCs w:val="24"/>
-              </w:rPr>
-            </w:r>
-            <w:proofErr w:type="spellStart"/>
-            <w:r>
-              <w:rPr>
-                <w:rFonts w:ascii="Times New Roman" w:hAnsi="Times New Roman" w:cs="Times New Roman"/>
-                <w:i/>
-                <w:color w:val="065F46"/>
-                <w:sz w:val="24"/>
-                <w:szCs w:val="24"/>
-              </w:rPr>
-            </w:r>
-            <w:proofErr w:type="spellEnd"/>
             <w:r>
               <w:t>{{item.hinh_thuc}}</w:t>
             </w:r>
@@ -26214,37 +25557,6 @@
                 <w:szCs w:val="24"/>
               </w:rPr>
             </w:pPr>
-            <w:proofErr w:type="spellStart"/>
-            <w:r>
-              <w:rPr>
-                <w:rFonts w:ascii="Times New Roman" w:hAnsi="Times New Roman" w:cs="Times New Roman"/>
-                <w:i/>
-                <w:color w:val="065F46"/>
-                <w:sz w:val="24"/>
-                <w:szCs w:val="24"/>
-              </w:rPr>
-            </w:r>
-            <w:proofErr w:type="spellEnd"/>
-            <w:r>
-              <w:rPr>
-                <w:rFonts w:ascii="Times New Roman" w:hAnsi="Times New Roman" w:cs="Times New Roman"/>
-                <w:i/>
-                <w:color w:val="065F46"/>
-                <w:sz w:val="24"/>
-                <w:szCs w:val="24"/>
-              </w:rPr>
-            </w:r>
-            <w:proofErr w:type="spellStart"/>
-            <w:r>
-              <w:rPr>
-                <w:rFonts w:ascii="Times New Roman" w:hAnsi="Times New Roman" w:cs="Times New Roman"/>
-                <w:i/>
-                <w:color w:val="065F46"/>
-                <w:sz w:val="24"/>
-                <w:szCs w:val="24"/>
-              </w:rPr>
-            </w:r>
-            <w:proofErr w:type="spellEnd"/>
             <w:r>
               <w:t>{{item.don_vi_to_chuc}}</w:t>
             </w:r>
@@ -26270,15 +25582,6 @@
               </w:rPr>
             </w:pPr>
             <w:r>
-              <w:rPr>
-                <w:rFonts w:ascii="Times New Roman" w:hAnsi="Times New Roman" w:cs="Times New Roman"/>
-                <w:i/>
-                <w:color w:val="065F46"/>
-                <w:sz w:val="24"/>
-                <w:szCs w:val="24"/>
-              </w:rPr>
-            </w:r>
-            <w:r>
               <w:t>{{item.thoi_gian}}</w:t>
             </w:r>
           </w:p>
@@ -26303,46 +25606,6 @@
               </w:rPr>
             </w:pPr>
             <w:r>
-              <w:rPr>
-                <w:rFonts w:ascii="Times New Roman" w:hAnsi="Times New Roman" w:cs="Times New Roman"/>
-                <w:i/>
-                <w:color w:val="065F46"/>
-                <w:sz w:val="24"/>
-                <w:szCs w:val="24"/>
-              </w:rPr>
-            </w:r>
-            <w:proofErr w:type="spellStart"/>
-            <w:r>
-              <w:rPr>
-                <w:rFonts w:ascii="Times New Roman" w:hAnsi="Times New Roman" w:cs="Times New Roman"/>
-                <w:i/>
-                <w:color w:val="065F46"/>
-                <w:sz w:val="24"/>
-                <w:szCs w:val="24"/>
-              </w:rPr>
-            </w:r>
-            <w:proofErr w:type="spellEnd"/>
-            <w:r>
-              <w:rPr>
-                <w:rFonts w:ascii="Times New Roman" w:hAnsi="Times New Roman" w:cs="Times New Roman"/>
-                <w:i/>
-                <w:color w:val="065F46"/>
-                <w:sz w:val="24"/>
-                <w:szCs w:val="24"/>
-              </w:rPr>
-            </w:r>
-            <w:proofErr w:type="spellStart"/>
-            <w:r>
-              <w:rPr>
-                <w:rFonts w:ascii="Times New Roman" w:hAnsi="Times New Roman" w:cs="Times New Roman"/>
-                <w:i/>
-                <w:color w:val="065F46"/>
-                <w:sz w:val="24"/>
-                <w:szCs w:val="24"/>
-              </w:rPr>
-            </w:r>
-            <w:proofErr w:type="spellEnd"/>
-            <w:r>
               <w:t>{{item.so_can_bo}}</w:t>
             </w:r>
           </w:p>
@@ -26366,113 +25629,52 @@
                 <w:szCs w:val="24"/>
               </w:rPr>
             </w:pPr>
-            <w:proofErr w:type="spellStart"/>
-            <w:r>
-              <w:rPr>
-                <w:rFonts w:ascii="Times New Roman" w:hAnsi="Times New Roman" w:cs="Times New Roman"/>
-                <w:i/>
-                <w:color w:val="065F46"/>
-                <w:sz w:val="24"/>
-                <w:szCs w:val="24"/>
-              </w:rPr>
-            </w:r>
-            <w:proofErr w:type="spellEnd"/>
-            <w:r>
-              <w:rPr>
-                <w:rFonts w:ascii="Times New Roman" w:hAnsi="Times New Roman" w:cs="Times New Roman"/>
-                <w:i/>
-                <w:color w:val="065F46"/>
-                <w:sz w:val="24"/>
-                <w:szCs w:val="24"/>
-              </w:rPr>
-            </w:r>
-            <w:proofErr w:type="spellStart"/>
-            <w:r>
-              <w:rPr>
-                <w:rFonts w:ascii="Times New Roman" w:hAnsi="Times New Roman" w:cs="Times New Roman"/>
-                <w:i/>
-                <w:color w:val="065F46"/>
-                <w:sz w:val="24"/>
-                <w:szCs w:val="24"/>
-              </w:rPr>
-            </w:r>
-            <w:proofErr w:type="spellEnd"/>
-            <w:r>
-              <w:rPr>
-                <w:rFonts w:ascii="Times New Roman" w:hAnsi="Times New Roman" w:cs="Times New Roman"/>
-                <w:i/>
-                <w:color w:val="065F46"/>
-                <w:sz w:val="24"/>
-                <w:szCs w:val="24"/>
-              </w:rPr>
-            </w:r>
-            <w:proofErr w:type="spellStart"/>
-            <w:r>
-              <w:rPr>
-                <w:rFonts w:ascii="Times New Roman" w:hAnsi="Times New Roman" w:cs="Times New Roman"/>
-                <w:i/>
-                <w:color w:val="065F46"/>
-                <w:sz w:val="24"/>
-                <w:szCs w:val="24"/>
-              </w:rPr>
-            </w:r>
-            <w:proofErr w:type="spellEnd"/>
-            <w:r>
-              <w:rPr>
-                <w:rFonts w:ascii="Times New Roman" w:hAnsi="Times New Roman" w:cs="Times New Roman"/>
-                <w:i/>
-                <w:color w:val="065F46"/>
-                <w:sz w:val="24"/>
-                <w:szCs w:val="24"/>
-              </w:rPr>
-            </w:r>
-            <w:proofErr w:type="spellStart"/>
-            <w:r>
-              <w:rPr>
-                <w:rFonts w:ascii="Times New Roman" w:hAnsi="Times New Roman" w:cs="Times New Roman"/>
-                <w:i/>
-                <w:color w:val="065F46"/>
-                <w:sz w:val="24"/>
-                <w:szCs w:val="24"/>
-              </w:rPr>
-            </w:r>
-            <w:proofErr w:type="spellEnd"/>
-            <w:r>
-              <w:rPr>
-                <w:rFonts w:ascii="Times New Roman" w:hAnsi="Times New Roman" w:cs="Times New Roman"/>
-                <w:i/>
-                <w:color w:val="065F46"/>
-                <w:sz w:val="24"/>
-                <w:szCs w:val="24"/>
-              </w:rPr>
-            </w:r>
-            <w:proofErr w:type="spellStart"/>
-            <w:r>
-              <w:rPr>
-                <w:rFonts w:ascii="Times New Roman" w:hAnsi="Times New Roman" w:cs="Times New Roman"/>
-                <w:i/>
-                <w:color w:val="065F46"/>
-                <w:sz w:val="24"/>
-                <w:szCs w:val="24"/>
-              </w:rPr>
-            </w:r>
-            <w:proofErr w:type="spellEnd"/>
-            <w:r>
-              <w:rPr>
-                <w:rFonts w:ascii="Times New Roman" w:hAnsi="Times New Roman" w:cs="Times New Roman"/>
-                <w:i/>
-                <w:color w:val="065F46"/>
-                <w:sz w:val="24"/>
-                <w:szCs w:val="24"/>
-              </w:rPr>
-            </w:r>
             <w:r>
               <w:t>{{item.chung_chi_so_vb}}</w:t>
             </w:r>
-            <w:r>
-              <w:t>{% endfor %}</w:t>
-            </w:r>
-          </w:p>
+          </w:p>
+        </w:tc>
+      </w:tr>
+      <w:tr>
+        <w:tc>
+          <w:tcPr>
+            <w:tcW w:type="dxa" w:w="1397"/>
+          </w:tcPr>
+          <w:p>
+            <w:r>
+              <w:t>{%tr endfor %}</w:t>
+            </w:r>
+          </w:p>
+        </w:tc>
+        <w:tc>
+          <w:tcPr>
+            <w:tcW w:type="dxa" w:w="2010"/>
+          </w:tcPr>
+          <w:p/>
+        </w:tc>
+        <w:tc>
+          <w:tcPr>
+            <w:tcW w:type="dxa" w:w="1542"/>
+          </w:tcPr>
+          <w:p/>
+        </w:tc>
+        <w:tc>
+          <w:tcPr>
+            <w:tcW w:type="dxa" w:w="1603"/>
+          </w:tcPr>
+          <w:p/>
+        </w:tc>
+        <w:tc>
+          <w:tcPr>
+            <w:tcW w:type="dxa" w:w="1411"/>
+          </w:tcPr>
+          <w:p/>
+        </w:tc>
+        <w:tc>
+          <w:tcPr>
+            <w:tcW w:type="dxa" w:w="1608"/>
+          </w:tcPr>
+          <w:p/>
         </w:tc>
       </w:tr>
       <w:tr>
@@ -27077,7 +26279,6 @@
       <w:tblPr>
         <w:tblStyle w:val="TableGrid"/>
         <w:tblW w:w="0" w:type="auto"/>
-        <w:tblLayout w:type="autofit"/>
         <w:tblLook w:val="04A0" w:firstRow="1" w:lastRow="0" w:firstColumn="1" w:lastColumn="0" w:noHBand="0" w:noVBand="1"/>
       </w:tblPr>
       <w:tblGrid>
@@ -27263,6 +26464,42 @@
       <w:tr>
         <w:tc>
           <w:tcPr>
+            <w:tcW w:type="dxa" w:w="1669"/>
+          </w:tcPr>
+          <w:p>
+            <w:r>
+              <w:t>{%tr for item in kiem_tra_attt %}</w:t>
+            </w:r>
+          </w:p>
+        </w:tc>
+        <w:tc>
+          <w:tcPr>
+            <w:tcW w:type="dxa" w:w="2299"/>
+          </w:tcPr>
+          <w:p/>
+        </w:tc>
+        <w:tc>
+          <w:tcPr>
+            <w:tcW w:type="dxa" w:w="1791"/>
+          </w:tcPr>
+          <w:p/>
+        </w:tc>
+        <w:tc>
+          <w:tcPr>
+            <w:tcW w:type="dxa" w:w="1726"/>
+          </w:tcPr>
+          <w:p/>
+        </w:tc>
+        <w:tc>
+          <w:tcPr>
+            <w:tcW w:type="dxa" w:w="2086"/>
+          </w:tcPr>
+          <w:p/>
+        </w:tc>
+      </w:tr>
+      <w:tr>
+        <w:tc>
+          <w:tcPr>
             <w:tcW w:w="1871" w:type="dxa"/>
             <w:tcBorders>
               <w:top w:val="single" w:sz="4" w:space="0" w:color="CBD5E1"/>
@@ -27282,16 +26519,6 @@
               </w:rPr>
             </w:pPr>
             <w:r>
-              <w:rPr>
-                <w:rFonts w:ascii="Times New Roman" w:hAnsi="Times New Roman" w:cs="Times New Roman"/>
-                <w:sz w:val="24"/>
-                <w:szCs w:val="24"/>
-              </w:rPr>
-            </w:r>
-            <w:r>
-              <w:t>{% for item in kiem_tra_attt %}</w:t>
-            </w:r>
-            <w:r>
               <w:t>{{item.idx}}</w:t>
             </w:r>
           </w:p>
@@ -27315,66 +26542,6 @@
                 <w:szCs w:val="24"/>
               </w:rPr>
             </w:pPr>
-            <w:proofErr w:type="spellStart"/>
-            <w:r>
-              <w:rPr>
-                <w:rFonts w:ascii="Times New Roman" w:hAnsi="Times New Roman" w:cs="Times New Roman"/>
-                <w:i/>
-                <w:color w:val="065F46"/>
-                <w:sz w:val="24"/>
-                <w:szCs w:val="24"/>
-              </w:rPr>
-            </w:r>
-            <w:proofErr w:type="spellEnd"/>
-            <w:r>
-              <w:rPr>
-                <w:rFonts w:ascii="Times New Roman" w:hAnsi="Times New Roman" w:cs="Times New Roman"/>
-                <w:i/>
-                <w:color w:val="065F46"/>
-                <w:sz w:val="24"/>
-                <w:szCs w:val="24"/>
-              </w:rPr>
-            </w:r>
-            <w:proofErr w:type="spellStart"/>
-            <w:r>
-              <w:rPr>
-                <w:rFonts w:ascii="Times New Roman" w:hAnsi="Times New Roman" w:cs="Times New Roman"/>
-                <w:i/>
-                <w:color w:val="065F46"/>
-                <w:sz w:val="24"/>
-                <w:szCs w:val="24"/>
-              </w:rPr>
-            </w:r>
-            <w:proofErr w:type="spellEnd"/>
-            <w:r>
-              <w:rPr>
-                <w:rFonts w:ascii="Times New Roman" w:hAnsi="Times New Roman" w:cs="Times New Roman"/>
-                <w:i/>
-                <w:color w:val="065F46"/>
-                <w:sz w:val="24"/>
-                <w:szCs w:val="24"/>
-              </w:rPr>
-            </w:r>
-            <w:proofErr w:type="spellStart"/>
-            <w:r>
-              <w:rPr>
-                <w:rFonts w:ascii="Times New Roman" w:hAnsi="Times New Roman" w:cs="Times New Roman"/>
-                <w:i/>
-                <w:color w:val="065F46"/>
-                <w:sz w:val="24"/>
-                <w:szCs w:val="24"/>
-              </w:rPr>
-            </w:r>
-            <w:proofErr w:type="spellEnd"/>
-            <w:r>
-              <w:rPr>
-                <w:rFonts w:ascii="Times New Roman" w:hAnsi="Times New Roman" w:cs="Times New Roman"/>
-                <w:i/>
-                <w:color w:val="065F46"/>
-                <w:sz w:val="24"/>
-                <w:szCs w:val="24"/>
-              </w:rPr>
-            </w:r>
             <w:r>
               <w:t>{{item.loai_kiem_tra}}</w:t>
             </w:r>
@@ -27399,37 +26566,6 @@
                 <w:szCs w:val="24"/>
               </w:rPr>
             </w:pPr>
-            <w:proofErr w:type="spellStart"/>
-            <w:r>
-              <w:rPr>
-                <w:rFonts w:ascii="Times New Roman" w:hAnsi="Times New Roman" w:cs="Times New Roman"/>
-                <w:i/>
-                <w:color w:val="065F46"/>
-                <w:sz w:val="24"/>
-                <w:szCs w:val="24"/>
-              </w:rPr>
-            </w:r>
-            <w:proofErr w:type="spellEnd"/>
-            <w:r>
-              <w:rPr>
-                <w:rFonts w:ascii="Times New Roman" w:hAnsi="Times New Roman" w:cs="Times New Roman"/>
-                <w:i/>
-                <w:color w:val="065F46"/>
-                <w:sz w:val="24"/>
-                <w:szCs w:val="24"/>
-              </w:rPr>
-            </w:r>
-            <w:proofErr w:type="spellStart"/>
-            <w:r>
-              <w:rPr>
-                <w:rFonts w:ascii="Times New Roman" w:hAnsi="Times New Roman" w:cs="Times New Roman"/>
-                <w:i/>
-                <w:color w:val="065F46"/>
-                <w:sz w:val="24"/>
-                <w:szCs w:val="24"/>
-              </w:rPr>
-            </w:r>
-            <w:proofErr w:type="spellEnd"/>
             <w:r>
               <w:t>{{item.don_vi_thuc_hien}}</w:t>
             </w:r>
@@ -27454,15 +26590,6 @@
                 <w:szCs w:val="24"/>
               </w:rPr>
             </w:pPr>
-            <w:r>
-              <w:rPr>
-                <w:rFonts w:ascii="Times New Roman" w:hAnsi="Times New Roman" w:cs="Times New Roman"/>
-                <w:i/>
-                <w:color w:val="065F46"/>
-                <w:sz w:val="24"/>
-                <w:szCs w:val="24"/>
-              </w:rPr>
-            </w:r>
             <w:r>
               <w:t>{{item.thoi_gian}}</w:t>
             </w:r>
@@ -27489,184 +26616,46 @@
                 <w:szCs w:val="24"/>
               </w:rPr>
             </w:pPr>
-            <w:proofErr w:type="spellStart"/>
-            <w:r>
-              <w:rPr>
-                <w:rFonts w:ascii="Times New Roman" w:hAnsi="Times New Roman" w:cs="Times New Roman"/>
-                <w:i/>
-                <w:color w:val="065F46"/>
-                <w:sz w:val="24"/>
-                <w:szCs w:val="24"/>
-              </w:rPr>
-            </w:r>
-            <w:proofErr w:type="spellEnd"/>
-            <w:r>
-              <w:rPr>
-                <w:rFonts w:ascii="Times New Roman" w:hAnsi="Times New Roman" w:cs="Times New Roman"/>
-                <w:i/>
-                <w:color w:val="065F46"/>
-                <w:sz w:val="24"/>
-                <w:szCs w:val="24"/>
-              </w:rPr>
-            </w:r>
-            <w:proofErr w:type="spellStart"/>
-            <w:r>
-              <w:rPr>
-                <w:rFonts w:ascii="Times New Roman" w:hAnsi="Times New Roman" w:cs="Times New Roman"/>
-                <w:i/>
-                <w:color w:val="065F46"/>
-                <w:sz w:val="24"/>
-                <w:szCs w:val="24"/>
-              </w:rPr>
-            </w:r>
-            <w:proofErr w:type="spellEnd"/>
-            <w:r>
-              <w:rPr>
-                <w:rFonts w:ascii="Times New Roman" w:hAnsi="Times New Roman" w:cs="Times New Roman"/>
-                <w:i/>
-                <w:color w:val="065F46"/>
-                <w:sz w:val="24"/>
-                <w:szCs w:val="24"/>
-              </w:rPr>
-            </w:r>
-            <w:proofErr w:type="spellStart"/>
-            <w:r>
-              <w:rPr>
-                <w:rFonts w:ascii="Times New Roman" w:hAnsi="Times New Roman" w:cs="Times New Roman"/>
-                <w:i/>
-                <w:color w:val="065F46"/>
-                <w:sz w:val="24"/>
-                <w:szCs w:val="24"/>
-              </w:rPr>
-            </w:r>
-            <w:proofErr w:type="spellEnd"/>
-            <w:r>
-              <w:rPr>
-                <w:rFonts w:ascii="Times New Roman" w:hAnsi="Times New Roman" w:cs="Times New Roman"/>
-                <w:i/>
-                <w:color w:val="065F46"/>
-                <w:sz w:val="24"/>
-                <w:szCs w:val="24"/>
-              </w:rPr>
-            </w:r>
-            <w:proofErr w:type="spellStart"/>
-            <w:r>
-              <w:rPr>
-                <w:rFonts w:ascii="Times New Roman" w:hAnsi="Times New Roman" w:cs="Times New Roman"/>
-                <w:i/>
-                <w:color w:val="065F46"/>
-                <w:sz w:val="24"/>
-                <w:szCs w:val="24"/>
-              </w:rPr>
-            </w:r>
-            <w:proofErr w:type="spellEnd"/>
-            <w:r>
-              <w:rPr>
-                <w:rFonts w:ascii="Times New Roman" w:hAnsi="Times New Roman" w:cs="Times New Roman"/>
-                <w:i/>
-                <w:color w:val="065F46"/>
-                <w:sz w:val="24"/>
-                <w:szCs w:val="24"/>
-              </w:rPr>
-            </w:r>
-            <w:proofErr w:type="spellStart"/>
-            <w:r>
-              <w:rPr>
-                <w:rFonts w:ascii="Times New Roman" w:hAnsi="Times New Roman" w:cs="Times New Roman"/>
-                <w:i/>
-                <w:color w:val="065F46"/>
-                <w:sz w:val="24"/>
-                <w:szCs w:val="24"/>
-              </w:rPr>
-            </w:r>
-            <w:proofErr w:type="spellEnd"/>
-            <w:r>
-              <w:rPr>
-                <w:rFonts w:ascii="Times New Roman" w:hAnsi="Times New Roman" w:cs="Times New Roman"/>
-                <w:i/>
-                <w:color w:val="065F46"/>
-                <w:sz w:val="24"/>
-                <w:szCs w:val="24"/>
-              </w:rPr>
-            </w:r>
-            <w:proofErr w:type="spellStart"/>
-            <w:r>
-              <w:rPr>
-                <w:rFonts w:ascii="Times New Roman" w:hAnsi="Times New Roman" w:cs="Times New Roman"/>
-                <w:i/>
-                <w:color w:val="065F46"/>
-                <w:sz w:val="24"/>
-                <w:szCs w:val="24"/>
-              </w:rPr>
-            </w:r>
-            <w:proofErr w:type="spellEnd"/>
-            <w:r>
-              <w:rPr>
-                <w:rFonts w:ascii="Times New Roman" w:hAnsi="Times New Roman" w:cs="Times New Roman"/>
-                <w:i/>
-                <w:color w:val="065F46"/>
-                <w:sz w:val="24"/>
-                <w:szCs w:val="24"/>
-              </w:rPr>
-            </w:r>
-            <w:proofErr w:type="spellStart"/>
-            <w:r>
-              <w:rPr>
-                <w:rFonts w:ascii="Times New Roman" w:hAnsi="Times New Roman" w:cs="Times New Roman"/>
-                <w:i/>
-                <w:color w:val="065F46"/>
-                <w:sz w:val="24"/>
-                <w:szCs w:val="24"/>
-              </w:rPr>
-            </w:r>
-            <w:proofErr w:type="spellEnd"/>
-            <w:r>
-              <w:rPr>
-                <w:rFonts w:ascii="Times New Roman" w:hAnsi="Times New Roman" w:cs="Times New Roman"/>
-                <w:i/>
-                <w:color w:val="065F46"/>
-                <w:sz w:val="24"/>
-                <w:szCs w:val="24"/>
-              </w:rPr>
-            </w:r>
-            <w:proofErr w:type="spellStart"/>
-            <w:r>
-              <w:rPr>
-                <w:rFonts w:ascii="Times New Roman" w:hAnsi="Times New Roman" w:cs="Times New Roman"/>
-                <w:i/>
-                <w:color w:val="065F46"/>
-                <w:sz w:val="24"/>
-                <w:szCs w:val="24"/>
-              </w:rPr>
-            </w:r>
-            <w:proofErr w:type="spellEnd"/>
-            <w:r>
-              <w:rPr>
-                <w:rFonts w:ascii="Times New Roman" w:hAnsi="Times New Roman" w:cs="Times New Roman"/>
-                <w:i/>
-                <w:color w:val="065F46"/>
-                <w:sz w:val="24"/>
-                <w:szCs w:val="24"/>
-              </w:rPr>
-            </w:r>
-            <w:proofErr w:type="spellStart"/>
-            <w:r>
-              <w:rPr>
-                <w:rFonts w:ascii="Times New Roman" w:hAnsi="Times New Roman" w:cs="Times New Roman"/>
-                <w:i/>
-                <w:color w:val="065F46"/>
-                <w:sz w:val="24"/>
-                <w:szCs w:val="24"/>
-              </w:rPr>
-            </w:r>
-            <w:proofErr w:type="spellEnd"/>
             <w:r>
               <w:t>{{item.ket_qua_so_vb}}</w:t>
             </w:r>
-            <w:r>
-              <w:t>{% endfor %}</w:t>
-            </w:r>
-          </w:p>
+          </w:p>
+        </w:tc>
+      </w:tr>
+      <w:tr>
+        <w:tc>
+          <w:tcPr>
+            <w:tcW w:type="dxa" w:w="1669"/>
+          </w:tcPr>
+          <w:p>
+            <w:r>
+              <w:t>{%tr endfor %}</w:t>
+            </w:r>
+          </w:p>
+        </w:tc>
+        <w:tc>
+          <w:tcPr>
+            <w:tcW w:type="dxa" w:w="2299"/>
+          </w:tcPr>
+          <w:p/>
+        </w:tc>
+        <w:tc>
+          <w:tcPr>
+            <w:tcW w:type="dxa" w:w="1791"/>
+          </w:tcPr>
+          <w:p/>
+        </w:tc>
+        <w:tc>
+          <w:tcPr>
+            <w:tcW w:type="dxa" w:w="1726"/>
+          </w:tcPr>
+          <w:p/>
+        </w:tc>
+        <w:tc>
+          <w:tcPr>
+            <w:tcW w:type="dxa" w:w="2086"/>
+          </w:tcPr>
+          <w:p/>
         </w:tc>
       </w:tr>
       <w:tr>
@@ -28852,7 +27841,6 @@
       <w:tblPr>
         <w:tblStyle w:val="TableGrid"/>
         <w:tblW w:w="0" w:type="auto"/>
-        <w:tblLayout w:type="autofit"/>
         <w:tblLook w:val="04A0" w:firstRow="1" w:lastRow="0" w:firstColumn="1" w:lastColumn="0" w:noHBand="0" w:noVBand="1"/>
       </w:tblPr>
       <w:tblGrid>
@@ -29016,6 +28004,36 @@
       <w:tr>
         <w:tc>
           <w:tcPr>
+            <w:tcW w:type="dxa" w:w="1975"/>
+          </w:tcPr>
+          <w:p>
+            <w:r>
+              <w:t>{%tr for item in port_switch %}</w:t>
+            </w:r>
+          </w:p>
+        </w:tc>
+        <w:tc>
+          <w:tcPr>
+            <w:tcW w:type="dxa" w:w="1974"/>
+          </w:tcPr>
+          <w:p/>
+        </w:tc>
+        <w:tc>
+          <w:tcPr>
+            <w:tcW w:type="dxa" w:w="3573"/>
+          </w:tcPr>
+          <w:p/>
+        </w:tc>
+        <w:tc>
+          <w:tcPr>
+            <w:tcW w:type="dxa" w:w="2049"/>
+          </w:tcPr>
+          <w:p/>
+        </w:tc>
+      </w:tr>
+      <w:tr>
+        <w:tc>
+          <w:tcPr>
             <w:tcW w:w="2339" w:type="dxa"/>
             <w:tcBorders>
               <w:top w:val="single" w:sz="4" w:space="0" w:color="CBD5E1"/>
@@ -29034,29 +28052,6 @@
               </w:rPr>
             </w:pPr>
             <w:r>
-              <w:rPr>
-                <w:rFonts w:ascii="Times New Roman" w:hAnsi="Times New Roman" w:cs="Times New Roman"/>
-                <w:i/>
-                <w:color w:val="065F46"/>
-                <w:sz w:val="24"/>
-                <w:szCs w:val="24"/>
-              </w:rPr>
-            </w:r>
-            <w:proofErr w:type="spellStart"/>
-            <w:r>
-              <w:rPr>
-                <w:rFonts w:ascii="Times New Roman" w:hAnsi="Times New Roman" w:cs="Times New Roman"/>
-                <w:i/>
-                <w:color w:val="065F46"/>
-                <w:sz w:val="24"/>
-                <w:szCs w:val="24"/>
-              </w:rPr>
-            </w:r>
-            <w:proofErr w:type="spellEnd"/>
-            <w:r>
-              <w:t>{% for item in port_switch %}</w:t>
-            </w:r>
-            <w:r>
               <w:t>{{item.ten_switch}}</w:t>
             </w:r>
           </w:p>
@@ -29081,26 +28076,6 @@
               </w:rPr>
             </w:pPr>
             <w:r>
-              <w:rPr>
-                <w:rFonts w:ascii="Times New Roman" w:hAnsi="Times New Roman" w:cs="Times New Roman"/>
-                <w:i/>
-                <w:color w:val="065F46"/>
-                <w:sz w:val="24"/>
-                <w:szCs w:val="24"/>
-              </w:rPr>
-            </w:r>
-            <w:proofErr w:type="spellStart"/>
-            <w:r>
-              <w:rPr>
-                <w:rFonts w:ascii="Times New Roman" w:hAnsi="Times New Roman" w:cs="Times New Roman"/>
-                <w:i/>
-                <w:color w:val="065F46"/>
-                <w:sz w:val="24"/>
-                <w:szCs w:val="24"/>
-              </w:rPr>
-            </w:r>
-            <w:proofErr w:type="spellEnd"/>
-            <w:r>
               <w:t>{{item.so_cong}}</w:t>
             </w:r>
           </w:p>
@@ -29125,15 +28100,6 @@
               </w:rPr>
             </w:pPr>
             <w:r>
-              <w:rPr>
-                <w:rFonts w:ascii="Times New Roman" w:hAnsi="Times New Roman" w:cs="Times New Roman"/>
-                <w:i/>
-                <w:color w:val="065F46"/>
-                <w:sz w:val="24"/>
-                <w:szCs w:val="24"/>
-              </w:rPr>
-            </w:r>
-            <w:r>
               <w:t>{{item.cong_su_dung}}</w:t>
             </w:r>
           </w:p>
@@ -29158,30 +28124,39 @@
               </w:rPr>
             </w:pPr>
             <w:r>
-              <w:rPr>
-                <w:rFonts w:ascii="Times New Roman" w:hAnsi="Times New Roman" w:cs="Times New Roman"/>
-                <w:i/>
-                <w:color w:val="065F46"/>
-                <w:sz w:val="24"/>
-                <w:szCs w:val="24"/>
-              </w:rPr>
-            </w:r>
-            <w:r>
-              <w:rPr>
-                <w:rFonts w:ascii="Times New Roman" w:hAnsi="Times New Roman" w:cs="Times New Roman"/>
-                <w:i/>
-                <w:color w:val="065F46"/>
-                <w:sz w:val="24"/>
-                <w:szCs w:val="24"/>
-              </w:rPr>
-            </w:r>
-            <w:r>
               <w:t>{{item.ghi_chu}}</w:t>
             </w:r>
-            <w:r>
-              <w:t>{% endfor %}</w:t>
-            </w:r>
-          </w:p>
+          </w:p>
+        </w:tc>
+      </w:tr>
+      <w:tr>
+        <w:tc>
+          <w:tcPr>
+            <w:tcW w:type="dxa" w:w="1975"/>
+          </w:tcPr>
+          <w:p>
+            <w:r>
+              <w:t>{%tr endfor %}</w:t>
+            </w:r>
+          </w:p>
+        </w:tc>
+        <w:tc>
+          <w:tcPr>
+            <w:tcW w:type="dxa" w:w="1974"/>
+          </w:tcPr>
+          <w:p/>
+        </w:tc>
+        <w:tc>
+          <w:tcPr>
+            <w:tcW w:type="dxa" w:w="3573"/>
+          </w:tcPr>
+          <w:p/>
+        </w:tc>
+        <w:tc>
+          <w:tcPr>
+            <w:tcW w:type="dxa" w:w="2049"/>
+          </w:tcPr>
+          <w:p/>
         </w:tc>
       </w:tr>
       <w:tr>
@@ -30823,7 +29798,6 @@
       <w:tblPr>
         <w:tblStyle w:val="TableGrid"/>
         <w:tblW w:w="0" w:type="auto"/>
-        <w:tblLayout w:type="autofit"/>
         <w:tblLook w:val="04A0" w:firstRow="1" w:lastRow="0" w:firstColumn="1" w:lastColumn="0" w:noHBand="0" w:noVBand="1"/>
       </w:tblPr>
       <w:tblGrid>
@@ -30976,6 +29950,36 @@
       <w:tr>
         <w:tc>
           <w:tcPr>
+            <w:tcW w:type="dxa" w:w="2316"/>
+          </w:tcPr>
+          <w:p>
+            <w:r>
+              <w:t>{%tr for item in T5_vi_tri %}</w:t>
+            </w:r>
+          </w:p>
+        </w:tc>
+        <w:tc>
+          <w:tcPr>
+            <w:tcW w:type="dxa" w:w="2313"/>
+          </w:tcPr>
+          <w:p/>
+        </w:tc>
+        <w:tc>
+          <w:tcPr>
+            <w:tcW w:type="dxa" w:w="2526"/>
+          </w:tcPr>
+          <w:p/>
+        </w:tc>
+        <w:tc>
+          <w:tcPr>
+            <w:tcW w:type="dxa" w:w="2416"/>
+          </w:tcPr>
+          <w:p/>
+        </w:tc>
+      </w:tr>
+      <w:tr>
+        <w:tc>
+          <w:tcPr>
             <w:tcW w:w="2339" w:type="dxa"/>
             <w:tcBorders>
               <w:top w:val="single" w:sz="4" w:space="0" w:color="CBD5E1"/>
@@ -30994,18 +29998,6 @@
               </w:rPr>
             </w:pPr>
             <w:r>
-              <w:rPr>
-                <w:rFonts w:ascii="Times New Roman" w:hAnsi="Times New Roman" w:cs="Times New Roman"/>
-                <w:i/>
-                <w:color w:val="065F46"/>
-                <w:sz w:val="24"/>
-                <w:szCs w:val="24"/>
-              </w:rPr>
-            </w:r>
-            <w:r>
-              <w:t>{% for item in T5_vi_tri %}</w:t>
-            </w:r>
-            <w:r>
               <w:t>{{item.idx}}</w:t>
             </w:r>
           </w:p>
@@ -31030,26 +30022,6 @@
                 <w:szCs w:val="24"/>
               </w:rPr>
             </w:pPr>
-            <w:proofErr w:type="spellStart"/>
-            <w:r>
-              <w:rPr>
-                <w:rFonts w:ascii="Times New Roman" w:hAnsi="Times New Roman" w:cs="Times New Roman"/>
-                <w:i/>
-                <w:color w:val="065F46"/>
-                <w:sz w:val="24"/>
-                <w:szCs w:val="24"/>
-              </w:rPr>
-            </w:r>
-            <w:proofErr w:type="spellEnd"/>
-            <w:r>
-              <w:rPr>
-                <w:rFonts w:ascii="Times New Roman" w:hAnsi="Times New Roman" w:cs="Times New Roman"/>
-                <w:i/>
-                <w:color w:val="065F46"/>
-                <w:sz w:val="24"/>
-                <w:szCs w:val="24"/>
-              </w:rPr>
-            </w:r>
             <w:r>
               <w:t>{{item.thiet_bi}}</w:t>
             </w:r>
@@ -31074,46 +30046,6 @@
                 <w:szCs w:val="24"/>
               </w:rPr>
             </w:pPr>
-            <w:proofErr w:type="spellStart"/>
-            <w:r>
-              <w:rPr>
-                <w:rFonts w:ascii="Times New Roman" w:hAnsi="Times New Roman" w:cs="Times New Roman"/>
-                <w:i/>
-                <w:color w:val="065F46"/>
-                <w:sz w:val="24"/>
-                <w:szCs w:val="24"/>
-              </w:rPr>
-            </w:r>
-            <w:proofErr w:type="spellEnd"/>
-            <w:r>
-              <w:rPr>
-                <w:rFonts w:ascii="Times New Roman" w:hAnsi="Times New Roman" w:cs="Times New Roman"/>
-                <w:i/>
-                <w:color w:val="065F46"/>
-                <w:sz w:val="24"/>
-                <w:szCs w:val="24"/>
-              </w:rPr>
-            </w:r>
-            <w:proofErr w:type="spellStart"/>
-            <w:r>
-              <w:rPr>
-                <w:rFonts w:ascii="Times New Roman" w:hAnsi="Times New Roman" w:cs="Times New Roman"/>
-                <w:i/>
-                <w:color w:val="065F46"/>
-                <w:sz w:val="24"/>
-                <w:szCs w:val="24"/>
-              </w:rPr>
-            </w:r>
-            <w:proofErr w:type="spellEnd"/>
-            <w:r>
-              <w:rPr>
-                <w:rFonts w:ascii="Times New Roman" w:hAnsi="Times New Roman" w:cs="Times New Roman"/>
-                <w:i/>
-                <w:color w:val="065F46"/>
-                <w:sz w:val="24"/>
-                <w:szCs w:val="24"/>
-              </w:rPr>
-            </w:r>
             <w:r>
               <w:t>{{item.tang}}</w:t>
             </w:r>
@@ -31138,144 +30070,40 @@
                 <w:szCs w:val="24"/>
               </w:rPr>
             </w:pPr>
-            <w:proofErr w:type="spellStart"/>
-            <w:r>
-              <w:rPr>
-                <w:rFonts w:ascii="Times New Roman" w:hAnsi="Times New Roman" w:cs="Times New Roman"/>
-                <w:i/>
-                <w:color w:val="065F46"/>
-                <w:sz w:val="24"/>
-                <w:szCs w:val="24"/>
-              </w:rPr>
-            </w:r>
-            <w:proofErr w:type="spellEnd"/>
-            <w:r>
-              <w:rPr>
-                <w:rFonts w:ascii="Times New Roman" w:hAnsi="Times New Roman" w:cs="Times New Roman"/>
-                <w:i/>
-                <w:color w:val="065F46"/>
-                <w:sz w:val="24"/>
-                <w:szCs w:val="24"/>
-              </w:rPr>
-            </w:r>
-            <w:proofErr w:type="spellStart"/>
-            <w:r>
-              <w:rPr>
-                <w:rFonts w:ascii="Times New Roman" w:hAnsi="Times New Roman" w:cs="Times New Roman"/>
-                <w:i/>
-                <w:color w:val="065F46"/>
-                <w:sz w:val="24"/>
-                <w:szCs w:val="24"/>
-              </w:rPr>
-            </w:r>
-            <w:proofErr w:type="spellEnd"/>
-            <w:r>
-              <w:rPr>
-                <w:rFonts w:ascii="Times New Roman" w:hAnsi="Times New Roman" w:cs="Times New Roman"/>
-                <w:i/>
-                <w:color w:val="065F46"/>
-                <w:sz w:val="24"/>
-                <w:szCs w:val="24"/>
-              </w:rPr>
-            </w:r>
-            <w:proofErr w:type="spellStart"/>
-            <w:r>
-              <w:rPr>
-                <w:rFonts w:ascii="Times New Roman" w:hAnsi="Times New Roman" w:cs="Times New Roman"/>
-                <w:i/>
-                <w:color w:val="065F46"/>
-                <w:sz w:val="24"/>
-                <w:szCs w:val="24"/>
-              </w:rPr>
-            </w:r>
-            <w:proofErr w:type="spellEnd"/>
-            <w:r>
-              <w:rPr>
-                <w:rFonts w:ascii="Times New Roman" w:hAnsi="Times New Roman" w:cs="Times New Roman"/>
-                <w:i/>
-                <w:color w:val="065F46"/>
-                <w:sz w:val="24"/>
-                <w:szCs w:val="24"/>
-              </w:rPr>
-            </w:r>
-            <w:proofErr w:type="spellStart"/>
-            <w:r>
-              <w:rPr>
-                <w:rFonts w:ascii="Times New Roman" w:hAnsi="Times New Roman" w:cs="Times New Roman"/>
-                <w:i/>
-                <w:color w:val="065F46"/>
-                <w:sz w:val="24"/>
-                <w:szCs w:val="24"/>
-              </w:rPr>
-            </w:r>
-            <w:proofErr w:type="spellEnd"/>
-            <w:r>
-              <w:rPr>
-                <w:rFonts w:ascii="Times New Roman" w:hAnsi="Times New Roman" w:cs="Times New Roman"/>
-                <w:i/>
-                <w:color w:val="065F46"/>
-                <w:sz w:val="24"/>
-                <w:szCs w:val="24"/>
-              </w:rPr>
-            </w:r>
-            <w:proofErr w:type="spellStart"/>
-            <w:r>
-              <w:rPr>
-                <w:rFonts w:ascii="Times New Roman" w:hAnsi="Times New Roman" w:cs="Times New Roman"/>
-                <w:i/>
-                <w:color w:val="065F46"/>
-                <w:sz w:val="24"/>
-                <w:szCs w:val="24"/>
-              </w:rPr>
-            </w:r>
-            <w:proofErr w:type="spellEnd"/>
-            <w:r>
-              <w:rPr>
-                <w:rFonts w:ascii="Times New Roman" w:hAnsi="Times New Roman" w:cs="Times New Roman"/>
-                <w:i/>
-                <w:color w:val="065F46"/>
-                <w:sz w:val="24"/>
-                <w:szCs w:val="24"/>
-              </w:rPr>
-            </w:r>
-            <w:proofErr w:type="spellStart"/>
-            <w:r>
-              <w:rPr>
-                <w:rFonts w:ascii="Times New Roman" w:hAnsi="Times New Roman" w:cs="Times New Roman"/>
-                <w:i/>
-                <w:color w:val="065F46"/>
-                <w:sz w:val="24"/>
-                <w:szCs w:val="24"/>
-              </w:rPr>
-            </w:r>
-            <w:proofErr w:type="spellEnd"/>
-            <w:r>
-              <w:rPr>
-                <w:rFonts w:ascii="Times New Roman" w:hAnsi="Times New Roman" w:cs="Times New Roman"/>
-                <w:i/>
-                <w:color w:val="065F46"/>
-                <w:sz w:val="24"/>
-                <w:szCs w:val="24"/>
-              </w:rPr>
-            </w:r>
-            <w:proofErr w:type="spellStart"/>
-            <w:r>
-              <w:rPr>
-                <w:rFonts w:ascii="Times New Roman" w:hAnsi="Times New Roman" w:cs="Times New Roman"/>
-                <w:i/>
-                <w:color w:val="065F46"/>
-                <w:sz w:val="24"/>
-                <w:szCs w:val="24"/>
-              </w:rPr>
-            </w:r>
-            <w:proofErr w:type="spellEnd"/>
             <w:r>
               <w:t>{{item.phong}}</w:t>
             </w:r>
-            <w:r>
-              <w:t>{% endfor %}</w:t>
-            </w:r>
-          </w:p>
+          </w:p>
+        </w:tc>
+      </w:tr>
+      <w:tr>
+        <w:tc>
+          <w:tcPr>
+            <w:tcW w:type="dxa" w:w="2316"/>
+          </w:tcPr>
+          <w:p>
+            <w:r>
+              <w:t>{%tr endfor %}</w:t>
+            </w:r>
+          </w:p>
+        </w:tc>
+        <w:tc>
+          <w:tcPr>
+            <w:tcW w:type="dxa" w:w="2313"/>
+          </w:tcPr>
+          <w:p/>
+        </w:tc>
+        <w:tc>
+          <w:tcPr>
+            <w:tcW w:type="dxa" w:w="2526"/>
+          </w:tcPr>
+          <w:p/>
+        </w:tc>
+        <w:tc>
+          <w:tcPr>
+            <w:tcW w:type="dxa" w:w="2416"/>
+          </w:tcPr>
+          <w:p/>
         </w:tc>
       </w:tr>
       <w:tr>

</xml_diff>

<commit_message>
feat: finalize survey checkbox parity, fix collision bugs, and sync backend schema
</commit_message>
<xml_diff>
--- a/Code/backend/templates/phieu_khao_sat_template.docx
+++ b/Code/backend/templates/phieu_khao_sat_template.docx
@@ -4057,7 +4057,7 @@
           <w:sz w:val="24"/>
           <w:szCs w:val="24"/>
         </w:rPr>
-        <w:t xml:space="preserve">{{ C4_du_lieu_ca_nhan_thuong }} ☒ Dữ liệu cá nhân thông thường     </w:t>
+        <w:t xml:space="preserve">{{ C4_du_lieu_ca_nhan_thuong }} Dữ liệu cá nhân thông thường     </w:t>
       </w:r>
       <w:r>
         <w:rPr>
@@ -4147,7 +4147,7 @@
           <w:sz w:val="24"/>
           <w:szCs w:val="24"/>
         </w:rPr>
-        <w:t xml:space="preserve">{{ C4_du_lieu_ca_nhan_nhay_cam }} ☐ Dữ liệu cá nhân nhạy cảm (sức khỏe, tôn giáo, tư pháp…)     </w:t>
+        <w:t xml:space="preserve">{{ C4_du_lieu_ca_nhan_nhay_cam }} Dữ liệu cá nhân nhạy cảm (sức khỏe, tôn giáo, tư pháp…)     </w:t>
       </w:r>
       <w:r>
         <w:rPr>
@@ -4173,7 +4173,7 @@
           <w:sz w:val="24"/>
           <w:szCs w:val="24"/>
         </w:rPr>
-        <w:t xml:space="preserve">{{ C4_du_lieu_cong }} ☐ Dữ liệu công (không bao gồm cá nhân)     </w:t>
+        <w:t xml:space="preserve">{{ C4_du_lieu_cong }} Dữ liệu công (không bao gồm cá nhân)     </w:t>
       </w:r>
       <w:r>
         <w:rPr>
@@ -4199,7 +4199,7 @@
           <w:sz w:val="24"/>
           <w:szCs w:val="24"/>
         </w:rPr>
-        <w:t>{{ C4_khong_xac_dinh }} ☐ Không xác định / Cần tư vấn</w:t>
+        <w:t>{{ C4_khong_xac_dinh }} Không xác định / Cần tư vấn</w:t>
       </w:r>
       <w:r>
         <w:rPr>
@@ -4580,7 +4580,7 @@
           <w:sz w:val="24"/>
           <w:szCs w:val="24"/>
         </w:rPr>
-        <w:t>{{ C7_co }} ☒ Có – Tên hệ thống: ___________________________     ☐ Không</w:t>
+        <w:t>{{ C7_co }} Có – Tên hệ thống: ___________________________     {{ R2_dao_tao_khong }} Không</w:t>
       </w:r>
       <w:r>
         <w:rPr>
@@ -4681,15 +4681,14 @@
           <w:sz w:val="24"/>
           <w:szCs w:val="24"/>
         </w:rPr>
-        <w:t>☐</w:t>
-      </w:r>
-      <w:r>
-        <w:rPr>
-          <w:rFonts w:ascii="Times New Roman" w:hAnsi="Times New Roman" w:cs="Times New Roman"/>
-          <w:sz w:val="24"/>
-          <w:szCs w:val="24"/>
-        </w:rPr>
-        <w:t xml:space="preserve"> </w:t>
+        <w:t xml:space="preserve">{{ R2_dao_tao_khong }} Không     </w:t>
+      </w:r>
+      <w:r>
+        <w:rPr>
+          <w:rFonts w:ascii="Times New Roman" w:hAnsi="Times New Roman" w:cs="Times New Roman"/>
+          <w:sz w:val="24"/>
+          <w:szCs w:val="24"/>
+        </w:rPr>
       </w:r>
       <w:proofErr w:type="spellStart"/>
       <w:r>
@@ -4698,7 +4697,6 @@
           <w:sz w:val="24"/>
           <w:szCs w:val="24"/>
         </w:rPr>
-        <w:t>Không</w:t>
       </w:r>
       <w:proofErr w:type="spellEnd"/>
       <w:r>
@@ -4707,7 +4705,6 @@
           <w:sz w:val="24"/>
           <w:szCs w:val="24"/>
         </w:rPr>
-        <w:t xml:space="preserve">     </w:t>
       </w:r>
     </w:p>
     <w:p>
@@ -4726,7 +4723,7 @@
           <w:sz w:val="24"/>
           <w:szCs w:val="24"/>
         </w:rPr>
-        <w:t>{{ C8_co }} ☒ Có – Độ mật: ___________  (Cần xin ý kiến riêng)</w:t>
+        <w:t>{{ C8_co }} Có – Độ mật: ___________  (Cần xin ý kiến riêng)</w:t>
       </w:r>
       <w:r>
         <w:rPr>
@@ -6489,7 +6486,7 @@
           <w:sz w:val="24"/>
           <w:szCs w:val="24"/>
         </w:rPr>
-        <w:t xml:space="preserve">{{ E2_firewall_router }} ☐ Không – Sử dụng tính năng firewall tích hợp trên Router/Switch     </w:t>
+        <w:t xml:space="preserve">{{ E2_firewall_router }} Không – Sử dụng tính năng firewall tích hợp trên Router/Switch     </w:t>
       </w:r>
       <w:r>
         <w:rPr>
@@ -6515,7 +6512,7 @@
           <w:sz w:val="24"/>
           <w:szCs w:val="24"/>
         </w:rPr>
-        <w:t>{{ E2_firewall_phan_mem }} ☐ Không – Sử dụng phần mềm firewall trên máy chủ</w:t>
+        <w:t>{{ E2_firewall_phan_mem }} Không – Sử dụng phần mềm firewall trên máy chủ</w:t>
       </w:r>
       <w:r>
         <w:rPr>
@@ -9123,15 +9120,14 @@
           <w:sz w:val="24"/>
           <w:szCs w:val="24"/>
         </w:rPr>
-        <w:t>☐</w:t>
-      </w:r>
-      <w:r>
-        <w:rPr>
-          <w:rFonts w:ascii="Times New Roman" w:hAnsi="Times New Roman" w:cs="Times New Roman"/>
-          <w:sz w:val="24"/>
-          <w:szCs w:val="24"/>
-        </w:rPr>
-        <w:t xml:space="preserve"> </w:t>
+        <w:t xml:space="preserve">{{ R2_dao_tao_khong }} Không     </w:t>
+      </w:r>
+      <w:r>
+        <w:rPr>
+          <w:rFonts w:ascii="Times New Roman" w:hAnsi="Times New Roman" w:cs="Times New Roman"/>
+          <w:sz w:val="24"/>
+          <w:szCs w:val="24"/>
+        </w:rPr>
       </w:r>
       <w:proofErr w:type="spellStart"/>
       <w:r>
@@ -9140,7 +9136,6 @@
           <w:sz w:val="24"/>
           <w:szCs w:val="24"/>
         </w:rPr>
-        <w:t>Không</w:t>
       </w:r>
       <w:proofErr w:type="spellEnd"/>
       <w:r>
@@ -9149,7 +9144,6 @@
           <w:sz w:val="24"/>
           <w:szCs w:val="24"/>
         </w:rPr>
-        <w:t xml:space="preserve">     </w:t>
       </w:r>
     </w:p>
     <w:p>
@@ -10419,7 +10413,7 @@
           <w:sz w:val="24"/>
           <w:szCs w:val="24"/>
         </w:rPr>
-        <w:t>{{ H4_vlan_co }} ☐ Có VLAN – Số lượng VLAN: ___   Mô tả: ___________________________</w:t>
+        <w:t>{{ H4_vlan_co }} Có VLAN – Số lượng VLAN: ___   Mô tả: ___________________________</w:t>
       </w:r>
       <w:r>
         <w:rPr>
@@ -12084,7 +12078,7 @@
           <w:sz w:val="24"/>
           <w:szCs w:val="24"/>
         </w:rPr>
-        <w:t xml:space="preserve">{{ L1_khoa_camera }} ☐ Có khóa cửa + camera giám sát     </w:t>
+        <w:t xml:space="preserve">{{ L1_khoa_camera }} Có khóa cửa + camera giám sát     </w:t>
       </w:r>
       <w:r>
         <w:rPr>
@@ -12110,7 +12104,7 @@
           <w:sz w:val="24"/>
           <w:szCs w:val="24"/>
         </w:rPr>
-        <w:t xml:space="preserve">{{ L1_the_tu }} ☐ Có thẻ từ / kiểm soát điện tử     </w:t>
+        <w:t xml:space="preserve">{{ L1_the_tu }} Có thẻ từ / kiểm soát điện tử     </w:t>
       </w:r>
       <w:r>
         <w:rPr>
@@ -12136,7 +12130,7 @@
           <w:sz w:val="24"/>
           <w:szCs w:val="24"/>
         </w:rPr>
-        <w:t>{{ L1_khong_kiem_soat }} ☐ Không có kiểm soát riêng</w:t>
+        <w:t>{{ L1_khong_kiem_soat }} Không có kiểm soát riêng</w:t>
       </w:r>
       <w:r>
         <w:rPr>
@@ -12213,15 +12207,14 @@
           <w:sz w:val="24"/>
           <w:szCs w:val="24"/>
         </w:rPr>
-        <w:t>☐</w:t>
-      </w:r>
-      <w:r>
-        <w:rPr>
-          <w:rFonts w:ascii="Times New Roman" w:hAnsi="Times New Roman" w:cs="Times New Roman"/>
-          <w:sz w:val="24"/>
-          <w:szCs w:val="24"/>
-        </w:rPr>
-        <w:t xml:space="preserve"> Có     </w:t>
+        <w:t xml:space="preserve">{{ L5_1_log_router_co }} Có     </w:t>
+      </w:r>
+      <w:r>
+        <w:rPr>
+          <w:rFonts w:ascii="Times New Roman" w:hAnsi="Times New Roman" w:cs="Times New Roman"/>
+          <w:sz w:val="24"/>
+          <w:szCs w:val="24"/>
+        </w:rPr>
       </w:r>
     </w:p>
     <w:p>
@@ -12329,7 +12322,7 @@
           <w:sz w:val="24"/>
           <w:szCs w:val="24"/>
         </w:rPr>
-        <w:t xml:space="preserve">{{ L2_pass_policy_co }} ☐ Có – Yêu cầu: độ dài tối thiểu _____ ký tự, đổi định kỳ _____ tháng     </w:t>
+        <w:t xml:space="preserve">{{ L2_pass_policy_co }} Có – Yêu cầu: độ dài tối thiểu _____ ký tự, đổi định kỳ _____ tháng     </w:t>
       </w:r>
       <w:r>
         <w:rPr>
@@ -12355,7 +12348,7 @@
           <w:sz w:val="24"/>
           <w:szCs w:val="24"/>
         </w:rPr>
-        <w:t>{{ L2_pass_policy_khong }} ☐ Không có chính sách thống nhất (mỗi người tự đặt)</w:t>
+        <w:t>{{ L2_pass_policy_khong }} Không có chính sách thống nhất (mỗi người tự đặt)</w:t>
       </w:r>
       <w:r>
         <w:rPr>
@@ -12442,7 +12435,7 @@
           <w:sz w:val="24"/>
           <w:szCs w:val="24"/>
         </w:rPr>
-        <w:t xml:space="preserve">{{ L2_account_rieng }} ☐ Mỗi cán bộ có tài khoản riêng     </w:t>
+        <w:t xml:space="preserve">{{ L2_account_rieng }} Mỗi cán bộ có tài khoản riêng     </w:t>
       </w:r>
       <w:r>
         <w:rPr>
@@ -12468,7 +12461,7 @@
           <w:sz w:val="24"/>
           <w:szCs w:val="24"/>
         </w:rPr>
-        <w:t xml:space="preserve">{{ L2_account_chung }} ☐ Dùng chung một tài khoản admin     </w:t>
+        <w:t xml:space="preserve">{{ L2_account_chung }} Dùng chung một tài khoản admin     </w:t>
       </w:r>
       <w:r>
         <w:rPr>
@@ -12494,7 +12487,7 @@
           <w:sz w:val="24"/>
           <w:szCs w:val="24"/>
         </w:rPr>
-        <w:t>{{ L2_account_both }} ☐ Cả hai hình thức</w:t>
+        <w:t>{{ L2_account_both }} Cả hai hình thức</w:t>
       </w:r>
       <w:r>
         <w:rPr>
@@ -12581,7 +12574,7 @@
           <w:sz w:val="24"/>
           <w:szCs w:val="24"/>
         </w:rPr>
-        <w:t xml:space="preserve">{{ L2_2fa_co }} ☐ Có – Áp dụng cho: ___________________________     </w:t>
+        <w:t xml:space="preserve">{{ L2_2fa_co }} Có – Áp dụng cho: ___________________________     </w:t>
       </w:r>
       <w:r>
         <w:rPr>
@@ -12607,15 +12600,14 @@
           <w:sz w:val="24"/>
           <w:szCs w:val="24"/>
         </w:rPr>
-        <w:t>☐</w:t>
-      </w:r>
-      <w:r>
-        <w:rPr>
-          <w:rFonts w:ascii="Times New Roman" w:hAnsi="Times New Roman" w:cs="Times New Roman"/>
-          <w:sz w:val="24"/>
-          <w:szCs w:val="24"/>
-        </w:rPr>
-        <w:t xml:space="preserve"> </w:t>
+        <w:t>{{ R2_dao_tao_khong }} Không</w:t>
+      </w:r>
+      <w:r>
+        <w:rPr>
+          <w:rFonts w:ascii="Times New Roman" w:hAnsi="Times New Roman" w:cs="Times New Roman"/>
+          <w:sz w:val="24"/>
+          <w:szCs w:val="24"/>
+        </w:rPr>
       </w:r>
       <w:proofErr w:type="spellStart"/>
       <w:r>
@@ -12624,7 +12616,6 @@
           <w:sz w:val="24"/>
           <w:szCs w:val="24"/>
         </w:rPr>
-        <w:t>Không</w:t>
       </w:r>
       <w:proofErr w:type="spellEnd"/>
     </w:p>
@@ -12696,7 +12687,7 @@
           <w:sz w:val="24"/>
           <w:szCs w:val="24"/>
         </w:rPr>
-        <w:t xml:space="preserve">{{ L3_antivirus_co }} ☐ Có – Tên phần mềm: _______________  Bản quyền: Có / Không / Miễn phí     </w:t>
+        <w:t xml:space="preserve">{{ L3_antivirus_co }} Có – Tên phần mềm: _______________  Bản quyền: Có / Không / Miễn phí     </w:t>
       </w:r>
       <w:r>
         <w:rPr>
@@ -12740,15 +12731,14 @@
           <w:sz w:val="24"/>
           <w:szCs w:val="24"/>
         </w:rPr>
-        <w:t>☐</w:t>
-      </w:r>
-      <w:r>
-        <w:rPr>
-          <w:rFonts w:ascii="Times New Roman" w:hAnsi="Times New Roman" w:cs="Times New Roman"/>
-          <w:sz w:val="24"/>
-          <w:szCs w:val="24"/>
-        </w:rPr>
-        <w:t xml:space="preserve"> Không</w:t>
+        <w:t>{{ R2_dao_tao_khong }} Không</w:t>
+      </w:r>
+      <w:r>
+        <w:rPr>
+          <w:rFonts w:ascii="Times New Roman" w:hAnsi="Times New Roman" w:cs="Times New Roman"/>
+          <w:sz w:val="24"/>
+          <w:szCs w:val="24"/>
+        </w:rPr>
       </w:r>
     </w:p>
     <w:p>
@@ -12919,7 +12909,7 @@
           <w:sz w:val="24"/>
           <w:szCs w:val="24"/>
         </w:rPr>
-        <w:t xml:space="preserve">{{ L4_1_tan_suat_co }} ☐ Có – Tần suất: Hàng ngày / Hàng tuần / Hàng tháng     </w:t>
+        <w:t xml:space="preserve">{{ L4_1_tan_suat_co }} Có – Tần suất: Hàng ngày / Hàng tuần / Hàng tháng     </w:t>
       </w:r>
       <w:r>
         <w:rPr>
@@ -12945,7 +12935,7 @@
           <w:sz w:val="24"/>
           <w:szCs w:val="24"/>
         </w:rPr>
-        <w:t xml:space="preserve">{{ L4_1_tan_suat_thu_cong }} ☐ Thực hiện thủ công khi nhớ     </w:t>
+        <w:t xml:space="preserve">{{ L4_1_tan_suat_thu_cong }} Thực hiện thủ công khi nhớ     </w:t>
       </w:r>
       <w:r>
         <w:rPr>
@@ -12971,7 +12961,7 @@
           <w:sz w:val="24"/>
           <w:szCs w:val="24"/>
         </w:rPr>
-        <w:t>{{ L4_1_tan_suat_khong }} ☐ Không sao lưu</w:t>
+        <w:t>{{ L4_1_tan_suat_khong }} Không sao lưu</w:t>
       </w:r>
       <w:r>
         <w:rPr>
@@ -13169,7 +13159,7 @@
           <w:sz w:val="24"/>
           <w:szCs w:val="24"/>
         </w:rPr>
-        <w:t xml:space="preserve">{{ L4_3_khac_vi_tri }} ☐ Có – Địa điểm: ___________________________     </w:t>
+        <w:t xml:space="preserve">{{ L4_3_khac_vi_tri }} Có – Địa điểm: ___________________________     </w:t>
       </w:r>
       <w:r>
         <w:rPr>
@@ -13195,7 +13185,7 @@
           <w:sz w:val="24"/>
           <w:szCs w:val="24"/>
         </w:rPr>
-        <w:t>{{ L4_3_khong_khac_vi_tri }} ☐ Không – Cùng vị trí với máy chủ</w:t>
+        <w:t>{{ L4_3_khong_khac_vi_tri }} Không – Cùng vị trí với máy chủ</w:t>
       </w:r>
       <w:r>
         <w:rPr>
@@ -13305,15 +13295,14 @@
           <w:sz w:val="24"/>
           <w:szCs w:val="24"/>
         </w:rPr>
-        <w:t>☐</w:t>
-      </w:r>
-      <w:r>
-        <w:rPr>
-          <w:rFonts w:ascii="Times New Roman" w:hAnsi="Times New Roman" w:cs="Times New Roman"/>
-          <w:sz w:val="24"/>
-          <w:szCs w:val="24"/>
-        </w:rPr>
-        <w:t xml:space="preserve"> Có     </w:t>
+        <w:t xml:space="preserve">{{ L5_1_log_router_co }} Có     </w:t>
+      </w:r>
+      <w:r>
+        <w:rPr>
+          <w:rFonts w:ascii="Times New Roman" w:hAnsi="Times New Roman" w:cs="Times New Roman"/>
+          <w:sz w:val="24"/>
+          <w:szCs w:val="24"/>
+        </w:rPr>
       </w:r>
     </w:p>
     <w:p>
@@ -13332,7 +13321,7 @@
           <w:sz w:val="24"/>
           <w:szCs w:val="24"/>
         </w:rPr>
-        <w:t xml:space="preserve">{{ L5_1_log_router_khong_biet }} ☐ Không biết / Chưa kiểm tra     </w:t>
+        <w:t xml:space="preserve">{{ L5_1_log_router_khong_biet }} Không biết / Chưa kiểm tra     </w:t>
       </w:r>
       <w:r>
         <w:rPr>
@@ -13358,15 +13347,14 @@
           <w:sz w:val="24"/>
           <w:szCs w:val="24"/>
         </w:rPr>
-        <w:t>{{ L5_1_log_router_khong }} ☐ Không</w:t>
-      </w:r>
-      <w:r>
-        <w:rPr>
-          <w:rFonts w:ascii="Times New Roman" w:hAnsi="Times New Roman" w:cs="Times New Roman"/>
-          <w:sz w:val="24"/>
-          <w:szCs w:val="24"/>
-        </w:rPr>
-        <w:t xml:space="preserve"> </w:t>
+        <w:t>{{ L5_1_log_router_khong }} Không</w:t>
+      </w:r>
+      <w:r>
+        <w:rPr>
+          <w:rFonts w:ascii="Times New Roman" w:hAnsi="Times New Roman" w:cs="Times New Roman"/>
+          <w:sz w:val="24"/>
+          <w:szCs w:val="24"/>
+        </w:rPr>
       </w:r>
       <w:proofErr w:type="spellStart"/>
       <w:r>
@@ -13375,7 +13363,6 @@
           <w:sz w:val="24"/>
           <w:szCs w:val="24"/>
         </w:rPr>
-        <w:t>Không</w:t>
       </w:r>
       <w:proofErr w:type="spellEnd"/>
     </w:p>
@@ -13414,7 +13401,7 @@
           <w:sz w:val="24"/>
           <w:szCs w:val="24"/>
         </w:rPr>
-        <w:t xml:space="preserve">{{ L5_2_thoi_gian_duoi_3 }} ☐ &lt; 3 tháng     </w:t>
+        <w:t xml:space="preserve">{{ L5_2_thoi_gian_duoi_3 }} &lt; 3 tháng     </w:t>
       </w:r>
       <w:r>
         <w:rPr>
@@ -13440,7 +13427,7 @@
           <w:sz w:val="24"/>
           <w:szCs w:val="24"/>
         </w:rPr>
-        <w:t xml:space="preserve">{{ L5_2_thoi_gian_3_6 }} ☐ 3 – 6 tháng     </w:t>
+        <w:t xml:space="preserve">{{ L5_2_thoi_gian_3_6 }} 3 – 6 tháng     </w:t>
       </w:r>
       <w:r>
         <w:rPr>
@@ -13466,7 +13453,7 @@
           <w:sz w:val="24"/>
           <w:szCs w:val="24"/>
         </w:rPr>
-        <w:t xml:space="preserve">{{ L5_2_thoi_gian_tren_6 }} ☐ &gt; 6 tháng     </w:t>
+        <w:t xml:space="preserve">{{ L5_2_thoi_gian_tren_6 }} &gt; 6 tháng     </w:t>
       </w:r>
       <w:r>
         <w:rPr>
@@ -13492,7 +13479,7 @@
           <w:sz w:val="24"/>
           <w:szCs w:val="24"/>
         </w:rPr>
-        <w:t>{{ L5_2_thoi_gian_khong }} ☐ Không lưu</w:t>
+        <w:t>{{ L5_2_thoi_gian_khong }} Không lưu</w:t>
       </w:r>
       <w:r>
         <w:rPr>
@@ -13572,7 +13559,7 @@
           <w:sz w:val="24"/>
           <w:szCs w:val="24"/>
         </w:rPr>
-        <w:t xml:space="preserve">{{ L5_3_siem_co }} ☐ Có – Tên/loại: ___________________________     </w:t>
+        <w:t xml:space="preserve">{{ L5_3_siem_co }} Có – Tên/loại: ___________________________     </w:t>
       </w:r>
       <w:r>
         <w:rPr>
@@ -13598,15 +13585,14 @@
           <w:sz w:val="24"/>
           <w:szCs w:val="24"/>
         </w:rPr>
-        <w:t>{{ L5_3_siem_khong }} ☐ Không</w:t>
-      </w:r>
-      <w:r>
-        <w:rPr>
-          <w:rFonts w:ascii="Times New Roman" w:hAnsi="Times New Roman" w:cs="Times New Roman"/>
-          <w:sz w:val="24"/>
-          <w:szCs w:val="24"/>
-        </w:rPr>
-        <w:t xml:space="preserve"> </w:t>
+        <w:t>{{ L5_3_siem_khong }} Không</w:t>
+      </w:r>
+      <w:r>
+        <w:rPr>
+          <w:rFonts w:ascii="Times New Roman" w:hAnsi="Times New Roman" w:cs="Times New Roman"/>
+          <w:sz w:val="24"/>
+          <w:szCs w:val="24"/>
+        </w:rPr>
       </w:r>
       <w:proofErr w:type="spellStart"/>
       <w:r>
@@ -13615,7 +13601,6 @@
           <w:sz w:val="24"/>
           <w:szCs w:val="24"/>
         </w:rPr>
-        <w:t>Không</w:t>
       </w:r>
       <w:proofErr w:type="spellEnd"/>
     </w:p>
@@ -13687,7 +13672,7 @@
           <w:sz w:val="24"/>
           <w:szCs w:val="24"/>
         </w:rPr>
-        <w:t xml:space="preserve">{{ L6_1_su_co_khong }} ☐ Không có sự cố nào     </w:t>
+        <w:t xml:space="preserve">{{ L6_1_su_co_khong }} Không có sự cố nào     </w:t>
       </w:r>
       <w:r>
         <w:rPr>
@@ -13713,7 +13698,7 @@
           <w:sz w:val="24"/>
           <w:szCs w:val="24"/>
         </w:rPr>
-        <w:t>{{ L6_1_su_co_co }} ☐ Có – Mô tả ngắn: ___________________________     {{ L6_1_su_co_khong_biet }} ☐ Không biết / Không ghi nhận</w:t>
+        <w:t>{{ L6_1_su_co_co }} Có – Mô tả ngắn: ___________________________     {{ L6_1_su_co_khong_biet }} Không biết / Không ghi nhận</w:t>
       </w:r>
       <w:r>
         <w:rPr>
@@ -14039,7 +14024,7 @@
           <w:sz w:val="24"/>
           <w:szCs w:val="24"/>
         </w:rPr>
-        <w:t xml:space="preserve">{{ L7_1_firewall_router }} ☐ Tường lửa tích hợp trên Router (SPI – Stateful Packet Inspection)     </w:t>
+        <w:t xml:space="preserve">{{ L7_1_firewall_router }} Tường lửa tích hợp trên Router (SPI – Stateful Packet Inspection)     </w:t>
       </w:r>
       <w:r>
         <w:rPr>
@@ -14065,7 +14050,7 @@
           <w:sz w:val="24"/>
           <w:szCs w:val="24"/>
         </w:rPr>
-        <w:t xml:space="preserve">{{ L7_1_firewall_phanh_cung }} ☐ Tường lửa phần cứng chuyên dụng (Firewall appliance)     </w:t>
+        <w:t xml:space="preserve">{{ L7_1_firewall_phanh_cung }} Tường lửa phần cứng chuyên dụng (Firewall appliance)     </w:t>
       </w:r>
       <w:r>
         <w:rPr>
@@ -14091,7 +14076,7 @@
           <w:sz w:val="24"/>
           <w:szCs w:val="24"/>
         </w:rPr>
-        <w:t>{{ L7_1_firewall_phan_mem }} ☐ Tường lửa phần mềm trên máy chủ (iptables, Windows Firewall…)</w:t>
+        <w:t>{{ L7_1_firewall_phan_mem }} Tường lửa phần mềm trên máy chủ (iptables, Windows Firewall…)</w:t>
       </w:r>
       <w:r>
         <w:rPr>
@@ -14194,7 +14179,7 @@
           <w:sz w:val="24"/>
           <w:szCs w:val="24"/>
         </w:rPr>
-        <w:t xml:space="preserve">{{ L7_2_policy_deny }} ☐ Chặn tất cả, chỉ cho phép những gì được khai báo (Default Deny – Khuyến nghị)     </w:t>
+        <w:t xml:space="preserve">{{ L7_2_policy_deny }} Chặn tất cả, chỉ cho phép những gì được khai báo (Default Deny – Khuyến nghị)     </w:t>
       </w:r>
       <w:r>
         <w:rPr>
@@ -14220,7 +14205,7 @@
           <w:sz w:val="24"/>
           <w:szCs w:val="24"/>
         </w:rPr>
-        <w:t xml:space="preserve">{{ L7_2_policy_allow }} ☐ Cho phép tất cả, chỉ chặn những gì bị cấm (Default Allow)     </w:t>
+        <w:t xml:space="preserve">{{ L7_2_policy_allow }} Cho phép tất cả, chỉ chặn những gì bị cấm (Default Allow)     </w:t>
       </w:r>
       <w:r>
         <w:rPr>
@@ -14246,7 +14231,7 @@
           <w:sz w:val="24"/>
           <w:szCs w:val="24"/>
         </w:rPr>
-        <w:t>{{ L7_2_policy_khong_biet }} ☐ Không biết / Chưa cấu hình</w:t>
+        <w:t>{{ L7_2_policy_khong_biet }} Không biết / Chưa cấu hình</w:t>
       </w:r>
       <w:r>
         <w:rPr>
@@ -14317,7 +14302,7 @@
           <w:sz w:val="24"/>
           <w:szCs w:val="24"/>
         </w:rPr>
-        <w:t xml:space="preserve">{{ L7_3_remote_vpn }} ☐ Có – qua VPN (SSL VPN / IPSec)     </w:t>
+        <w:t xml:space="preserve">{{ L7_3_remote_vpn }} Có – qua VPN (SSL VPN / IPSec)     </w:t>
       </w:r>
       <w:r>
         <w:rPr>
@@ -14343,7 +14328,7 @@
           <w:sz w:val="24"/>
           <w:szCs w:val="24"/>
         </w:rPr>
-        <w:t xml:space="preserve">{{ L7_3_remote_desktop }} ☐ Có – qua Remote Desktop / TeamViewer / AnyDesk     </w:t>
+        <w:t xml:space="preserve">{{ L7_3_remote_desktop }} Có – qua Remote Desktop / TeamViewer / AnyDesk     </w:t>
       </w:r>
       <w:r>
         <w:rPr>
@@ -14369,15 +14354,14 @@
           <w:sz w:val="24"/>
           <w:szCs w:val="24"/>
         </w:rPr>
-        <w:t>☐</w:t>
-      </w:r>
-      <w:r>
-        <w:rPr>
-          <w:rFonts w:ascii="Times New Roman" w:hAnsi="Times New Roman" w:cs="Times New Roman"/>
-          <w:sz w:val="24"/>
-          <w:szCs w:val="24"/>
-        </w:rPr>
-        <w:t xml:space="preserve"> </w:t>
+        <w:t>{{ R2_dao_tao_khong }} Không</w:t>
+      </w:r>
+      <w:r>
+        <w:rPr>
+          <w:rFonts w:ascii="Times New Roman" w:hAnsi="Times New Roman" w:cs="Times New Roman"/>
+          <w:sz w:val="24"/>
+          <w:szCs w:val="24"/>
+        </w:rPr>
       </w:r>
       <w:proofErr w:type="spellStart"/>
       <w:r>
@@ -14386,7 +14370,6 @@
           <w:sz w:val="24"/>
           <w:szCs w:val="24"/>
         </w:rPr>
-        <w:t>Không</w:t>
       </w:r>
       <w:proofErr w:type="spellEnd"/>
     </w:p>
@@ -14580,7 +14563,7 @@
           <w:sz w:val="24"/>
           <w:szCs w:val="24"/>
         </w:rPr>
-        <w:t xml:space="preserve">{{ L8_1_ups_co }} ☐ Có – Hãng/Model: _______________  Công suất: _______VA  Thời gian dự phòng: ~_____phút     </w:t>
+        <w:t xml:space="preserve">{{ L8_1_ups_co }} Có – Hãng/Model: _______________  Công suất: _______VA  Thời gian dự phòng: ~_____phút     </w:t>
       </w:r>
       <w:r>
         <w:rPr>
@@ -14622,7 +14605,7 @@
           <w:sz w:val="24"/>
           <w:szCs w:val="24"/>
         </w:rPr>
-        <w:t>{{ L8_1_ups_khong }} ☐ Không có UPS</w:t>
+        <w:t>{{ L8_1_ups_khong }} Không có UPS</w:t>
       </w:r>
       <w:r>
         <w:rPr>
@@ -14693,7 +14676,7 @@
           <w:sz w:val="24"/>
           <w:szCs w:val="24"/>
         </w:rPr>
-        <w:t xml:space="preserve">{{ L8_2_air_24_7 }} ☐ Có – Điều hòa hoạt động 24/7     </w:t>
+        <w:t xml:space="preserve">{{ L8_2_air_24_7 }} Có – Điều hòa hoạt động 24/7     </w:t>
       </w:r>
       <w:r>
         <w:rPr>
@@ -14719,7 +14702,7 @@
           <w:sz w:val="24"/>
           <w:szCs w:val="24"/>
         </w:rPr>
-        <w:t xml:space="preserve">{{ L8_2_air_hanh_chinh }} ☐ Có – Chỉ bật giờ hành chính     </w:t>
+        <w:t xml:space="preserve">{{ L8_2_air_hanh_chinh }} Có – Chỉ bật giờ hành chính     </w:t>
       </w:r>
       <w:r>
         <w:rPr>
@@ -14745,15 +14728,14 @@
           <w:sz w:val="24"/>
           <w:szCs w:val="24"/>
         </w:rPr>
-        <w:t>☐</w:t>
-      </w:r>
-      <w:r>
-        <w:rPr>
-          <w:rFonts w:ascii="Times New Roman" w:hAnsi="Times New Roman" w:cs="Times New Roman"/>
-          <w:sz w:val="24"/>
-          <w:szCs w:val="24"/>
-        </w:rPr>
-        <w:t xml:space="preserve"> </w:t>
+        <w:t>{{ R2_dao_tao_khong }} Không</w:t>
+      </w:r>
+      <w:r>
+        <w:rPr>
+          <w:rFonts w:ascii="Times New Roman" w:hAnsi="Times New Roman" w:cs="Times New Roman"/>
+          <w:sz w:val="24"/>
+          <w:szCs w:val="24"/>
+        </w:rPr>
       </w:r>
       <w:proofErr w:type="spellStart"/>
       <w:r>
@@ -14762,7 +14744,6 @@
           <w:sz w:val="24"/>
           <w:szCs w:val="24"/>
         </w:rPr>
-        <w:t>Không</w:t>
       </w:r>
       <w:proofErr w:type="spellEnd"/>
     </w:p>
@@ -14811,15 +14792,14 @@
           <w:sz w:val="24"/>
           <w:szCs w:val="24"/>
         </w:rPr>
-        <w:t>☐</w:t>
-      </w:r>
-      <w:r>
-        <w:rPr>
-          <w:rFonts w:ascii="Times New Roman" w:hAnsi="Times New Roman" w:cs="Times New Roman"/>
-          <w:sz w:val="24"/>
-          <w:szCs w:val="24"/>
-        </w:rPr>
-        <w:t xml:space="preserve"> Có – Loại: </w:t>
+        <w:t xml:space="preserve">{{ L8_3_chua_chay_co }} Có – Loại: </w:t>
+      </w:r>
+      <w:r>
+        <w:rPr>
+          <w:rFonts w:ascii="Times New Roman" w:hAnsi="Times New Roman" w:cs="Times New Roman"/>
+          <w:sz w:val="24"/>
+          <w:szCs w:val="24"/>
+        </w:rPr>
       </w:r>
     </w:p>
     <w:p>
@@ -14838,7 +14818,7 @@
           <w:sz w:val="24"/>
           <w:szCs w:val="24"/>
         </w:rPr>
-        <w:t xml:space="preserve">{{ L8_3_co2 }} ☐ CO₂  </w:t>
+        <w:t xml:space="preserve">{{ L8_3_co2 }} CO₂  </w:t>
       </w:r>
       <w:r>
         <w:rPr>
@@ -14864,7 +14844,7 @@
           <w:sz w:val="24"/>
           <w:szCs w:val="24"/>
         </w:rPr>
-        <w:t xml:space="preserve">{{ L8_3_bot_kho }} ☐ Bột khô  </w:t>
+        <w:t xml:space="preserve">{{ L8_3_bot_kho }} Bột khô  </w:t>
       </w:r>
       <w:r>
         <w:rPr>
@@ -14890,7 +14870,7 @@
           <w:sz w:val="24"/>
           <w:szCs w:val="24"/>
         </w:rPr>
-        <w:t xml:space="preserve">{{ L8_3_khac }} ☐ Khác: ___________     </w:t>
+        <w:t xml:space="preserve">{{ L8_3_khac }} Khác: ___________     </w:t>
       </w:r>
       <w:r>
         <w:rPr>
@@ -14916,15 +14896,14 @@
           <w:sz w:val="24"/>
           <w:szCs w:val="24"/>
         </w:rPr>
-        <w:t>☐</w:t>
-      </w:r>
-      <w:r>
-        <w:rPr>
-          <w:rFonts w:ascii="Times New Roman" w:hAnsi="Times New Roman" w:cs="Times New Roman"/>
-          <w:sz w:val="24"/>
-          <w:szCs w:val="24"/>
-        </w:rPr>
-        <w:t xml:space="preserve"> </w:t>
+        <w:t>{{ R2_dao_tao_khong }} Không</w:t>
+      </w:r>
+      <w:r>
+        <w:rPr>
+          <w:rFonts w:ascii="Times New Roman" w:hAnsi="Times New Roman" w:cs="Times New Roman"/>
+          <w:sz w:val="24"/>
+          <w:szCs w:val="24"/>
+        </w:rPr>
       </w:r>
       <w:proofErr w:type="spellStart"/>
       <w:r>
@@ -14933,7 +14912,6 @@
           <w:sz w:val="24"/>
           <w:szCs w:val="24"/>
         </w:rPr>
-        <w:t>Không</w:t>
       </w:r>
       <w:proofErr w:type="spellEnd"/>
     </w:p>
@@ -15224,7 +15202,7 @@
           <w:sz w:val="24"/>
           <w:szCs w:val="24"/>
         </w:rPr>
-        <w:t xml:space="preserve">{{ P1_https }} ☐ HTTPS (có chứng chỉ SSL/TLS) – Khuyến nghị     </w:t>
+        <w:t xml:space="preserve">{{ P1_https }} HTTPS (có chứng chỉ SSL/TLS) – Khuyến nghị     </w:t>
       </w:r>
       <w:r>
         <w:rPr>
@@ -15250,7 +15228,7 @@
           <w:sz w:val="24"/>
           <w:szCs w:val="24"/>
         </w:rPr>
-        <w:t xml:space="preserve">{{ P1_http }} ☐ HTTP (không mã hóa)     </w:t>
+        <w:t xml:space="preserve">{{ P1_http }} HTTP (không mã hóa)     </w:t>
       </w:r>
       <w:r>
         <w:rPr>
@@ -15276,7 +15254,7 @@
           <w:sz w:val="24"/>
           <w:szCs w:val="24"/>
         </w:rPr>
-        <w:t>{{ P1_both }} ☐ Cả hai (một số dùng HTTPS, một số dùng HTTP)</w:t>
+        <w:t>{{ T4_1_both }} Cả hai (một số dùng HTTPS, một số dùng HTTP)</w:t>
       </w:r>
       <w:r>
         <w:rPr>
@@ -15363,15 +15341,14 @@
           <w:sz w:val="24"/>
           <w:szCs w:val="24"/>
         </w:rPr>
-        <w:t>☐</w:t>
-      </w:r>
-      <w:r>
-        <w:rPr>
-          <w:rFonts w:ascii="Times New Roman" w:hAnsi="Times New Roman" w:cs="Times New Roman"/>
-          <w:sz w:val="24"/>
-          <w:szCs w:val="24"/>
-        </w:rPr>
-        <w:t xml:space="preserve"> Có – Loại VPN: </w:t>
+        <w:t xml:space="preserve">{{ L5_1_log_router_co }} Có – Loại VPN: </w:t>
+      </w:r>
+      <w:r>
+        <w:rPr>
+          <w:rFonts w:ascii="Times New Roman" w:hAnsi="Times New Roman" w:cs="Times New Roman"/>
+          <w:sz w:val="24"/>
+          <w:szCs w:val="24"/>
+        </w:rPr>
       </w:r>
     </w:p>
     <w:p>
@@ -15390,7 +15367,7 @@
           <w:sz w:val="24"/>
           <w:szCs w:val="24"/>
         </w:rPr>
-        <w:t xml:space="preserve">{{ P2_ssl_vpn }} ☐ SSL VPN  </w:t>
+        <w:t xml:space="preserve">{{ P2_ssl_vpn }} SSL VPN  </w:t>
       </w:r>
       <w:r>
         <w:rPr>
@@ -15416,7 +15393,7 @@
           <w:sz w:val="24"/>
           <w:szCs w:val="24"/>
         </w:rPr>
-        <w:t xml:space="preserve">{{ P2_ipsec }} ☐ IPSec  </w:t>
+        <w:t xml:space="preserve">{{ P2_ipsec }} IPSec  </w:t>
       </w:r>
       <w:r>
         <w:rPr>
@@ -15442,7 +15419,7 @@
           <w:sz w:val="24"/>
           <w:szCs w:val="24"/>
         </w:rPr>
-        <w:t xml:space="preserve">{{ P2_khac }} {{ L8_3_khac }} ☐ Khác: _____________     </w:t>
+        <w:t xml:space="preserve">{{ P2_khac }} Khác: _____________     </w:t>
       </w:r>
       <w:r>
         <w:rPr>
@@ -15468,7 +15445,7 @@
           <w:sz w:val="24"/>
           <w:szCs w:val="24"/>
         </w:rPr>
-        <w:t>{{ P2_khong }} ☐ Không có VPN</w:t>
+        <w:t>{{ P2_khong }} Không có VPN</w:t>
       </w:r>
       <w:r>
         <w:rPr>
@@ -15539,7 +15516,7 @@
           <w:sz w:val="24"/>
           <w:szCs w:val="24"/>
         </w:rPr>
-        <w:t xml:space="preserve">{{ P3_vpn_chuyen_dung }} ☐ VPN chuyên dụng (do Sở TTTT/tỉnh cấp)     </w:t>
+        <w:t xml:space="preserve">{{ P3_vpn_chuyen_dung }} VPN chuyên dụng (do Sở TTTT/tỉnh cấp)     </w:t>
       </w:r>
       <w:r>
         <w:rPr>
@@ -15565,7 +15542,7 @@
           <w:sz w:val="24"/>
           <w:szCs w:val="24"/>
         </w:rPr>
-        <w:t xml:space="preserve">{{ P3_internet_thuong }} ☐ Internet thường (HTTPS)     </w:t>
+        <w:t xml:space="preserve">{{ P3_internet_thuong }} Internet thường (HTTPS)     </w:t>
       </w:r>
       <w:r>
         <w:rPr>
@@ -15591,7 +15568,7 @@
           <w:sz w:val="24"/>
           <w:szCs w:val="24"/>
         </w:rPr>
-        <w:t xml:space="preserve">{{ P3_duong_truyen_so_lieu }} ☐ Đường truyền số liệu chuyên dụng (MPLS/Leased Line)     </w:t>
+        <w:t xml:space="preserve">{{ P3_duong_truyen_so_lieu }} Đường truyền số liệu chuyên dụng (MPLS/Leased Line)     </w:t>
       </w:r>
       <w:r>
         <w:rPr>
@@ -15617,7 +15594,7 @@
           <w:sz w:val="24"/>
           <w:szCs w:val="24"/>
         </w:rPr>
-        <w:t>{{ P3_khong_ket_noi }} ☐ Không kết nối trực tiếp</w:t>
+        <w:t>{{ P3_khong_ket_noi }} Không kết nối trực tiếp</w:t>
       </w:r>
       <w:r>
         <w:rPr>
@@ -15873,7 +15850,7 @@
           <w:sz w:val="24"/>
           <w:szCs w:val="24"/>
         </w:rPr>
-        <w:t xml:space="preserve">{{ P4_ma_hoa_co }} ☐ Có – Phần mềm/phương pháp: ___________________________     </w:t>
+        <w:t xml:space="preserve">{{ P4_ma_hoa_co }} Có – Phần mềm/phương pháp: ___________________________     </w:t>
       </w:r>
       <w:r>
         <w:rPr>
@@ -15899,7 +15876,7 @@
           <w:sz w:val="24"/>
           <w:szCs w:val="24"/>
         </w:rPr>
-        <w:t>{{ P4_ma_hoa_khong }} ☐ Không mã hóa dữ liệu lưu trữ</w:t>
+        <w:t>{{ P4_ma_hoa_khong }} Không mã hóa dữ liệu lưu trữ</w:t>
       </w:r>
       <w:r>
         <w:rPr>
@@ -15992,7 +15969,7 @@
           <w:sz w:val="24"/>
           <w:szCs w:val="24"/>
         </w:rPr>
-        <w:t xml:space="preserve">{{ P5_email_sec_co }} ☐ Có – TLS/SMTPS (qua email.gov.vn hoặc tương đương)     </w:t>
+        <w:t xml:space="preserve">{{ P5_email_sec_co }} Có – TLS/SMTPS (qua email.gov.vn hoặc tương đương)     </w:t>
       </w:r>
       <w:r>
         <w:rPr>
@@ -16018,15 +15995,14 @@
           <w:sz w:val="24"/>
           <w:szCs w:val="24"/>
         </w:rPr>
-        <w:t>☐</w:t>
-      </w:r>
-      <w:r>
-        <w:rPr>
-          <w:rFonts w:ascii="Times New Roman" w:hAnsi="Times New Roman" w:cs="Times New Roman"/>
-          <w:sz w:val="24"/>
-          <w:szCs w:val="24"/>
-        </w:rPr>
-        <w:t xml:space="preserve"> Không biết     </w:t>
+        <w:t xml:space="preserve">{{ T1_4_camera_khong_biet }} Không biết     </w:t>
+      </w:r>
+      <w:r>
+        <w:rPr>
+          <w:rFonts w:ascii="Times New Roman" w:hAnsi="Times New Roman" w:cs="Times New Roman"/>
+          <w:sz w:val="24"/>
+          <w:szCs w:val="24"/>
+        </w:rPr>
       </w:r>
     </w:p>
     <w:p>
@@ -16045,15 +16021,14 @@
           <w:sz w:val="24"/>
           <w:szCs w:val="24"/>
         </w:rPr>
-        <w:t>☐</w:t>
-      </w:r>
-      <w:r>
-        <w:rPr>
-          <w:rFonts w:ascii="Times New Roman" w:hAnsi="Times New Roman" w:cs="Times New Roman"/>
-          <w:sz w:val="24"/>
-          <w:szCs w:val="24"/>
-        </w:rPr>
-        <w:t xml:space="preserve"> </w:t>
+        <w:t>{{ R2_dao_tao_khong }} Không</w:t>
+      </w:r>
+      <w:r>
+        <w:rPr>
+          <w:rFonts w:ascii="Times New Roman" w:hAnsi="Times New Roman" w:cs="Times New Roman"/>
+          <w:sz w:val="24"/>
+          <w:szCs w:val="24"/>
+        </w:rPr>
       </w:r>
       <w:proofErr w:type="spellStart"/>
       <w:r>
@@ -16062,7 +16037,6 @@
           <w:sz w:val="24"/>
           <w:szCs w:val="24"/>
         </w:rPr>
-        <w:t>Không</w:t>
       </w:r>
       <w:proofErr w:type="spellEnd"/>
     </w:p>
@@ -16208,15 +16182,14 @@
           <w:sz w:val="24"/>
           <w:szCs w:val="24"/>
         </w:rPr>
-        <w:t>☐</w:t>
-      </w:r>
-      <w:r>
-        <w:rPr>
-          <w:rFonts w:ascii="Times New Roman" w:hAnsi="Times New Roman" w:cs="Times New Roman"/>
-          <w:sz w:val="24"/>
-          <w:szCs w:val="24"/>
-        </w:rPr>
-        <w:t xml:space="preserve"> Có – Tần suất: </w:t>
+        <w:t xml:space="preserve">{{ L5_1_log_router_co }} Có – Tần suất: </w:t>
+      </w:r>
+      <w:r>
+        <w:rPr>
+          <w:rFonts w:ascii="Times New Roman" w:hAnsi="Times New Roman" w:cs="Times New Roman"/>
+          <w:sz w:val="24"/>
+          <w:szCs w:val="24"/>
+        </w:rPr>
       </w:r>
     </w:p>
     <w:p>
@@ -16235,7 +16208,7 @@
           <w:sz w:val="24"/>
           <w:szCs w:val="24"/>
         </w:rPr>
-        <w:t xml:space="preserve">{{ Q1_thang }} ☐ Hàng tháng  </w:t>
+        <w:t xml:space="preserve">{{ Q1_thang }} Hàng tháng  </w:t>
       </w:r>
       <w:r>
         <w:rPr>
@@ -16261,7 +16234,7 @@
           <w:sz w:val="24"/>
           <w:szCs w:val="24"/>
         </w:rPr>
-        <w:t xml:space="preserve">{{ Q1_quy }} ☐ Hàng quý  </w:t>
+        <w:t xml:space="preserve">{{ Q1_quy }} Hàng quý  </w:t>
       </w:r>
       <w:r>
         <w:rPr>
@@ -16287,7 +16260,7 @@
           <w:sz w:val="24"/>
           <w:szCs w:val="24"/>
         </w:rPr>
-        <w:t xml:space="preserve">{{ Q1_canh_bao }} ☐ Khi có cảnh báo  </w:t>
+        <w:t xml:space="preserve">{{ Q1_canh_bao }} Khi có cảnh báo  </w:t>
       </w:r>
       <w:r>
         <w:rPr>
@@ -16313,15 +16286,14 @@
           <w:sz w:val="24"/>
           <w:szCs w:val="24"/>
         </w:rPr>
-        <w:t>☐</w:t>
-      </w:r>
-      <w:r>
-        <w:rPr>
-          <w:rFonts w:ascii="Times New Roman" w:hAnsi="Times New Roman" w:cs="Times New Roman"/>
-          <w:sz w:val="24"/>
-          <w:szCs w:val="24"/>
-        </w:rPr>
-        <w:t xml:space="preserve"> Khác     </w:t>
+        <w:t xml:space="preserve">{{ Q1_khac }} Khác     </w:t>
+      </w:r>
+      <w:r>
+        <w:rPr>
+          <w:rFonts w:ascii="Times New Roman" w:hAnsi="Times New Roman" w:cs="Times New Roman"/>
+          <w:sz w:val="24"/>
+          <w:szCs w:val="24"/>
+        </w:rPr>
       </w:r>
     </w:p>
     <w:p>
@@ -16340,7 +16312,7 @@
           <w:sz w:val="24"/>
           <w:szCs w:val="24"/>
         </w:rPr>
-        <w:t xml:space="preserve">{{ Q1_tuy_luc }} ☐ Không có quy trình – Cập nhật tùy lúc     </w:t>
+        <w:t xml:space="preserve">{{ Q1_tuy_luc }} Không có quy trình – Cập nhật tùy lúc     </w:t>
       </w:r>
       <w:r>
         <w:rPr>
@@ -16366,15 +16338,14 @@
           <w:sz w:val="24"/>
           <w:szCs w:val="24"/>
         </w:rPr>
-        <w:t>☐</w:t>
-      </w:r>
-      <w:r>
-        <w:rPr>
-          <w:rFonts w:ascii="Times New Roman" w:hAnsi="Times New Roman" w:cs="Times New Roman"/>
-          <w:sz w:val="24"/>
-          <w:szCs w:val="24"/>
-        </w:rPr>
-        <w:t xml:space="preserve"> </w:t>
+        <w:t>{{ Q2_khong }} Không cập nhật</w:t>
+      </w:r>
+      <w:r>
+        <w:rPr>
+          <w:rFonts w:ascii="Times New Roman" w:hAnsi="Times New Roman" w:cs="Times New Roman"/>
+          <w:sz w:val="24"/>
+          <w:szCs w:val="24"/>
+        </w:rPr>
       </w:r>
       <w:proofErr w:type="spellStart"/>
       <w:r>
@@ -16383,7 +16354,6 @@
           <w:sz w:val="24"/>
           <w:szCs w:val="24"/>
         </w:rPr>
-        <w:t>Không</w:t>
       </w:r>
       <w:proofErr w:type="spellEnd"/>
       <w:r>
@@ -16392,7 +16362,6 @@
           <w:sz w:val="24"/>
           <w:szCs w:val="24"/>
         </w:rPr>
-        <w:t xml:space="preserve"> </w:t>
       </w:r>
       <w:proofErr w:type="spellStart"/>
       <w:r>
@@ -16401,7 +16370,6 @@
           <w:sz w:val="24"/>
           <w:szCs w:val="24"/>
         </w:rPr>
-        <w:t>cập</w:t>
       </w:r>
       <w:proofErr w:type="spellEnd"/>
       <w:r>
@@ -16410,7 +16378,6 @@
           <w:sz w:val="24"/>
           <w:szCs w:val="24"/>
         </w:rPr>
-        <w:t xml:space="preserve"> nhật</w:t>
       </w:r>
     </w:p>
     <w:p>
@@ -16458,7 +16425,7 @@
           <w:sz w:val="24"/>
           <w:szCs w:val="24"/>
         </w:rPr>
-        <w:t xml:space="preserve">{{ Q2_tu_dong }} ☐ Có – Tự động     </w:t>
+        <w:t xml:space="preserve">{{ Q2_tu_dong }} Có – Tự động     </w:t>
       </w:r>
       <w:r>
         <w:rPr>
@@ -16484,7 +16451,7 @@
           <w:sz w:val="24"/>
           <w:szCs w:val="24"/>
         </w:rPr>
-        <w:t xml:space="preserve">{{ Q2_thu_cong }} ☐ Có – Thủ công (khi nhớ)     </w:t>
+        <w:t xml:space="preserve">{{ Q2_thu_cong }} Có – Thủ công (khi nhớ)     </w:t>
       </w:r>
       <w:r>
         <w:rPr>
@@ -16510,15 +16477,14 @@
           <w:sz w:val="24"/>
           <w:szCs w:val="24"/>
         </w:rPr>
-        <w:t>☐</w:t>
-      </w:r>
-      <w:r>
-        <w:rPr>
-          <w:rFonts w:ascii="Times New Roman" w:hAnsi="Times New Roman" w:cs="Times New Roman"/>
-          <w:sz w:val="24"/>
-          <w:szCs w:val="24"/>
-        </w:rPr>
-        <w:t xml:space="preserve"> </w:t>
+        <w:t>{{ Q2_khong }} Không cập nhật</w:t>
+      </w:r>
+      <w:r>
+        <w:rPr>
+          <w:rFonts w:ascii="Times New Roman" w:hAnsi="Times New Roman" w:cs="Times New Roman"/>
+          <w:sz w:val="24"/>
+          <w:szCs w:val="24"/>
+        </w:rPr>
       </w:r>
       <w:proofErr w:type="spellStart"/>
       <w:r>
@@ -16527,7 +16493,6 @@
           <w:sz w:val="24"/>
           <w:szCs w:val="24"/>
         </w:rPr>
-        <w:t>Không</w:t>
       </w:r>
       <w:proofErr w:type="spellEnd"/>
       <w:r>
@@ -16536,7 +16501,6 @@
           <w:sz w:val="24"/>
           <w:szCs w:val="24"/>
         </w:rPr>
-        <w:t xml:space="preserve"> </w:t>
       </w:r>
       <w:proofErr w:type="spellStart"/>
       <w:r>
@@ -16545,7 +16509,6 @@
           <w:sz w:val="24"/>
           <w:szCs w:val="24"/>
         </w:rPr>
-        <w:t>cập</w:t>
       </w:r>
       <w:proofErr w:type="spellEnd"/>
       <w:r>
@@ -16554,7 +16517,6 @@
           <w:sz w:val="24"/>
           <w:szCs w:val="24"/>
         </w:rPr>
-        <w:t xml:space="preserve"> nhật</w:t>
       </w:r>
     </w:p>
     <w:p>
@@ -16837,7 +16799,7 @@
           <w:sz w:val="24"/>
           <w:szCs w:val="24"/>
         </w:rPr>
-        <w:t xml:space="preserve">{{ Q5_canh_bao_co }} ☐ Có – Nhận cảnh báo qua email/văn bản và xử lý     </w:t>
+        <w:t xml:space="preserve">{{ Q5_canh_bao_co }} Có – Nhận cảnh báo qua email/văn bản và xử lý     </w:t>
       </w:r>
       <w:r>
         <w:rPr>
@@ -16863,7 +16825,7 @@
           <w:sz w:val="24"/>
           <w:szCs w:val="24"/>
         </w:rPr>
-        <w:t xml:space="preserve">{{ Q5_canh_bao_khong }} ☐ Không theo dõi thường xuyên     </w:t>
+        <w:t xml:space="preserve">{{ Q5_canh_bao_khong }} Không theo dõi thường xuyên     </w:t>
       </w:r>
       <w:r>
         <w:rPr>
@@ -16889,7 +16851,7 @@
           <w:sz w:val="24"/>
           <w:szCs w:val="24"/>
         </w:rPr>
-        <w:t>{{ Q5_canh_bao_chua_biet }} ☐ Chưa biết kênh nhận cảnh báo</w:t>
+        <w:t>{{ Q5_canh_bao_chua_biet }} Chưa biết kênh nhận cảnh báo</w:t>
       </w:r>
       <w:r>
         <w:rPr>
@@ -17518,7 +17480,7 @@
           <w:sz w:val="24"/>
           <w:szCs w:val="24"/>
         </w:rPr>
-        <w:t xml:space="preserve">{{ R2_dao_tao_co }} ☐ Có – Hình thức: ___________________________     </w:t>
+        <w:t xml:space="preserve">{{ R2_dao_tao_co }} Có – Hình thức: ___________________________     </w:t>
       </w:r>
       <w:r>
         <w:rPr>
@@ -17544,15 +17506,14 @@
           <w:sz w:val="24"/>
           <w:szCs w:val="24"/>
         </w:rPr>
-        <w:t>☐</w:t>
-      </w:r>
-      <w:r>
-        <w:rPr>
-          <w:rFonts w:ascii="Times New Roman" w:hAnsi="Times New Roman" w:cs="Times New Roman"/>
-          <w:sz w:val="24"/>
-          <w:szCs w:val="24"/>
-        </w:rPr>
-        <w:t xml:space="preserve"> </w:t>
+        <w:t>{{ R2_dao_tao_khong }} Không</w:t>
+      </w:r>
+      <w:r>
+        <w:rPr>
+          <w:rFonts w:ascii="Times New Roman" w:hAnsi="Times New Roman" w:cs="Times New Roman"/>
+          <w:sz w:val="24"/>
+          <w:szCs w:val="24"/>
+        </w:rPr>
       </w:r>
       <w:proofErr w:type="spellStart"/>
       <w:r>
@@ -17561,7 +17522,6 @@
           <w:sz w:val="24"/>
           <w:szCs w:val="24"/>
         </w:rPr>
-        <w:t>Không</w:t>
       </w:r>
       <w:proofErr w:type="spellEnd"/>
     </w:p>
@@ -18382,7 +18342,7 @@
           <w:sz w:val="24"/>
           <w:szCs w:val="24"/>
         </w:rPr>
-        <w:t xml:space="preserve">{{ T1_1_dmz_co }} ☐ Có – Máy chủ trong DMZ: ___________________________     </w:t>
+        <w:t xml:space="preserve">{{ T1_1_dmz_co }} Có – Máy chủ trong DMZ: ___________________________     </w:t>
       </w:r>
       <w:r>
         <w:rPr>
@@ -18408,7 +18368,7 @@
           <w:sz w:val="24"/>
           <w:szCs w:val="24"/>
         </w:rPr>
-        <w:t>{{ T1_1_dmz_khong }} ☐ Không có DMZ – Tất cả thiết bị cùng 1 vùng LAN</w:t>
+        <w:t>{{ T1_1_dmz_khong }} Không có DMZ – Tất cả thiết bị cùng 1 vùng LAN</w:t>
       </w:r>
       <w:r>
         <w:rPr>
@@ -18479,7 +18439,7 @@
           <w:sz w:val="24"/>
           <w:szCs w:val="24"/>
         </w:rPr>
-        <w:t xml:space="preserve">{{ T1_2_wifi_tach_rieng }} ☐ Có – WiFi trên VLAN riêng / Subnet riêng (không truy cập được LAN máy chủ)    </w:t>
+        <w:t xml:space="preserve">{{ T1_2_wifi_tach_rieng }} Có – WiFi trên VLAN riêng / Subnet riêng (không truy cập được LAN máy chủ)    </w:t>
       </w:r>
       <w:r>
         <w:rPr>
@@ -18505,7 +18465,7 @@
           <w:sz w:val="24"/>
           <w:szCs w:val="24"/>
         </w:rPr>
-        <w:t xml:space="preserve">{{ T1_2_wifi_chung }} ☐ Không – WiFi cùng dải IP với máy tính văn phòng     </w:t>
+        <w:t xml:space="preserve">{{ T1_2_wifi_chung }} Không – WiFi cùng dải IP với máy tính văn phòng     </w:t>
       </w:r>
       <w:r>
         <w:rPr>
@@ -18531,7 +18491,7 @@
           <w:sz w:val="24"/>
           <w:szCs w:val="24"/>
         </w:rPr>
-        <w:t>{{ T1_2_wifi_khong }} ☐ Không có WiFi</w:t>
+        <w:t>{{ T1_2_wifi_khong }} Không có WiFi</w:t>
       </w:r>
       <w:r>
         <w:rPr>
@@ -18721,7 +18681,7 @@
           <w:sz w:val="24"/>
           <w:szCs w:val="24"/>
         </w:rPr>
-        <w:t xml:space="preserve">{{ T1_4_camera_tach_rieng }} ☐ Có – Camera trên VLAN/subnet tách biệt khỏi mạng máy tính     </w:t>
+        <w:t xml:space="preserve">{{ T1_4_camera_tach_rieng }} Có – Camera trên VLAN/subnet tách biệt khỏi mạng máy tính     </w:t>
       </w:r>
       <w:r>
         <w:rPr>
@@ -18747,7 +18707,7 @@
           <w:sz w:val="24"/>
           <w:szCs w:val="24"/>
         </w:rPr>
-        <w:t xml:space="preserve">{{ T4_camera_chung }} ☐ Không – Camera cùng dải IP với máy tính văn phòng     </w:t>
+        <w:t xml:space="preserve">{{ T4_camera_chung }} Không – Camera cùng dải IP với máy tính văn phòng     </w:t>
       </w:r>
       <w:r>
         <w:rPr>
@@ -18773,15 +18733,14 @@
           <w:sz w:val="24"/>
           <w:szCs w:val="24"/>
         </w:rPr>
-        <w:t>☐</w:t>
-      </w:r>
-      <w:r>
-        <w:rPr>
-          <w:rFonts w:ascii="Times New Roman" w:hAnsi="Times New Roman" w:cs="Times New Roman"/>
-          <w:sz w:val="24"/>
-          <w:szCs w:val="24"/>
-        </w:rPr>
-        <w:t xml:space="preserve"> </w:t>
+        <w:t>{{ T1_4_camera_khong_biet }} Không biết</w:t>
+      </w:r>
+      <w:r>
+        <w:rPr>
+          <w:rFonts w:ascii="Times New Roman" w:hAnsi="Times New Roman" w:cs="Times New Roman"/>
+          <w:sz w:val="24"/>
+          <w:szCs w:val="24"/>
+        </w:rPr>
       </w:r>
       <w:proofErr w:type="spellStart"/>
       <w:r>
@@ -18790,7 +18749,6 @@
           <w:sz w:val="24"/>
           <w:szCs w:val="24"/>
         </w:rPr>
-        <w:t>Không</w:t>
       </w:r>
       <w:proofErr w:type="spellEnd"/>
       <w:r>
@@ -18799,7 +18757,6 @@
           <w:sz w:val="24"/>
           <w:szCs w:val="24"/>
         </w:rPr>
-        <w:t xml:space="preserve"> biết</w:t>
       </w:r>
     </w:p>
     <w:p>
@@ -19333,7 +19290,7 @@
           <w:sz w:val="24"/>
           <w:szCs w:val="24"/>
         </w:rPr>
-        <w:t xml:space="preserve">{{ T3_1_rack_co }} ☐ Có – Kích thước rack: ___U  Vị trí: Tầng ___ – Phòng ___     </w:t>
+        <w:t xml:space="preserve">{{ T3_1_rack_co }} Có – Kích thước rack: ___U  Vị trí: Tầng ___ – Phòng ___     </w:t>
       </w:r>
       <w:r>
         <w:rPr>
@@ -19375,7 +19332,7 @@
           <w:sz w:val="24"/>
           <w:szCs w:val="24"/>
         </w:rPr>
-        <w:t>{{ T3_1_khong_rack }} ☐ Không – Thiết bị để trực tiếp trên bàn/giá đỡ</w:t>
+        <w:t>{{ T3_1_khong_rack }} Không – Thiết bị để trực tiếp trên bàn/giá đỡ</w:t>
       </w:r>
       <w:r>
         <w:rPr>
@@ -19655,7 +19612,7 @@
           <w:sz w:val="24"/>
           <w:szCs w:val="24"/>
         </w:rPr>
-        <w:t xml:space="preserve">{{ T4_1_cap_dong }} ☐ Cáp đồng (UTP/STP Cat5e hoặc Cat6) – phổ biến nhất     </w:t>
+        <w:t xml:space="preserve">{{ T4_1_cap_dong }} Cáp đồng (UTP/STP Cat5e hoặc Cat6) – phổ biến nhất     </w:t>
       </w:r>
       <w:r>
         <w:rPr>
@@ -19681,7 +19638,7 @@
           <w:sz w:val="24"/>
           <w:szCs w:val="24"/>
         </w:rPr>
-        <w:t xml:space="preserve">{{ T4_1_cap_quang }} ☐ Cáp quang nội bộ (Fiber – nếu khoảng cách &gt; 100m)     </w:t>
+        <w:t xml:space="preserve">{{ T4_1_cap_quang }} Cáp quang nội bộ (Fiber – nếu khoảng cách &gt; 100m)     </w:t>
       </w:r>
       <w:r>
         <w:rPr>
@@ -19707,7 +19664,7 @@
           <w:sz w:val="24"/>
           <w:szCs w:val="24"/>
         </w:rPr>
-        <w:t>{{ T4_1_both }} ☐ Cả hai (cáp đồng trong phòng, cáp quang giữa tầng/tòa nhà)</w:t>
+        <w:t>{{ T4_1_both }} Cả hai (cáp đồng trong phòng, cáp quang giữa tầng/tòa nhà)</w:t>
       </w:r>
       <w:r>
         <w:rPr>
@@ -20654,7 +20611,7 @@
               </w:rPr>
               <w:t xml:space="preserve"> Đã có</w:t>
               <w:br/>
-              <w:t>{{ M_chua_co }} ☐ Chưa có</w:t>
+              <w:t>{{ M_chua_co }} Chưa có</w:t>
             </w:r>
             <w:r>
               <w:rPr>
@@ -20799,7 +20756,7 @@
                 <w:sz w:val="24"/>
                 <w:szCs w:val="24"/>
               </w:rPr>
-              <w:t>{{ M_da_co }} ☐ Đã có</w:t>
+              <w:t>{{ M_da_co }} Đã có</w:t>
               <w:br/>
               <w:t xml:space="preserve"> Chưa có</w:t>
             </w:r>
@@ -20950,9 +20907,9 @@
                 <w:sz w:val="24"/>
                 <w:szCs w:val="24"/>
               </w:rPr>
-              <w:t>{{ M_da_co }} ☐ Đã có</w:t>
+              <w:t>{{ M_da_co }} Đã có</w:t>
               <w:br/>
-              <w:t>{{ M_chua_co }} ☐ Chưa có</w:t>
+              <w:t>{{ M_chua_co }} Chưa có</w:t>
             </w:r>
             <w:r>
               <w:rPr>
@@ -21109,7 +21066,7 @@
               </w:rPr>
               <w:t>Đã có</w:t>
               <w:br/>
-              <w:t>{{ M_chua_co }} ☐ Chưa có</w:t>
+              <w:t>{{ M_chua_co }} Chưa có</w:t>
             </w:r>
             <w:r>
               <w:rPr>
@@ -21257,9 +21214,9 @@
                 <w:sz w:val="24"/>
                 <w:szCs w:val="24"/>
               </w:rPr>
-              <w:t>{{ M_da_co }} ☐ Đã có</w:t>
+              <w:t>{{ M_da_co }} Đã có</w:t>
               <w:br/>
-              <w:t>{{ M_chua_co }} ☐ Chưa có</w:t>
+              <w:t>{{ M_chua_co }} Chưa có</w:t>
             </w:r>
             <w:r>
               <w:rPr>
@@ -21402,9 +21359,9 @@
                 <w:sz w:val="24"/>
                 <w:szCs w:val="24"/>
               </w:rPr>
-              <w:t>{{ M_da_co }} ☐ Đã có</w:t>
+              <w:t>{{ M_da_co }} Đã có</w:t>
               <w:br/>
-              <w:t>{{ M_chua_co }} ☐ Chưa có</w:t>
+              <w:t>{{ M_chua_co }} Chưa có</w:t>
             </w:r>
             <w:r>
               <w:rPr>
@@ -21551,9 +21508,9 @@
                 <w:sz w:val="24"/>
                 <w:szCs w:val="24"/>
               </w:rPr>
-              <w:t>{{ M_da_co }} ☐ Đã có</w:t>
+              <w:t>{{ M_da_co }} Đã có</w:t>
               <w:br/>
-              <w:t>{{ M_chua_co }} ☐ Chưa có</w:t>
+              <w:t>{{ M_chua_co }} Chưa có</w:t>
             </w:r>
             <w:r>
               <w:rPr>
@@ -21696,9 +21653,9 @@
                 <w:sz w:val="24"/>
                 <w:szCs w:val="24"/>
               </w:rPr>
-              <w:t>{{ M_da_co }} ☐ Đã có</w:t>
+              <w:t>{{ M_da_co }} Đã có</w:t>
               <w:br/>
-              <w:t>{{ M_chua_co }} ☐ Chưa có</w:t>
+              <w:t>{{ M_chua_co }} Chưa có</w:t>
             </w:r>
             <w:r>
               <w:rPr>
@@ -21847,9 +21804,9 @@
                 <w:sz w:val="24"/>
                 <w:szCs w:val="24"/>
               </w:rPr>
-              <w:t>{{ M_da_co }} ☐ Đã có</w:t>
+              <w:t>{{ M_da_co }} Đã có</w:t>
               <w:br/>
-              <w:t>{{ M_chua_co }} ☐ Chưa có</w:t>
+              <w:t>{{ M_chua_co }} Chưa có</w:t>
             </w:r>
             <w:r>
               <w:rPr>
@@ -21994,9 +21951,9 @@
                 <w:sz w:val="24"/>
                 <w:szCs w:val="24"/>
               </w:rPr>
-              <w:t>{{ M_da_co }} ☐ Đã có</w:t>
+              <w:t>{{ M_da_co }} Đã có</w:t>
               <w:br/>
-              <w:t>{{ M_chua_co }} ☐ Chưa có</w:t>
+              <w:t>{{ M_chua_co }} Chưa có</w:t>
             </w:r>
             <w:r>
               <w:rPr>
@@ -22145,9 +22102,9 @@
                 <w:sz w:val="24"/>
                 <w:szCs w:val="24"/>
               </w:rPr>
-              <w:t>{{ M_da_co }} ☐ Đã có</w:t>
+              <w:t>{{ M_da_co }} Đã có</w:t>
               <w:br/>
-              <w:t>{{ M_chua_co }} ☐ Chưa có</w:t>
+              <w:t>{{ M_chua_co }} Chưa có</w:t>
             </w:r>
             <w:r>
               <w:rPr>
@@ -22290,9 +22247,9 @@
                 <w:sz w:val="24"/>
                 <w:szCs w:val="24"/>
               </w:rPr>
-              <w:t>{{ M_da_co }} ☐ Đã có</w:t>
+              <w:t>{{ M_da_co }} Đã có</w:t>
               <w:br/>
-              <w:t>{{ M_chua_co }} ☐ Chưa có</w:t>
+              <w:t>{{ M_chua_co }} Chưa có</w:t>
             </w:r>
             <w:r>
               <w:rPr>
@@ -22439,9 +22396,9 @@
                 <w:sz w:val="24"/>
                 <w:szCs w:val="24"/>
               </w:rPr>
-              <w:t>{{ M_da_co }} ☐ Đã có</w:t>
+              <w:t>{{ M_da_co }} Đã có</w:t>
               <w:br/>
-              <w:t>{{ M_chua_co }} ☐ Chưa có</w:t>
+              <w:t>{{ M_chua_co }} Chưa có</w:t>
             </w:r>
             <w:r>
               <w:rPr>
@@ -22584,9 +22541,9 @@
                 <w:sz w:val="24"/>
                 <w:szCs w:val="24"/>
               </w:rPr>
-              <w:t>{{ M_da_co }} ☐ Đã có</w:t>
+              <w:t>{{ M_da_co }} Đã có</w:t>
               <w:br/>
-              <w:t>{{ M_chua_co }} ☐ Chưa có</w:t>
+              <w:t>{{ M_chua_co }} Chưa có</w:t>
             </w:r>
             <w:r>
               <w:rPr>

</xml_diff>